<commit_message>
Fix cover timeline labels; update presentation script
</commit_message>
<xml_diff>
--- a/deliverables/Kich_ban_thuyet_trinh_OmniFall.docx
+++ b/deliverables/Kich_ban_thuyet_trinh_OmniFall.docx
@@ -25,7 +25,7 @@
     <w:p>
       <w:pPr/>
       <w:r>
-        <w:t xml:space="preserve">Thuyết trình 17 slide tại wunecutee.github.io/omnifall-slides trong khoảng 18 phút, chia cho 4 người; phần kỹ thuật nặng nhất (phương pháp, đánh giá, kết quả) do Nguyễn Duy Quân trình bày.</w:t>
+        <w:t xml:space="preserve">Kịch bản cho 16 slide tại wunecutee.github.io/omnifall-slides, khoảng 17 phút, chia cho 4 người. Lời nói bám đúng chữ trên từng slide, dùng lời thường, hạn chế thuật ngữ. Phần kỹ thuật nhất (các cách thử, cách chấm điểm, kết quả) do Nguyễn Duy Quân trình bày.</w:t>
       </w:r>
     </w:p>
     <w:p>
@@ -34,12 +34,6 @@
       </w:pPr>
       <w:r>
         <w:t xml:space="preserve">Phân công</w:t>
-      </w:r>
-    </w:p>
-    <w:p>
-      <w:pPr/>
-      <w:r>
-        <w:t xml:space="preserve">Bốn người nói nối tiếp theo thứ tự slide; Quân giữ phần dài nhất (khoảng 7 phút) vì đó là phần phương pháp và kết quả. Mỗi người tự bấm chuyển slide trong phần của mình.</w:t>
       </w:r>
     </w:p>
     <w:tbl>
@@ -51,10 +45,10 @@
       </w:tblPr>
       <w:tblGrid>
         <w:gridCol w:w="1111"/>
-        <w:gridCol w:w="1829"/>
+        <w:gridCol w:w="2076"/>
         <w:gridCol w:w="830"/>
-        <w:gridCol w:w="3942"/>
-        <w:gridCol w:w="1648"/>
+        <w:gridCol w:w="3543"/>
+        <w:gridCol w:w="1800"/>
       </w:tblGrid>
       <w:tr>
         <w:trPr>
@@ -74,7 +68,7 @@
         </w:tc>
         <w:tc>
           <w:tcPr>
-            <w:tcW w:w="1829" w:type="dxa"/>
+            <w:tcW w:w="2076" w:type="dxa"/>
             <w:shd w:val="clear" w:color="auto" w:fill="F2F2F2"/>
           </w:tcPr>
           <w:p>
@@ -98,7 +92,7 @@
         </w:tc>
         <w:tc>
           <w:tcPr>
-            <w:tcW w:w="3942" w:type="dxa"/>
+            <w:tcW w:w="3543" w:type="dxa"/>
             <w:shd w:val="clear" w:color="auto" w:fill="F2F2F2"/>
           </w:tcPr>
           <w:p>
@@ -110,7 +104,7 @@
         </w:tc>
         <w:tc>
           <w:tcPr>
-            <w:tcW w:w="1648" w:type="dxa"/>
+            <w:tcW w:w="1800" w:type="dxa"/>
             <w:shd w:val="clear" w:color="auto" w:fill="F2F2F2"/>
           </w:tcPr>
           <w:p>
@@ -135,7 +129,7 @@
         </w:tc>
         <w:tc>
           <w:tcPr>
-            <w:tcW w:w="1829" w:type="dxa"/>
+            <w:tcW w:w="2076" w:type="dxa"/>
           </w:tcPr>
           <w:p>
             <w:pPr/>
@@ -151,29 +145,29 @@
           <w:p>
             <w:pPr/>
             <w:r>
-              <w:t xml:space="preserve">1–4</w:t>
-            </w:r>
-          </w:p>
-        </w:tc>
-        <w:tc>
-          <w:tcPr>
-            <w:tcW w:w="3942" w:type="dxa"/>
-          </w:tcPr>
-          <w:p>
-            <w:pPr/>
-            <w:r>
-              <w:t xml:space="preserve">Mở đầu, bài toán, ý tưởng, dữ liệu</w:t>
-            </w:r>
-          </w:p>
-        </w:tc>
-        <w:tc>
-          <w:tcPr>
-            <w:tcW w:w="1648" w:type="dxa"/>
-          </w:tcPr>
-          <w:p>
-            <w:pPr/>
-            <w:r>
-              <w:t xml:space="preserve">~3 phút 30</w:t>
+              <w:t xml:space="preserve">1–5</w:t>
+            </w:r>
+          </w:p>
+        </w:tc>
+        <w:tc>
+          <w:tcPr>
+            <w:tcW w:w="3543" w:type="dxa"/>
+          </w:tcPr>
+          <w:p>
+            <w:pPr/>
+            <w:r>
+              <w:t xml:space="preserve">Mở đầu, clip ví dụ, bài toán, ý tưởng, dữ liệu</w:t>
+            </w:r>
+          </w:p>
+        </w:tc>
+        <w:tc>
+          <w:tcPr>
+            <w:tcW w:w="1800" w:type="dxa"/>
+          </w:tcPr>
+          <w:p>
+            <w:pPr/>
+            <w:r>
+              <w:t xml:space="preserve">khoảng 4 phút 30</w:t>
             </w:r>
           </w:p>
         </w:tc>
@@ -192,7 +186,7 @@
         </w:tc>
         <w:tc>
           <w:tcPr>
-            <w:tcW w:w="1829" w:type="dxa"/>
+            <w:tcW w:w="2076" w:type="dxa"/>
           </w:tcPr>
           <w:p>
             <w:pPr/>
@@ -208,29 +202,29 @@
           <w:p>
             <w:pPr/>
             <w:r>
-              <w:t xml:space="preserve">5–8</w:t>
-            </w:r>
-          </w:p>
-        </w:tc>
-        <w:tc>
-          <w:tcPr>
-            <w:tcW w:w="3942" w:type="dxa"/>
-          </w:tcPr>
-          <w:p>
-            <w:pPr/>
-            <w:r>
-              <w:t xml:space="preserve">Xử lý và tiền xử lý dữ liệu, các lỗi đã sửa</w:t>
-            </w:r>
-          </w:p>
-        </w:tc>
-        <w:tc>
-          <w:tcPr>
-            <w:tcW w:w="1648" w:type="dxa"/>
-          </w:tcPr>
-          <w:p>
-            <w:pPr/>
-            <w:r>
-              <w:t xml:space="preserve">~4 phút</w:t>
+              <w:t xml:space="preserve">6–9</w:t>
+            </w:r>
+          </w:p>
+        </w:tc>
+        <w:tc>
+          <w:tcPr>
+            <w:tcW w:w="3543" w:type="dxa"/>
+          </w:tcPr>
+          <w:p>
+            <w:pPr/>
+            <w:r>
+              <w:t xml:space="preserve">Xử lý dữ liệu và 3 lỗi đã sửa</w:t>
+            </w:r>
+          </w:p>
+        </w:tc>
+        <w:tc>
+          <w:tcPr>
+            <w:tcW w:w="1800" w:type="dxa"/>
+          </w:tcPr>
+          <w:p>
+            <w:pPr/>
+            <w:r>
+              <w:t xml:space="preserve">khoảng 4 phút</w:t>
             </w:r>
           </w:p>
         </w:tc>
@@ -249,7 +243,7 @@
         </w:tc>
         <w:tc>
           <w:tcPr>
-            <w:tcW w:w="1829" w:type="dxa"/>
+            <w:tcW w:w="2076" w:type="dxa"/>
           </w:tcPr>
           <w:p>
             <w:pPr/>
@@ -265,29 +259,29 @@
           <w:p>
             <w:pPr/>
             <w:r>
-              <w:t xml:space="preserve">9–14</w:t>
-            </w:r>
-          </w:p>
-        </w:tc>
-        <w:tc>
-          <w:tcPr>
-            <w:tcW w:w="3942" w:type="dxa"/>
-          </w:tcPr>
-          <w:p>
-            <w:pPr/>
-            <w:r>
-              <w:t xml:space="preserve">Phương pháp, giao thức đánh giá, kết quả, báo động, kiểm định</w:t>
-            </w:r>
-          </w:p>
-        </w:tc>
-        <w:tc>
-          <w:tcPr>
-            <w:tcW w:w="1648" w:type="dxa"/>
-          </w:tcPr>
-          <w:p>
-            <w:pPr/>
-            <w:r>
-              <w:t xml:space="preserve">~7 phút</w:t>
+              <w:t xml:space="preserve">10–13</w:t>
+            </w:r>
+          </w:p>
+        </w:tc>
+        <w:tc>
+          <w:tcPr>
+            <w:tcW w:w="3543" w:type="dxa"/>
+          </w:tcPr>
+          <w:p>
+            <w:pPr/>
+            <w:r>
+              <w:t xml:space="preserve">Các cách thử, cách chấm điểm, kết quả</w:t>
+            </w:r>
+          </w:p>
+        </w:tc>
+        <w:tc>
+          <w:tcPr>
+            <w:tcW w:w="1800" w:type="dxa"/>
+          </w:tcPr>
+          <w:p>
+            <w:pPr/>
+            <w:r>
+              <w:t xml:space="preserve">khoảng 5 phút 30</w:t>
             </w:r>
           </w:p>
         </w:tc>
@@ -306,7 +300,7 @@
         </w:tc>
         <w:tc>
           <w:tcPr>
-            <w:tcW w:w="1829" w:type="dxa"/>
+            <w:tcW w:w="2076" w:type="dxa"/>
           </w:tcPr>
           <w:p>
             <w:pPr/>
@@ -322,29 +316,29 @@
           <w:p>
             <w:pPr/>
             <w:r>
-              <w:t xml:space="preserve">15–17</w:t>
-            </w:r>
-          </w:p>
-        </w:tc>
-        <w:tc>
-          <w:tcPr>
-            <w:tcW w:w="3942" w:type="dxa"/>
-          </w:tcPr>
-          <w:p>
-            <w:pPr/>
-            <w:r>
-              <w:t xml:space="preserve">Ứng dụng realtime (demo), hệ quả với bài báo, kết luận</w:t>
-            </w:r>
-          </w:p>
-        </w:tc>
-        <w:tc>
-          <w:tcPr>
-            <w:tcW w:w="1648" w:type="dxa"/>
-          </w:tcPr>
-          <w:p>
-            <w:pPr/>
-            <w:r>
-              <w:t xml:space="preserve">~3 phút 30</w:t>
+              <w:t xml:space="preserve">14–16</w:t>
+            </w:r>
+          </w:p>
+        </w:tc>
+        <w:tc>
+          <w:tcPr>
+            <w:tcW w:w="3543" w:type="dxa"/>
+          </w:tcPr>
+          <w:p>
+            <w:pPr/>
+            <w:r>
+              <w:t xml:space="preserve">Báo động, kiểm chứng, kết luận</w:t>
+            </w:r>
+          </w:p>
+        </w:tc>
+        <w:tc>
+          <w:tcPr>
+            <w:tcW w:w="1800" w:type="dxa"/>
+          </w:tcPr>
+          <w:p>
+            <w:pPr/>
+            <w:r>
+              <w:t xml:space="preserve">khoảng 3 phút</w:t>
             </w:r>
           </w:p>
         </w:tc>
@@ -360,7 +354,7 @@
         </w:tc>
         <w:tc>
           <w:tcPr>
-            <w:tcW w:w="1829" w:type="dxa"/>
+            <w:tcW w:w="2076" w:type="dxa"/>
           </w:tcPr>
           <w:p>
             <w:pPr/>
@@ -379,7 +373,7 @@
         </w:tc>
         <w:tc>
           <w:tcPr>
-            <w:tcW w:w="3942" w:type="dxa"/>
+            <w:tcW w:w="3543" w:type="dxa"/>
           </w:tcPr>
           <w:p>
             <w:pPr/>
@@ -390,7 +384,7 @@
         </w:tc>
         <w:tc>
           <w:tcPr>
-            <w:tcW w:w="1648" w:type="dxa"/>
+            <w:tcW w:w="1800" w:type="dxa"/>
           </w:tcPr>
           <w:p>
             <w:pPr/>
@@ -404,7 +398,7 @@
     <w:p>
       <w:pPr/>
       <w:r>
-        <w:t xml:space="preserve">Câu chuyển lời giữa các phần (người đang nói đọc câu này rồi nhường micro):</w:t>
+        <w:t xml:space="preserve">Câu chuyển lời giữa các phần:</w:t>
       </w:r>
     </w:p>
     <w:p>
@@ -440,7 +434,7 @@
         <w:t xml:space="preserve">Huyền → Quân:</w:t>
       </w:r>
       <w:r>
-        <w:t xml:space="preserve"> "Khi dữ liệu và cách đánh giá đã đúng, câu hỏi là phương pháp nào thật sự hiệu quả. Mời Quân."</w:t>
+        <w:t xml:space="preserve"> "Dữ liệu đã sạch và cách chấm điểm đã ổn định. Câu hỏi tiếp theo là cách nào thật sự giúp kết quả tốt hơn. Mời Quân."</w:t>
       </w:r>
     </w:p>
     <w:p>
@@ -458,7 +452,7 @@
         <w:t xml:space="preserve">Quân → Hoàng Anh:</w:t>
       </w:r>
       <w:r>
-        <w:t xml:space="preserve"> "Con số là một chuyện; chạy được thật trên camera là chuyện khác. Hoàng Anh sẽ demo ứng dụng."</w:t>
+        <w:t xml:space="preserve"> "Điểm số là một chuyện; với người dùng, điều quan trọng là hệ thống báo động có đáng tin không. Mời Hoàng Anh."</w:t>
       </w:r>
     </w:p>
     <w:p>
@@ -488,12 +482,6 @@
       </w:r>
     </w:p>
     <w:p>
-      <w:pPr/>
-      <w:r>
-        <w:t xml:space="preserve">Mọi thứ cần chạy được cả khi mất mạng và khi demo lỗi; kiểm tra trên máy chiếu thật ít nhất một lần.</w:t>
-      </w:r>
-    </w:p>
-    <w:p>
       <w:pPr>
         <w:pStyle w:val="ListParagraph"/>
         <w:numPr>
@@ -502,16 +490,7 @@
         </w:numPr>
       </w:pPr>
       <w:r>
-        <w:t xml:space="preserve">☐ Mở https://wunecutee.github.io/omnifall-slides/ bằng Chrome hoặc Edge, nhấn F11. Phím → / Space sang slide, ← lùi, Home về đầu. Thêm </w:t>
-      </w:r>
-      <w:r>
-        <w:rPr>
-          <w:rStyle w:val="CodeChar"/>
-        </w:rPr>
-        <w:t xml:space="preserve">#slide-9</w:t>
-      </w:r>
-      <w:r>
-        <w:t xml:space="preserve"> vào cuối link để nhảy thẳng tới phần của Quân khi cần.</w:t>
+        <w:t xml:space="preserve">☐ Mở https://wunecutee.github.io/omnifall-slides/ bằng Chrome hoặc Edge, nhấn F11. Phím → hoặc Space sang slide, ← lùi lại. Thêm #slide-10 vào cuối link để nhảy thẳng tới phần của Quân.</w:t>
       </w:r>
     </w:p>
     <w:p>
@@ -523,16 +502,7 @@
         </w:numPr>
       </w:pPr>
       <w:r>
-        <w:t xml:space="preserve">☐ Chép file </w:t>
-      </w:r>
-      <w:r>
-        <w:rPr>
-          <w:rStyle w:val="CodeChar"/>
-        </w:rPr>
-        <w:t xml:space="preserve">index.html</w:t>
-      </w:r>
-      <w:r>
-        <w:t xml:space="preserve"> (repo omnifall-slides) vào USB làm bản dự phòng không cần mạng.</w:t>
+        <w:t xml:space="preserve">☐ Chép file index.html và thư mục media (repo omnifall-slides) vào USB làm bản dự phòng khi không có mạng.</w:t>
       </w:r>
     </w:p>
     <w:p>
@@ -544,16 +514,7 @@
         </w:numPr>
       </w:pPr>
       <w:r>
-        <w:t xml:space="preserve">☐ Nếu máy chiếu yếu, hiệu ứng giật: dùng link có </w:t>
-      </w:r>
-      <w:r>
-        <w:rPr>
-          <w:rStyle w:val="CodeChar"/>
-        </w:rPr>
-        <w:t xml:space="preserve">?static</w:t>
-      </w:r>
-      <w:r>
-        <w:t xml:space="preserve"> ở cuối để tắt hiệu ứng.</w:t>
+        <w:t xml:space="preserve">☐ Kiểm tra video ở slide 2 và slide 8 tự chạy (video không có tiếng).</w:t>
       </w:r>
     </w:p>
     <w:p>
@@ -565,25 +526,7 @@
         </w:numPr>
       </w:pPr>
       <w:r>
-        <w:t xml:space="preserve">☐ Laptop demo của Hoàng Anh: chạy thử </w:t>
-      </w:r>
-      <w:r>
-        <w:rPr>
-          <w:rStyle w:val="CodeChar"/>
-        </w:rPr>
-        <w:t xml:space="preserve">python app/realtime_app.py --video &lt;clip&gt;.mp4</w:t>
-      </w:r>
-      <w:r>
-        <w:t xml:space="preserve"> trước giờ, dùng clip </w:t>
-      </w:r>
-      <w:r>
-        <w:rPr>
-          <w:rStyle w:val="CodeChar"/>
-        </w:rPr>
-        <w:t xml:space="preserve">BoatloadsofFails-ThrowbackThursdayAugust201799.mp4</w:t>
-      </w:r>
-      <w:r>
-        <w:t xml:space="preserve"> (có cảnh báo FALLEN ở giây 9.1).</w:t>
+        <w:t xml:space="preserve">☐ Mỗi người tập phần của mình có bấm giờ; tổng không quá 18 phút.</w:t>
       </w:r>
     </w:p>
     <w:p>
@@ -595,85 +538,7 @@
         </w:numPr>
       </w:pPr>
       <w:r>
-        <w:t xml:space="preserve">☐ Mở sẵn video ghi màn hình </w:t>
-      </w:r>
-      <w:r>
-        <w:rPr>
-          <w:rStyle w:val="CodeChar"/>
-        </w:rPr>
-        <w:t xml:space="preserve">outputs_v2/app_logs/app_test_ft.mp4</w:t>
-      </w:r>
-      <w:r>
-        <w:t xml:space="preserve"> ở một tab khác phòng khi demo lỗi.</w:t>
-      </w:r>
-    </w:p>
-    <w:p>
-      <w:pPr>
-        <w:pStyle w:val="ListParagraph"/>
-        <w:numPr>
-          <w:ilvl w:val="0"/>
-          <w:numId w:val="3"/>
-        </w:numPr>
-      </w:pPr>
-      <w:r>
-        <w:t xml:space="preserve">☐ Mỗi người tập phần của mình có bấm giờ; tổng không quá 18 phút.</w:t>
-      </w:r>
-    </w:p>
-    <w:p>
-      <w:pPr>
-        <w:pStyle w:val="ListParagraph"/>
-        <w:numPr>
-          <w:ilvl w:val="0"/>
-          <w:numId w:val="3"/>
-        </w:numPr>
-      </w:pPr>
-      <w:r>
-        <w:t xml:space="preserve">☐ Cả nhóm thuộc 5 con số: </w:t>
-      </w:r>
-      <w:r>
-        <w:rPr>
-          <w:b/>
-        </w:rPr>
-        <w:t xml:space="preserve">24.7</w:t>
-      </w:r>
-      <w:r>
-        <w:t xml:space="preserve"> (baseline), </w:t>
-      </w:r>
-      <w:r>
-        <w:rPr>
-          <w:b/>
-        </w:rPr>
-        <w:t xml:space="preserve">154</w:t>
-      </w:r>
-      <w:r>
-        <w:t xml:space="preserve"> video lệch fps, </w:t>
-      </w:r>
-      <w:r>
-        <w:rPr>
-          <w:b/>
-        </w:rPr>
-        <w:t xml:space="preserve">92.3%</w:t>
-      </w:r>
-      <w:r>
-        <w:t xml:space="preserve"> cặp segment khác nhãn, </w:t>
-      </w:r>
-      <w:r>
-        <w:rPr>
-          <w:b/>
-        </w:rPr>
-        <w:t xml:space="preserve">44.3 / 62.0 / 69.3</w:t>
-      </w:r>
-      <w:r>
-        <w:t xml:space="preserve"> (hệ thống cuối), </w:t>
-      </w:r>
-      <w:r>
-        <w:rPr>
-          <w:b/>
-        </w:rPr>
-        <w:t xml:space="preserve">40–47 ms</w:t>
-      </w:r>
-      <w:r>
-        <w:t xml:space="preserve"> (tốc độ app).</w:t>
+        <w:t xml:space="preserve">☐ Cả nhóm thuộc 4 con số: 24.7 (điểm ban đầu), 154 (video bị lệch thời gian), 44.3 / 62.0 / 69.3 (hệ thống mới), 12–17 điểm (mức tăng so với hệ thống cũ).</w:t>
       </w:r>
     </w:p>
     <w:p>
@@ -681,22 +546,13 @@
         <w:pStyle w:val="Heading2"/>
       </w:pPr>
       <w:r>
-        <w:t xml:space="preserve">Phần 1 — Phạm Tuấn Vỹ (slide 1–4, ~3 phút 30)</w:t>
-      </w:r>
-    </w:p>
-    <w:p>
-      <w:pPr/>
-      <w:r>
-        <w:t xml:space="preserve">Mục tiêu: người nghe hiểu vì sao trạng thái </w:t>
-      </w:r>
-      <w:r>
-        <w:rPr>
-          <w:b/>
-        </w:rPr>
-        <w:t xml:space="preserve">fallen</w:t>
-      </w:r>
-      <w:r>
-        <w:t xml:space="preserve"> quan trọng, vì sao nó khó, và ý tưởng dùng cú ngã làm bằng chứng.</w:t>
+        <w:t xml:space="preserve">Phần 1 — Phạm Tuấn Vỹ (slide 1–5, khoảng 4 phút 30)</w:t>
+      </w:r>
+    </w:p>
+    <w:p>
+      <w:pPr/>
+      <w:r>
+        <w:t xml:space="preserve">Mục tiêu: người nghe hiểu bài toán là gì, vì sao quan trọng, và ý tưởng chính của nhóm.</w:t>
       </w:r>
     </w:p>
     <w:p>
@@ -704,7 +560,7 @@
         <w:pStyle w:val="Heading3"/>
       </w:pPr>
       <w:r>
-        <w:t xml:space="preserve">Slide 1 — Bìa (~40 giây)</w:t>
+        <w:t xml:space="preserve">Slide 1 — Mở đầu (khoảng 40 giây)</w:t>
       </w:r>
     </w:p>
     <w:p>
@@ -716,23 +572,23 @@
         <w:t xml:space="preserve">Thao tác:</w:t>
       </w:r>
       <w:r>
-        <w:t xml:space="preserve"> chỉ vào dải nhãn màu ở cuối slide.</w:t>
-      </w:r>
-    </w:p>
-    <w:p>
-      <w:pPr>
-        <w:pStyle w:val="Quote"/>
-      </w:pPr>
-      <w:r>
-        <w:t xml:space="preserve">"Kính chào thầy cô và các bạn. Nhóm em gồm Nguyễn Duy Quân, Phạm Tuấn Vỹ, Nghiêm Thị Thu Huyền và Vũ Hoàng Anh. Đề tài của nhóm là phát hiện người đã ngã từ video, từ khâu dữ liệu tới một hệ thống chạy thời gian thực.</w:t>
-      </w:r>
-    </w:p>
-    <w:p>
-      <w:pPr>
-        <w:pStyle w:val="Quote"/>
-      </w:pPr>
-      <w:r>
-        <w:t xml:space="preserve">Dải màu này là nhãn của một clip tai nạn thật. Người trong clip đi bộ, tới giây 2.5 thì ngã, và từ giây 3.75 nằm trên sàn gần 8 giây. Đoạn màu đỏ đó, trạng thái fallen, chính là thứ hệ thống cần báo động."</w:t>
+        <w:t xml:space="preserve"> chỉ vào câu hỏi ở giữa slide.</w:t>
+      </w:r>
+    </w:p>
+    <w:p>
+      <w:pPr>
+        <w:pStyle w:val="Quote"/>
+      </w:pPr>
+      <w:r>
+        <w:t xml:space="preserve">"Kính chào thầy cô và các bạn. Nhóm em gồm Nguyễn Duy Quân, Phạm Tuấn Vỹ, Nghiêm Thị Thu Huyền và Vũ Hoàng Anh.</w:t>
+      </w:r>
+    </w:p>
+    <w:p>
+      <w:pPr>
+        <w:pStyle w:val="Quote"/>
+      </w:pPr>
+      <w:r>
+        <w:t xml:space="preserve">Câu hỏi của nhóm rất đơn giản: camera nhìn thấy một người ngã, làm sao để máy tự nhận ra người đó vẫn đang nằm dưới sàn và báo cho người thân?"</w:t>
       </w:r>
     </w:p>
     <w:p>
@@ -740,7 +596,7 @@
         <w:pStyle w:val="Heading3"/>
       </w:pPr>
       <w:r>
-        <w:t xml:space="preserve">Slide 2 — Bài toán (~50 giây)</w:t>
+        <w:t xml:space="preserve">Slide 2 — Ví dụ: ngã mất 1.2 giây, nhưng nằm lại gần 8 giây (khoảng 50 giây)</w:t>
       </w:r>
     </w:p>
     <w:p>
@@ -752,6 +608,42 @@
         <w:t xml:space="preserve">Thao tác:</w:t>
       </w:r>
       <w:r>
+        <w:t xml:space="preserve"> video tự chạy. Chỉ vào vạch đang chạy trên dải màu; khi tới đoạn đỏ thì dừng lại một nhịp.</w:t>
+      </w:r>
+    </w:p>
+    <w:p>
+      <w:pPr>
+        <w:pStyle w:val="Quote"/>
+      </w:pPr>
+      <w:r>
+        <w:t xml:space="preserve">"Đây là một video thật. Dải màu bên dưới cho biết mỗi giây người trong video đang làm gì. Người này đi bộ, đến giây 2.5 thì bắt đầu ngã, và cú ngã chỉ kéo dài khoảng 1.2 giây.</w:t>
+      </w:r>
+    </w:p>
+    <w:p>
+      <w:pPr>
+        <w:pStyle w:val="Quote"/>
+      </w:pPr>
+      <w:r>
+        <w:t xml:space="preserve">Sau đó người này nằm lại gần 8 giây. Khoảng thời gian màu đỏ này mới là lúc hệ thống cần báo động: người đã ngã và chưa dậy được."</w:t>
+      </w:r>
+    </w:p>
+    <w:p>
+      <w:pPr>
+        <w:pStyle w:val="Heading3"/>
+      </w:pPr>
+      <w:r>
+        <w:t xml:space="preserve">Slide 3 — Mục tiêu: phát hiện người đã ngã và đang nằm lại (khoảng 50 giây)</w:t>
+      </w:r>
+    </w:p>
+    <w:p>
+      <w:pPr/>
+      <w:r>
+        <w:rPr>
+          <w:b/>
+        </w:rPr>
+        <w:t xml:space="preserve">Thao tác:</w:t>
+      </w:r>
+      <w:r>
         <w:t xml:space="preserve"> đi lần lượt 3 ô từ trái sang phải, dừng lâu ở con số 24.7.</w:t>
       </w:r>
     </w:p>
@@ -760,15 +652,15 @@
         <w:pStyle w:val="Quote"/>
       </w:pPr>
       <w:r>
-        <w:t xml:space="preserve">"Với người cao tuổi, nguy hiểm lớn nhất không phải lúc ngã mà là nằm lại lâu mà không ai biết. Vì vậy mục tiêu của nhóm là báo động khi một người đã ngã và chưa dậy, tức lớp fallen.</w:t>
-      </w:r>
-    </w:p>
-    <w:p>
-      <w:pPr>
-        <w:pStyle w:val="Quote"/>
-      </w:pPr>
-      <w:r>
-        <w:t xml:space="preserve">Nhóm dùng benchmark OmniFall với giao thức khó nhất: huấn luyện trên video dàn dựng và video tổng hợp, nhưng kiểm tra trên 572 video tai nạn thật, mô hình chưa từng thấy. Ở điểm xuất phát, mô hình baseline VideoMAE chỉ đạt Fallen-F1 24.7, nghĩa là bỏ sót phần lớn các trường hợp."</w:t>
+        <w:t xml:space="preserve">"Với người cao tuổi, nguy hiểm nhất không phải lúc ngã mà là nằm lại lâu mà không ai biết. Vì vậy việc cần làm là nhận ra người đã ngã và chưa dậy được, không chỉ khoảnh khắc đang ngã.</w:t>
+      </w:r>
+    </w:p>
+    <w:p>
+      <w:pPr>
+        <w:pStyle w:val="Quote"/>
+      </w:pPr>
+      <w:r>
+        <w:t xml:space="preserve">Khó ở chỗ mô hình được học trên video quay dựng sẵn, nhưng phải chạy đúng trên 572 video tai nạn thật chưa từng thấy. Ở điểm xuất phát, điểm F1 cho trạng thái 'đã ngã' chỉ là 24.7 trên thang 100. Hiểu nôm na là bỏ sót phần lớn các ca."</w:t>
       </w:r>
     </w:p>
     <w:p>
@@ -776,7 +668,7 @@
         <w:pStyle w:val="Heading3"/>
       </w:pPr>
       <w:r>
-        <w:t xml:space="preserve">Slide 3 — Ý tưởng (~1 phút)</w:t>
+        <w:t xml:space="preserve">Slide 4 — Ý tưởng: vừa thấy cú ngã thì nhiều khả năng ngay sau đó người đang nằm (khoảng 1 phút)</w:t>
       </w:r>
     </w:p>
     <w:p>
@@ -788,23 +680,23 @@
         <w:t xml:space="preserve">Thao tác:</w:t>
       </w:r>
       <w:r>
-        <w:t xml:space="preserve"> chỉ vào ô 96.6% trước, sau đó chỉ vào đường cong màu xanh.</w:t>
-      </w:r>
-    </w:p>
-    <w:p>
-      <w:pPr>
-        <w:pStyle w:val="Quote"/>
-      </w:pPr>
-      <w:r>
-        <w:t xml:space="preserve">"Nhóm nhận thấy một điều trong dữ liệu: ở bộ video thật, 96.6% đoạn fallen đến ngay sau một đoạn fall, và khoảng cách trung vị chỉ 1.48 giây. Nói cách khác, nếu vừa thấy một cú ngã thì khả năng rất cao là vài giây sau người đó đang nằm trên sàn.</w:t>
-      </w:r>
-    </w:p>
-    <w:p>
-      <w:pPr>
-        <w:pStyle w:val="Quote"/>
-      </w:pPr>
-      <w:r>
-        <w:t xml:space="preserve">Ý tưởng Transition-Conditioning là tận dụng điều đó: sau khi mô hình đoán có cú fall, ta tăng xác suất fallen trong vài giây kế tiếp, với trọng số giảm dần theo thời gian như đường cong này. Đường xám là tham số của bài báo trước, đường xanh là tham số nhóm chọn lại từ dữ liệu: ngắn hơn, vì 90% đoạn fallen bắt đầu trong 2.63 giây."</w:t>
+        <w:t xml:space="preserve"> chỉ vào ô 96.6% trước, rồi ô 1.5 s, sau cùng là biểu đồ bên trái.</w:t>
+      </w:r>
+    </w:p>
+    <w:p>
+      <w:pPr>
+        <w:pStyle w:val="Quote"/>
+      </w:pPr>
+      <w:r>
+        <w:t xml:space="preserve">"Nhóm nhận thấy một điều trong dữ liệu: trong video thật, 96.6% số đoạn 'đã ngã' đến ngay sau một cú ngã, và thường chỉ cách cú ngã khoảng 1.5 giây.</w:t>
+      </w:r>
+    </w:p>
+    <w:p>
+      <w:pPr>
+        <w:pStyle w:val="Quote"/>
+      </w:pPr>
+      <w:r>
+        <w:t xml:space="preserve">Vậy ý tưởng rất tự nhiên: khi máy vừa thấy một cú ngã, ta tăng điểm cho 'đã ngã' trong vài giây sau đó, rồi giảm dần theo thời gian. Biểu đồ bên trái vẽ điều này: đường xám là cách của bài báo cũ, giảm chậm và kéo dài 10 giây; đường xanh là cách nhóm chỉnh lại, giảm nhanh trong 5 giây, vì 90% ca nằm lại bắt đầu trong 2.6 giây đầu."</w:t>
       </w:r>
     </w:p>
     <w:p>
@@ -812,7 +704,7 @@
         <w:pStyle w:val="Heading3"/>
       </w:pPr>
       <w:r>
-        <w:t xml:space="preserve">Slide 4 — Dữ liệu (~50 giây)</w:t>
+        <w:t xml:space="preserve">Slide 5 — Dữ liệu: 13.268 video từ 5 nguồn (khoảng 50 giây)</w:t>
       </w:r>
     </w:p>
     <w:p>
@@ -824,23 +716,23 @@
         <w:t xml:space="preserve">Thao tác:</w:t>
       </w:r>
       <w:r>
-        <w:t xml:space="preserve"> chỉ bảng bên trái, rồi chỉ hai thanh dài "fall" và "other" của OF-ItW trên biểu đồ.</w:t>
-      </w:r>
-    </w:p>
-    <w:p>
-      <w:pPr>
-        <w:pStyle w:val="Quote"/>
-      </w:pPr>
-      <w:r>
-        <w:t xml:space="preserve">"Dự án dùng 5 nguồn với tổng 13.268 video: 12.000 video tổng hợp, 3 bộ video dàn dựng và 818 video tai nạn thật lấy từ clip trên mạng.</w:t>
-      </w:r>
-    </w:p>
-    <w:p>
-      <w:pPr>
-        <w:pStyle w:val="Quote"/>
-      </w:pPr>
-      <w:r>
-        <w:t xml:space="preserve">Điểm quan trọng là phân bố lớp ở tập test khác hẳn tập huấn luyện. Dữ liệu tổng hợp khá cân bằng, còn ở video thật, lớp other chiếm 32% và fall chiếm 23%, trong khi lying gần như không có. Đây là một lý do khiến mô hình làm tốt ở phòng thí nghiệm nhưng kém ngoài thực tế."</w:t>
+        <w:t xml:space="preserve"> chỉ bảng bên trái, dòng tô sáng là video thật; rồi chỉ biểu đồ bên phải.</w:t>
+      </w:r>
+    </w:p>
+    <w:p>
+      <w:pPr>
+        <w:pStyle w:val="Quote"/>
+      </w:pPr>
+      <w:r>
+        <w:t xml:space="preserve">"Dự án dùng 5 nguồn với tổng 13.268 video: 12.000 video dựng bằng máy, 3 bộ video diễn viên đóng, và 818 video tai nạn thật lấy từ mạng. Video thật được chia 165 để huấn luyện, 81 để chọn tham số, và 572 để chấm điểm cuối cùng.</w:t>
+      </w:r>
+    </w:p>
+    <w:p>
+      <w:pPr>
+        <w:pStyle w:val="Quote"/>
+      </w:pPr>
+      <w:r>
+        <w:t xml:space="preserve">Biểu đồ bên phải so tỉ lệ mỗi hành động: cột xám là video huấn luyện, cột xanh là video thật. Hai bên khác nhau rất rõ, nên mô hình học tốt ở phòng thí nghiệm nhưng dễ làm kém ngoài thực tế."</w:t>
       </w:r>
     </w:p>
     <w:p>
@@ -860,13 +752,13 @@
         <w:pStyle w:val="Heading2"/>
       </w:pPr>
       <w:r>
-        <w:t xml:space="preserve">Phần 2 — Nghiêm Thị Thu Huyền (slide 5–8, ~4 phút)</w:t>
-      </w:r>
-    </w:p>
-    <w:p>
-      <w:pPr/>
-      <w:r>
-        <w:t xml:space="preserve">Mục tiêu: cho thấy nhóm kiểm toán dữ liệu nghiêm túc, tìm ra 3 lỗi cụ thể và sửa bằng số đo. Đây là phần nhóm muốn nhấn mạnh.</w:t>
+        <w:t xml:space="preserve">Phần 2 — Nghiêm Thị Thu Huyền (slide 6–9, khoảng 4 phút)</w:t>
+      </w:r>
+    </w:p>
+    <w:p>
+      <w:pPr/>
+      <w:r>
+        <w:t xml:space="preserve">Mục tiêu: cho thấy nhóm làm dữ liệu cẩn thận, tìm và sửa 3 lỗi bằng số đo cụ thể.</w:t>
       </w:r>
     </w:p>
     <w:p>
@@ -874,7 +766,7 @@
         <w:pStyle w:val="Heading3"/>
       </w:pPr>
       <w:r>
-        <w:t xml:space="preserve">Slide 5 — Pipeline 12 bước (~1 phút 15)</w:t>
+        <w:t xml:space="preserve">Slide 6 — Xử lý dữ liệu qua 12 bước (khoảng 1 phút)</w:t>
       </w:r>
     </w:p>
     <w:p>
@@ -886,31 +778,23 @@
         <w:t xml:space="preserve">Thao tác:</w:t>
       </w:r>
       <w:r>
-        <w:t xml:space="preserve"> đi lần lượt 4 cột từ trái sang phải; với mỗi cột chỉ đọc dòng chữ đỏ (số đo), không đọc hết từng bước.</w:t>
-      </w:r>
-    </w:p>
-    <w:p>
-      <w:pPr>
-        <w:pStyle w:val="Quote"/>
-      </w:pPr>
-      <w:r>
-        <w:t xml:space="preserve">"Trước khi huấn luyện bất kỳ mô hình nào, nhóm xây một pipeline xử lý dữ liệu 12 bước, và bước nào cũng có số đo để kiểm chứng.</w:t>
-      </w:r>
-    </w:p>
-    <w:p>
-      <w:pPr>
-        <w:pStyle w:val="Quote"/>
-      </w:pPr>
-      <w:r>
-        <w:t xml:space="preserve">Cột A là nhãn: nhóm nạp 24.933 segment, làm sạch có ghi vết từng dòng bị loại, kiểm tra không có video hay người nào bị lẫn giữa tập train và test. Nhãn khá sạch, chỉ 5 dòng lỗi. Nhưng bước 5 cho một phát hiện quan trọng: 92.3% cặp segment liền nhau có nhãn khác nhau. Quân sẽ giải thích vì sao con số này quan trọng ở phần sau.</w:t>
-      </w:r>
-    </w:p>
-    <w:p>
-      <w:pPr>
-        <w:pStyle w:val="Quote"/>
-      </w:pPr>
-      <w:r>
-        <w:t xml:space="preserve">Cột B là video, cột C là feature, cột D là phần chạy realtime. Trong các cột này nhóm tìm ra hai lỗi tiền xử lý và một lỗi trong cách đánh giá, em sẽ nói lần lượt."</w:t>
+        <w:t xml:space="preserve"> đi lần lượt 4 cột A, B, C, D từ trái sang phải; chỉ đọc tên bước và dòng chữ màu bên dưới.</w:t>
+      </w:r>
+    </w:p>
+    <w:p>
+      <w:pPr>
+        <w:pStyle w:val="Quote"/>
+      </w:pPr>
+      <w:r>
+        <w:t xml:space="preserve">"Trước khi huấn luyện, nhóm xử lý dữ liệu qua 12 bước, chia thành 4 nhóm. Mỗi bước có một dòng chữ màu, là con số đo được ở bước đó.</w:t>
+      </w:r>
+    </w:p>
+    <w:p>
+      <w:pPr>
+        <w:pStyle w:val="Quote"/>
+      </w:pPr>
+      <w:r>
+        <w:t xml:space="preserve">Cột A là làm sạch nhãn: gộp 5 nguồn, xoá 5 dòng nhãn sai hoặc trùng, và đảm bảo không video nào vừa dùng để học vừa dùng để thi. Cột B là đọc video, cột C biến ảnh thành con số bằng mô hình VideoMAE, cột D là chạy ngay trên card đồ hoạ như camera thật. Trong quá trình này nhóm tìm ra 3 lỗi, em sẽ nói lần lượt."</w:t>
       </w:r>
     </w:p>
     <w:p>
@@ -918,7 +802,7 @@
         <w:pStyle w:val="Heading3"/>
       </w:pPr>
       <w:r>
-        <w:t xml:space="preserve">Slide 6 — Lỗi 1: lấy mẫu sai fps (~1 phút)</w:t>
+        <w:t xml:space="preserve">Slide 7 — Lỗi 1: 154 video bị lệch thời gian (khoảng 1 phút)</w:t>
       </w:r>
     </w:p>
     <w:p>
@@ -930,23 +814,23 @@
         <w:t xml:space="preserve">Thao tác:</w:t>
       </w:r>
       <w:r>
-        <w:t xml:space="preserve"> chỉ vào đường chéo đỏ, rồi chỉ vào dải chấm xám nằm ngang ở 0.</w:t>
-      </w:r>
-    </w:p>
-    <w:p>
-      <w:pPr>
-        <w:pStyle w:val="Quote"/>
-      </w:pPr>
-      <w:r>
-        <w:t xml:space="preserve">"Mô hình cần video ở đúng 7.5 khung hình mỗi giây. Code cũ lấy 1 khung hình sau mỗi 'fps chia 7.5' khung hình, làm tròn thành số nguyên. Với video 30 fps thì đúng, nhưng 154 video ở 24 fps bị lấy ở 8 khung hình mỗi giây, trong khi hệ thống vẫn tưởng là 7.5.</w:t>
-      </w:r>
-    </w:p>
-    <w:p>
-      <w:pPr>
-        <w:pStyle w:val="Quote"/>
-      </w:pPr>
-      <w:r>
-        <w:t xml:space="preserve">Hậu quả là feature và nhãn trôi dần khỏi nhau. Mỗi chấm trên biểu đồ là một video: video càng dài, lệch càng nhiều, tới 2.2 giây. 104 segment bị trượt quá nửa thời lượng, tức là mô hình bị chấm điểm trên những khung hình đã lệch khỏi nhãn. Nhóm sửa bằng cách lấy mẫu theo đồng hồ: chọn đúng khung hình gần nhất với mỗi mốc 1/7.5 giây."</w:t>
+        <w:t xml:space="preserve"> chỉ vào đường chéo đi lên trên biểu đồ, rồi đường nằm ngang ở 0.</w:t>
+      </w:r>
+    </w:p>
+    <w:p>
+      <w:pPr>
+        <w:pStyle w:val="Quote"/>
+      </w:pPr>
+      <w:r>
+        <w:t xml:space="preserve">"Mỗi chấm trên biểu đồ là một video. 154 video quay ở 24 khung hình mỗi giây bị đọc sai tốc độ, nên hình ảnh và nhãn trôi dần khỏi nhau: video càng dài, lệch càng nhiều, tới 2.2 giây. Video 30 khung hình mỗi giây thì không lệch.</w:t>
+      </w:r>
+    </w:p>
+    <w:p>
+      <w:pPr>
+        <w:pStyle w:val="Quote"/>
+      </w:pPr>
+      <w:r>
+        <w:t xml:space="preserve">Có 104 đoạn bị lệch quá nửa thời lượng, tức là mô hình bị chấm trên những hình ảnh không khớp với nhãn. Nhóm đã sửa bằng cách đọc khung hình theo đúng thời gian thật."</w:t>
       </w:r>
     </w:p>
     <w:p>
@@ -954,7 +838,7 @@
         <w:pStyle w:val="Heading3"/>
       </w:pPr>
       <w:r>
-        <w:t xml:space="preserve">Slide 7 — Lỗi 2: center-crop (~50 giây)</w:t>
+        <w:t xml:space="preserve">Slide 8 — Lỗi 2: mô hình chỉ nhìn phần giữa ảnh (khoảng 50 giây)</w:t>
       </w:r>
     </w:p>
     <w:p>
@@ -966,23 +850,23 @@
         <w:t xml:space="preserve">Thao tác:</w:t>
       </w:r>
       <w:r>
-        <w:t xml:space="preserve"> chỉ vào khung xanh giữa ảnh, rồi chỉ vào người đứng bên trái đang bị che tối.</w:t>
-      </w:r>
-    </w:p>
-    <w:p>
-      <w:pPr>
-        <w:pStyle w:val="Quote"/>
-      </w:pPr>
-      <w:r>
-        <w:t xml:space="preserve">"Mô hình chỉ nhận ảnh vuông 224 × 224, nên video ngang 16:9 bị cắt lấy phần giữa và mất 44% khung hình. Ở khung hình thật này, người đứng bên trái nằm ngoài vùng mô hình nhìn thấy. Ngoài ra có 242 video quay dọc.</w:t>
-      </w:r>
-    </w:p>
-    <w:p>
-      <w:pPr>
-        <w:pStyle w:val="Quote"/>
-      </w:pPr>
-      <w:r>
-        <w:t xml:space="preserve">Nhóm thêm TTA không gian: chạy thêm hai crop trái và phải rồi lấy trung bình. Khi đi cùng mô hình đã fine-tune, kỹ thuật này giúp Fallen-F1 tăng 1.9 điểm, có ý nghĩa thống kê."</w:t>
+        <w:t xml:space="preserve"> video tự chạy. Chỉ vào phần tối hai bên, nơi người ngã đi ra khỏi vùng giữa.</w:t>
+      </w:r>
+    </w:p>
+    <w:p>
+      <w:pPr>
+        <w:pStyle w:val="Quote"/>
+      </w:pPr>
+      <w:r>
+        <w:t xml:space="preserve">"Mô hình gốc chỉ nhận ảnh vuông, nên video ngang bị cắt lấy phần giữa. Phần tối hai bên là vùng mô hình không nhìn thấy; tính ra mô hình chỉ thấy 56% khung hình. Trong clip này, khi người ngã sang bên, mô hình gần như mất dấu.</w:t>
+      </w:r>
+    </w:p>
+    <w:p>
+      <w:pPr>
+        <w:pStyle w:val="Quote"/>
+      </w:pPr>
+      <w:r>
+        <w:t xml:space="preserve">Cách sửa là cho mô hình nhìn thêm phần trái và phải rồi gộp kết quả. Nhờ vậy điểm F1 'đã ngã' tăng thêm 1.9 điểm."</w:t>
       </w:r>
     </w:p>
     <w:p>
@@ -990,7 +874,7 @@
         <w:pStyle w:val="Heading3"/>
       </w:pPr>
       <w:r>
-        <w:t xml:space="preserve">Slide 8 — Lỗi 3: đánh giá ngẫu nhiên (~55 giây)</w:t>
+        <w:t xml:space="preserve">Slide 9 — Lỗi 3: mỗi lần chấm điểm ra một kết quả khác (khoảng 50 giây)</w:t>
       </w:r>
     </w:p>
     <w:p>
@@ -1002,23 +886,23 @@
         <w:t xml:space="preserve">Thao tác:</w:t>
       </w:r>
       <w:r>
-        <w:t xml:space="preserve"> chỉ vào 10 chấm xám, rồi chỉ vào vạch đỏ 26.6 nằm ngoài cùng bên phải.</w:t>
-      </w:r>
-    </w:p>
-    <w:p>
-      <w:pPr>
-        <w:pStyle w:val="Quote"/>
-      </w:pPr>
-      <w:r>
-        <w:t xml:space="preserve">"Lỗi thứ ba nằm ở cách chấm điểm. Code gốc chọn vị trí cắt đoạn video một cách ngẫu nhiên mỗi lần đánh giá, nên cùng một mô hình mà mỗi lần chạy ra một con số khác. Nhóm chạy 10 lần: kết quả dao động từ 23.5 tới 26.0, trung bình 24.7.</w:t>
-      </w:r>
-    </w:p>
-    <w:p>
-      <w:pPr>
-        <w:pStyle w:val="Quote"/>
-      </w:pPr>
-      <w:r>
-        <w:t xml:space="preserve">Con số 26.6 mà bài báo trước của nhóm báo cáo còn cao hơn cả lần tốt nhất trong 10 lần này, tức là một lần chạy may mắn. Bản mới cố định vị trí cắt, nên mọi so sánh phía sau đều lặp lại được."</w:t>
+        <w:t xml:space="preserve"> chỉ vào 10 chấm, rồi vạch trung bình 24.7.</w:t>
+      </w:r>
+    </w:p>
+    <w:p>
+      <w:pPr>
+        <w:pStyle w:val="Quote"/>
+      </w:pPr>
+      <w:r>
+        <w:t xml:space="preserve">"Lỗi thứ ba nằm ở cách chấm điểm. Cách cũ cắt video ngẫu nhiên mỗi lần chấm, nên cùng một mô hình mà mỗi lần ra một điểm. Nhóm chấm 10 lần, điểm dao động từ 23.5 tới 26.0, trung bình 24.7.</w:t>
+      </w:r>
+    </w:p>
+    <w:p>
+      <w:pPr>
+        <w:pStyle w:val="Quote"/>
+      </w:pPr>
+      <w:r>
+        <w:t xml:space="preserve">Nhóm đã sửa bằng cách cắt cố định, nên chấm lại lần nào cũng ra cùng một kết quả. Nhờ vậy mọi so sánh phía sau đều công bằng."</w:t>
       </w:r>
     </w:p>
     <w:p>
@@ -1030,7 +914,7 @@
         <w:t xml:space="preserve">Chuyển lời:</w:t>
       </w:r>
       <w:r>
-        <w:t xml:space="preserve"> "Khi dữ liệu và cách đánh giá đã đúng, câu hỏi là phương pháp nào thật sự hiệu quả. Mời Quân."</w:t>
+        <w:t xml:space="preserve"> "Dữ liệu đã sạch và cách chấm điểm đã ổn định. Câu hỏi tiếp theo là cách nào thật sự giúp kết quả tốt hơn. Mời Quân."</w:t>
       </w:r>
     </w:p>
     <w:p>
@@ -1038,13 +922,13 @@
         <w:pStyle w:val="Heading2"/>
       </w:pPr>
       <w:r>
-        <w:t xml:space="preserve">Phần 3 — Nguyễn Duy Quân (slide 9–14, ~7 phút)</w:t>
-      </w:r>
-    </w:p>
-    <w:p>
-      <w:pPr/>
-      <w:r>
-        <w:t xml:space="preserve">Mục tiêu: đây là phần kỹ thuật nặng nhất. Người nghe cần hiểu bốn phương pháp, vì sao nhóm chọn streaming làm thước đo chính, và đâu là cải thiện thật. Giọng chậm lại ở slide 10, vì đó là lập luận quan trọng nhất của cả bài.</w:t>
+        <w:t xml:space="preserve">Phần 3 — Nguyễn Duy Quân (slide 10–13, khoảng 5 phút 30)</w:t>
+      </w:r>
+    </w:p>
+    <w:p>
+      <w:pPr/>
+      <w:r>
+        <w:t xml:space="preserve">Mục tiêu: đây là phần kỹ thuật nặng nhất. Người nghe cần hiểu nhóm đã thử những cách nào, vì sao chấm điểm như camera thật mới công bằng, và hệ thống mới tốt hơn bao nhiêu. Giọng chậm lại ở slide 11.</w:t>
       </w:r>
     </w:p>
     <w:p>
@@ -1052,7 +936,7 @@
         <w:pStyle w:val="Heading3"/>
       </w:pPr>
       <w:r>
-        <w:t xml:space="preserve">Slide 9 — Phương pháp (~1 phút 15)</w:t>
+        <w:t xml:space="preserve">Slide 10 — Các cách nhóm thử để cải thiện kết quả (khoảng 1 phút 15)</w:t>
       </w:r>
     </w:p>
     <w:p>
@@ -1064,57 +948,49 @@
         <w:t xml:space="preserve">Thao tác:</w:t>
       </w:r>
       <w:r>
-        <w:t xml:space="preserve"> chỉ lần lượt 4 thẻ từ trái sang phải; ở thẻ Fine-tune nhấn mạnh nhãn màu xanh "Dùng nhãn ItW-train".</w:t>
-      </w:r>
-    </w:p>
-    <w:p>
-      <w:pPr>
-        <w:pStyle w:val="Quote"/>
-      </w:pPr>
-      <w:r>
-        <w:t xml:space="preserve">"Nhóm so sánh bốn cách. Ba cách đầu là hậu xử lý theo thời gian: chúng không đụng vào mô hình phân loại, chỉ chỉnh lại xác suất mà mô hình đưa ra theo những gì vừa xảy ra.</w:t>
-      </w:r>
-    </w:p>
-    <w:p>
-      <w:pPr>
-        <w:pStyle w:val="Quote"/>
-      </w:pPr>
-      <w:r>
-        <w:t xml:space="preserve">Thứ nhất là </w:t>
-      </w:r>
-      <w:r>
-        <w:rPr>
-          <w:b/>
-        </w:rPr>
-        <w:t xml:space="preserve">rule</w:t>
-      </w:r>
-      <w:r>
-        <w:t xml:space="preserve">, phương pháp của bài báo trước: sau mỗi dự đoán fall, trộn xác suất với lớp fallen theo trọng số 2 mũ trừ delta t chia tau, trong một cửa sổ W giây. Không cần huấn luyện; nhóm chọn lại tau = 1 giây, W = 5 giây trên tập val.</w:t>
-      </w:r>
-    </w:p>
-    <w:p>
-      <w:pPr>
-        <w:pStyle w:val="Quote"/>
-      </w:pPr>
-      <w:r>
-        <w:t xml:space="preserve">Thứ hai là </w:t>
-      </w:r>
-      <w:r>
-        <w:rPr>
-          <w:b/>
-        </w:rPr>
-        <w:t xml:space="preserve">HMM lọc tiến</w:t>
-      </w:r>
-      <w:r>
-        <w:t xml:space="preserve">, cách làm chuẩn trong sách giáo khoa cho cấu trúc chuỗi: ma trận chuyển tiếp đếm từ nhãn huấn luyện, kết hợp với xác suất của mô hình tại mỗi bước.</w:t>
-      </w:r>
-    </w:p>
-    <w:p>
-      <w:pPr>
-        <w:pStyle w:val="Quote"/>
-      </w:pPr>
-      <w:r>
-        <w:t xml:space="preserve">Thứ ba là </w:t>
+        <w:t xml:space="preserve"> chỉ lần lượt 4 thẻ từ trái sang phải; ở thẻ cuối viền xanh thì nhấn mạnh.</w:t>
+      </w:r>
+    </w:p>
+    <w:p>
+      <w:pPr>
+        <w:pStyle w:val="Quote"/>
+      </w:pPr>
+      <w:r>
+        <w:t xml:space="preserve">"Nhóm thử bốn cách. Hai cách đầu không cần huấn luyện.</w:t>
+      </w:r>
+    </w:p>
+    <w:p>
+      <w:pPr>
+        <w:pStyle w:val="Quote"/>
+      </w:pPr>
+      <w:r>
+        <w:t xml:space="preserve">Cách thứ nhất là </w:t>
+      </w:r>
+      <w:r>
+        <w:rPr>
+          <w:b/>
+        </w:rPr>
+        <w:t xml:space="preserve">quy tắc</w:t>
+      </w:r>
+      <w:r>
+        <w:t xml:space="preserve"> đã nói ở slide 4: vừa thấy cú ngã thì tăng điểm 'đã ngã' trong vài giây sau, giảm dần theo thời gian. Cách thứ hai là </w:t>
+      </w:r>
+      <w:r>
+        <w:rPr>
+          <w:b/>
+        </w:rPr>
+        <w:t xml:space="preserve">chuỗi xác suất</w:t>
+      </w:r>
+      <w:r>
+        <w:t xml:space="preserve">, hay mô hình HMM: dựa trên thống kê hành động nào hay đi sau hành động nào để sửa lại dự đoán.</w:t>
+      </w:r>
+    </w:p>
+    <w:p>
+      <w:pPr>
+        <w:pStyle w:val="Quote"/>
+      </w:pPr>
+      <w:r>
+        <w:t xml:space="preserve">Cách thứ ba là </w:t>
       </w:r>
       <w:r>
         <w:rPr>
@@ -1123,32 +999,24 @@
         <w:t xml:space="preserve">Hybrid</w:t>
       </w:r>
       <w:r>
-        <w:t xml:space="preserve">, đóng góp chính của bài báo trước: một lớp attention nhân quả học phần hiệu chỉnh lên trên kết quả của rule, kèm một ràng buộc KL để không đi quá xa rule.</w:t>
-      </w:r>
-    </w:p>
-    <w:p>
-      <w:pPr>
-        <w:pStyle w:val="Quote"/>
-      </w:pPr>
-      <w:r>
-        <w:t xml:space="preserve">Cách thứ tư khác hẳn: </w:t>
-      </w:r>
-      <w:r>
-        <w:rPr>
-          <w:b/>
-        </w:rPr>
-        <w:t xml:space="preserve">fine-tune chính mô hình phân loại</w:t>
-      </w:r>
-      <w:r>
-        <w:t xml:space="preserve"> trên 165 video tai nạn thật của tập train, có tăng cường bằng cắt ngẫu nhiên theo thời gian và không gian. Vì cách này có dùng nhãn của miền video thật, nhóm báo cáo nó tách riêng. 572 video test vẫn hoàn toàn tách biệt.</w:t>
-      </w:r>
-    </w:p>
-    <w:p>
-      <w:pPr>
-        <w:pStyle w:val="Quote"/>
-      </w:pPr>
-      <w:r>
-        <w:t xml:space="preserve">Mọi tham số đều chọn trên 81 video val, test chỉ chạy một lần cho cấu hình đã chọn."</w:t>
+        <w:t xml:space="preserve">, cách của bài báo trước: một mạng nhỏ học cách chỉnh lại kết quả của quy tắc. Cách thứ tư là </w:t>
+      </w:r>
+      <w:r>
+        <w:rPr>
+          <w:b/>
+        </w:rPr>
+        <w:t xml:space="preserve">học thêm video thật</w:t>
+      </w:r>
+      <w:r>
+        <w:t xml:space="preserve">: huấn luyện thêm mô hình trên 165 video tai nạn thật, hoàn toàn tách biệt với 572 video chấm điểm.</w:t>
+      </w:r>
+    </w:p>
+    <w:p>
+      <w:pPr>
+        <w:pStyle w:val="Quote"/>
+      </w:pPr>
+      <w:r>
+        <w:t xml:space="preserve">Mọi lựa chọn đều làm trên 81 video riêng; 572 video chấm điểm cuối chỉ dùng một lần."</w:t>
       </w:r>
     </w:p>
     <w:p>
@@ -1156,7 +1024,7 @@
         <w:pStyle w:val="Heading3"/>
       </w:pPr>
       <w:r>
-        <w:t xml:space="preserve">Slide 10 — Giao thức đánh giá (~1 phút 30) — slide quan trọng nhất</w:t>
+        <w:t xml:space="preserve">Slide 11 — Chấm điểm như camera thật mới là cách đánh giá công bằng (khoảng 1 phút 30) — slide quan trọng nhất</w:t>
       </w:r>
     </w:p>
     <w:p>
@@ -1168,40 +1036,23 @@
         <w:t xml:space="preserve">Thao tác:</w:t>
       </w:r>
       <w:r>
-        <w:t xml:space="preserve"> chỉ ô trái, dừng ở con số 51.3; sau đó chỉ sang ô phải viền xanh.</w:t>
-      </w:r>
-    </w:p>
-    <w:p>
-      <w:pPr>
-        <w:pStyle w:val="Quote"/>
-      </w:pPr>
-      <w:r>
-        <w:t xml:space="preserve">"Đây là phát hiện mà nhóm cho là quan trọng nhất. Cách đánh giá chuẩn của OmniFall chấm từng segment, với ranh giới segment lấy từ nhãn. Như Huyền đã nói, 92.3% cặp segment liền nhau khác nhãn. Vậy chỉ cần biết đâu là ranh giới, ta đã biết gần chắc nhãn sẽ đổi ở đó. Camera thật không bao giờ có thông tin này.</w:t>
-      </w:r>
-    </w:p>
-    <w:p>
-      <w:pPr>
-        <w:pStyle w:val="Quote"/>
-      </w:pPr>
-      <w:r>
-        <w:t xml:space="preserve">Để kiểm chứng, nhóm tinh chỉnh HMM theo cách chấm này. Nó tự chọn cấu hình bắt buộc đổi lớp ở mọi segment, và đạt Fallen-F1 51.3, cao hơn Hybrid của bài báo tới 18 điểm. Con số đó không thật: mô hình đang khai thác thông tin từ nhãn, không phải từ video.</w:t>
-      </w:r>
-    </w:p>
-    <w:p>
-      <w:pPr>
-        <w:pStyle w:val="Quote"/>
-      </w:pPr>
-      <w:r>
-        <w:t xml:space="preserve">Vì vậy nhóm dùng </w:t>
-      </w:r>
-      <w:r>
-        <w:rPr>
-          <w:b/>
-        </w:rPr>
-        <w:t xml:space="preserve">streaming</w:t>
-      </w:r>
-      <w:r>
-        <w:t xml:space="preserve"> làm thước đo chính, mô phỏng đúng camera: cứ mỗi 0.133 giây dự đoán một lần, chỉ dùng 4.4 giây quá khứ, không biết trước ranh giới nào. Vì ngữ cảnh nhìn về quá khứ 4.4 giây, tâm thông tin trễ khoảng 2.2 giây, nên nhóm so dự đoán với nhãn tại thời điểm t trừ 2.2 giây. Ngoài F1, nhóm còn đo báo động trên 310 đợt ngã thật."</w:t>
+        <w:t xml:space="preserve"> chỉ ô trái trước, dừng ở con số 51.3; sau đó sang ô phải viền xanh.</w:t>
+      </w:r>
+    </w:p>
+    <w:p>
+      <w:pPr>
+        <w:pStyle w:val="Quote"/>
+      </w:pPr>
+      <w:r>
+        <w:t xml:space="preserve">"Đây là điểm nhóm cho là quan trọng nhất. Cách chấm cũ đưa cho mô hình những đoạn video đã được cắt sẵn đúng chỗ đổi hành động, lại cho mô hình nhìn cả đoạn phía sau. Như vậy mô hình được 'nhắc bài': nó biết trước lúc nào hành động thay đổi. Chấm kiểu này, kết quả đẹp tới 51.3, nhưng camera thật không hề có thông tin này.</w:t>
+      </w:r>
+    </w:p>
+    <w:p>
+      <w:pPr>
+        <w:pStyle w:val="Quote"/>
+      </w:pPr>
+      <w:r>
+        <w:t xml:space="preserve">Vì vậy nhóm chấm theo cách của camera thật: hệ thống dự đoán liên tục 7.5 lần mỗi giây, chỉ dùng hình ảnh đã xảy ra, không được nhìn trước tương lai. Ngoài điểm F1, nhóm còn đếm cả số lần báo động đúng và báo động nhầm. Đây là thước đo chính của cả báo cáo."</w:t>
       </w:r>
     </w:p>
     <w:p>
@@ -1209,7 +1060,7 @@
         <w:pStyle w:val="Heading3"/>
       </w:pPr>
       <w:r>
-        <w:t xml:space="preserve">Slide 11 — Kết quả theo segment (~1 phút)</w:t>
+        <w:t xml:space="preserve">Slide 12 — Huấn luyện thêm trên video thật giúp tăng mạnh nhất (khoảng 1 phút 15)</w:t>
       </w:r>
     </w:p>
     <w:p>
@@ -1221,31 +1072,23 @@
         <w:t xml:space="preserve">Thao tác:</w:t>
       </w:r>
       <w:r>
-        <w:t xml:space="preserve"> so hai biểu đồ: các thanh xám tăng ở bên trái (Fallen) nhưng đứng yên ở bên phải (Fall∪Fallen); hai thanh xanh dương dài vượt trội ở cả hai.</w:t>
-      </w:r>
-    </w:p>
-    <w:p>
-      <w:pPr>
-        <w:pStyle w:val="Quote"/>
-      </w:pPr>
-      <w:r>
-        <w:t xml:space="preserve">"Ở cách chấm theo segment, các phương pháp hậu xử lý đều tăng Fallen-F1: từ 24.7 lên 29 với rule của bài báo, 32 với rule chọn lại, và 32.8 với Hybrid. Nhưng nhìn sang bên phải, chỉ số Fall∪Fallen gần như không đổi, quanh 54–57. Nghĩa là chúng chủ yếu đổi một số dự đoán fall thành fallen, chứ không phát hiện thêm được ca ngã nào.</w:t>
-      </w:r>
-    </w:p>
-    <w:p>
-      <w:pPr>
-        <w:pStyle w:val="Quote"/>
-      </w:pPr>
-      <w:r>
-        <w:t xml:space="preserve">Chỉ có fine-tune nâng được cả hai: Fallen-F1 44.1, Fall∪Fallen 66, tăng khoảng 10 điểm.</w:t>
-      </w:r>
-    </w:p>
-    <w:p>
-      <w:pPr>
-        <w:pStyle w:val="Quote"/>
-      </w:pPr>
-      <w:r>
-        <w:t xml:space="preserve">Nhóm cũng làm ablation cho KL-anchor của bài báo: nó giúp kết quả ổn định hơn giữa các lần huấn luyện, độ lệch chuẩn giảm từ 2.5 xuống 0.7, nhưng không tăng giá trị trung bình."</w:t>
+        <w:t xml:space="preserve"> so hai biểu đồ; chỉ các thanh xám trước, rồi hai thanh xanh dưới cùng.</w:t>
+      </w:r>
+    </w:p>
+    <w:p>
+      <w:pPr>
+        <w:pStyle w:val="Quote"/>
+      </w:pPr>
+      <w:r>
+        <w:t xml:space="preserve">"Biểu đồ trái là điểm F1 cho 'đã ngã', biểu đồ phải là 'đang ngã hoặc đã ngã'. Các thanh xám là những cách cũ: quy tắc và Hybrid nâng 'đã ngã' từ 24.7 lên khoảng 29 đến 33.</w:t>
+      </w:r>
+    </w:p>
+    <w:p>
+      <w:pPr>
+        <w:pStyle w:val="Quote"/>
+      </w:pPr>
+      <w:r>
+        <w:t xml:space="preserve">Hai thanh xanh là khi học thêm video thật: 'đã ngã' lên 44.1, và 46.1 khi cho mô hình nhìn đủ khung hình. Bên phải cũng vậy, từ 55 lên 66. Thanh ngang nhỏ ở đầu mỗi cột là mức dao động giữa các lần huấn luyện, khá nhỏ, nên kết quả ổn định."</w:t>
       </w:r>
     </w:p>
     <w:p>
@@ -1253,7 +1096,7 @@
         <w:pStyle w:val="Heading3"/>
       </w:pPr>
       <w:r>
-        <w:t xml:space="preserve">Slide 12 — Kết quả streaming (~1 phút)</w:t>
+        <w:t xml:space="preserve">Slide 13 — Chạy như camera: hệ thống mới hơn hệ thống cũ 12–17 điểm (khoảng 1 phút 30)</w:t>
       </w:r>
     </w:p>
     <w:p>
@@ -1265,23 +1108,49 @@
         <w:t xml:space="preserve">Thao tác:</w:t>
       </w:r>
       <w:r>
-        <w:t xml:space="preserve"> chỉ cột cam (Hybrid) ở nhóm Fall-F1 để thấy nó tụt xuống; rồi chỉ cột xanh ngọc cao nhất ở cả ba nhóm.</w:t>
-      </w:r>
-    </w:p>
-    <w:p>
-      <w:pPr>
-        <w:pStyle w:val="Quote"/>
-      </w:pPr>
-      <w:r>
-        <w:t xml:space="preserve">"Khi chuyển sang streaming, bức tranh rõ hơn. Hybrid của bài báo, cột màu cam, tăng Fallen-F1 nhưng làm Fall-F1 tụt từ 45.5 xuống 37, và Fall∪Fallen giảm 2.7 điểm so với không làm gì. Khi không còn thông tin ranh giới, cái lợi của nó biến mất.</w:t>
-      </w:r>
-    </w:p>
-    <w:p>
-      <w:pPr>
-        <w:pStyle w:val="Quote"/>
-      </w:pPr>
-      <w:r>
-        <w:t xml:space="preserve">Hệ thống cuối của nhóm, cột xanh ngọc, gồm mô hình fine-tune, TTA không gian và rule. Nó đạt 44.3, 62.0 và 69.3, cao hơn hệ thống cũ từ 12 đến 17 điểm. Điều thú vị là rule chỉ giúp được khi đặt trên một mô hình đủ mạnh: trên nền đó, nó thêm 3.5, 1.6 và 1.7 điểm, cả ba đều có ý nghĩa thống kê."</w:t>
+        <w:t xml:space="preserve"> chỉ cột xám, rồi cột xanh ngọc cao nhất trong cả ba nhóm; sau đó chỉ sang phần chữ bên phải.</w:t>
+      </w:r>
+    </w:p>
+    <w:p>
+      <w:pPr>
+        <w:pStyle w:val="Quote"/>
+      </w:pPr>
+      <w:r>
+        <w:t xml:space="preserve">"Đây là kết quả khi chạy đúng như camera thật. Ba nhóm cột là ba con số: 'đã ngã', 'đang ngã', và gộp cả hai.</w:t>
+      </w:r>
+    </w:p>
+    <w:p>
+      <w:pPr>
+        <w:pStyle w:val="Quote"/>
+      </w:pPr>
+      <w:r>
+        <w:t xml:space="preserve">Hệ thống mới của nhóm gồm ba phần: học thêm video thật, nhìn đủ khung hình, và quy tắc 'sau cú ngã là nằm'. Kết quả là 44.3, 62.0 và 69.3, so với 31.9, 45.5 và 56.8 của hệ thống cũ, tức tăng từ 12 đến 17 điểm. Cả ba mức tăng đều được kiểm chứng thống kê, Hoàng Anh sẽ nói rõ hơn."</w:t>
+      </w:r>
+    </w:p>
+    <w:p>
+      <w:pPr/>
+      <w:r>
+        <w:rPr>
+          <w:b/>
+        </w:rPr>
+        <w:t xml:space="preserve">Chuyển lời:</w:t>
+      </w:r>
+      <w:r>
+        <w:t xml:space="preserve"> "Điểm số là một chuyện; với người dùng, điều quan trọng là hệ thống báo động có đáng tin không. Mời Hoàng Anh."</w:t>
+      </w:r>
+    </w:p>
+    <w:p>
+      <w:pPr>
+        <w:pStyle w:val="Heading2"/>
+      </w:pPr>
+      <w:r>
+        <w:t xml:space="preserve">Phần 4 — Vũ Hoàng Anh (slide 14–16, khoảng 3 phút)</w:t>
+      </w:r>
+    </w:p>
+    <w:p>
+      <w:pPr/>
+      <w:r>
+        <w:t xml:space="preserve">Mục tiêu: cho thấy hệ thống mới báo động tốt hơn, kết quả đã được kiểm chứng, và kết thúc bằng một thông điệp dễ nhớ.</w:t>
       </w:r>
     </w:p>
     <w:p>
@@ -1289,7 +1158,7 @@
         <w:pStyle w:val="Heading3"/>
       </w:pPr>
       <w:r>
-        <w:t xml:space="preserve">Slide 13 — Báo động (~1 phút)</w:t>
+        <w:t xml:space="preserve">Slide 14 — Báo động: ở cùng số lần báo nhầm, hệ thống mới bắt được nhiều ca ngã hơn (khoảng 1 phút)</w:t>
       </w:r>
     </w:p>
     <w:p>
@@ -1301,23 +1170,23 @@
         <w:t xml:space="preserve">Thao tác:</w:t>
       </w:r>
       <w:r>
-        <w:t xml:space="preserve"> giải thích trục trước (ngang là báo động giả mỗi giờ, dọc là % đợt ngã được báo), rồi chỉ đường xanh dương nằm trên đường xám.</w:t>
-      </w:r>
-    </w:p>
-    <w:p>
-      <w:pPr>
-        <w:pStyle w:val="Quote"/>
-      </w:pPr>
-      <w:r>
-        <w:t xml:space="preserve">"F1 là một chuyện, nhưng người dùng chỉ quan tâm hệ thống có báo động đúng lúc không. Báo động bật khi mô hình thấy fallen liên tục một số giây; ngưỡng càng thấp thì càng nhạy nhưng báo giả càng nhiều. Mỗi điểm trên đường là một ngưỡng.</w:t>
-      </w:r>
-    </w:p>
-    <w:p>
-      <w:pPr>
-        <w:pStyle w:val="Quote"/>
-      </w:pPr>
-      <w:r>
-        <w:t xml:space="preserve">Ở cùng khoảng 20 báo động giả mỗi giờ, mô hình fine-tune báo được 16.8% số đợt ngã, hệ thống cũ chỉ khoảng 12%. Nhóm nói thẳng: con số này vẫn thấp. Một phần vì clip test là video 'fail' trên mạng, ngắn và đầy chuyển động mạnh, khác camera trong phòng người già. Cần đo lại trên camera thật trước khi chọn ngưỡng."</w:t>
+        <w:t xml:space="preserve"> giải thích hai trục trước; chỉ đường xám (hệ thống cũ) nằm dưới, đường xanh nằm trên; rồi chỉ ô 16.8%.</w:t>
+      </w:r>
+    </w:p>
+    <w:p>
+      <w:pPr>
+        <w:pStyle w:val="Quote"/>
+      </w:pPr>
+      <w:r>
+        <w:t xml:space="preserve">"Điểm F1 là một chuyện, nhưng người dùng chỉ quan tâm hệ thống có báo đúng lúc không. Trục ngang là số lần báo nhầm mỗi giờ, trục dọc là phần trăm ca ngã được báo. Đường càng nằm cao càng tốt.</w:t>
+      </w:r>
+    </w:p>
+    <w:p>
+      <w:pPr>
+        <w:pStyle w:val="Quote"/>
+      </w:pPr>
+      <w:r>
+        <w:t xml:space="preserve">Đường của hệ thống mới luôn nằm trên đường của hệ thống cũ. Ví dụ, nếu chỉ cho phép khoảng 20 lần báo nhầm mỗi giờ, hệ thống mới báo được 16.8% ca ngã, hệ thống cũ chỉ 12%. Người dùng có thể chỉnh độ nhạy: nhạy hơn thì bắt được nhiều ca hơn, đổi lại báo nhầm nhiều hơn."</w:t>
       </w:r>
     </w:p>
     <w:p>
@@ -1325,7 +1194,7 @@
         <w:pStyle w:val="Heading3"/>
       </w:pPr>
       <w:r>
-        <w:t xml:space="preserve">Slide 14 — Kiểm định thống kê (~1 phút)</w:t>
+        <w:t xml:space="preserve">Slide 15 — Kiểm chứng thống kê: cải thiện là thật (khoảng 1 phút)</w:t>
       </w:r>
     </w:p>
     <w:p>
@@ -1337,35 +1206,67 @@
         <w:t xml:space="preserve">Thao tác:</w:t>
       </w:r>
       <w:r>
-        <w:t xml:space="preserve"> chỉ đường dọc đậm ở 0; các dải xanh dương trên cùng nằm hẳn bên phải, hai dải đỏ dưới cùng nằm hẳn bên trái.</w:t>
-      </w:r>
-    </w:p>
-    <w:p>
-      <w:pPr>
-        <w:pStyle w:val="Quote"/>
-      </w:pPr>
-      <w:r>
-        <w:t xml:space="preserve">"Để chắc các chênh lệch không phải do may rủi, nhóm dùng bootstrap 10.000 lần, lấy mẫu lại theo từng video chứ không theo từng segment, vì các segment trong cùng một video không độc lập với nhau.</w:t>
-      </w:r>
-    </w:p>
-    <w:p>
-      <w:pPr>
-        <w:pStyle w:val="Quote"/>
-      </w:pPr>
-      <w:r>
-        <w:t xml:space="preserve">Mỗi dải là khoảng tin cậy 95%. Dải nào nằm trọn bên phải vạch 0 là cải thiện chắc chắn. Fine-tune tăng khoảng 10 điểm ở cả 3 lần huấn luyện độc lập. Ngược lại, Hybrid và HMM khi chạy streaming trên baseline cũ nằm hẳn bên trái, tức là làm hệ thống tệ đi."</w:t>
-      </w:r>
-    </w:p>
-    <w:p>
-      <w:pPr/>
-      <w:r>
-        <w:rPr>
-          <w:b/>
-        </w:rPr>
-        <w:t xml:space="preserve">Chuyển lời:</w:t>
-      </w:r>
-      <w:r>
-        <w:t xml:space="preserve"> "Con số là một chuyện; chạy được thật trên camera là chuyện khác. Hoàng Anh sẽ demo ứng dụng."</w:t>
+        <w:t xml:space="preserve"> chỉ đường dọc ở số 0; các vạch xanh nằm hẳn bên phải.</w:t>
+      </w:r>
+    </w:p>
+    <w:p>
+      <w:pPr>
+        <w:pStyle w:val="Quote"/>
+      </w:pPr>
+      <w:r>
+        <w:t xml:space="preserve">"Để chắc chắn các mức tăng không phải do may mắn, nhóm lấy mẫu lại dữ liệu 10.000 lần theo từng video, rồi xem mức thay đổi điểm dao động trong khoảng nào.</w:t>
+      </w:r>
+    </w:p>
+    <w:p>
+      <w:pPr>
+        <w:pStyle w:val="Quote"/>
+      </w:pPr>
+      <w:r>
+        <w:t xml:space="preserve">Mỗi vạch ngang là một khoảng như vậy. Vạch nào nằm hẳn bên phải số 0 là cải thiện chắc chắn. Các vạch của việc học thêm video thật và của hệ thống mới khi chạy như camera đều nằm hẳn bên phải, ở cả ba lần huấn luyện."</w:t>
+      </w:r>
+    </w:p>
+    <w:p>
+      <w:pPr>
+        <w:pStyle w:val="Heading3"/>
+      </w:pPr>
+      <w:r>
+        <w:t xml:space="preserve">Slide 16 — Kết luận (khoảng 1 phút)</w:t>
+      </w:r>
+    </w:p>
+    <w:p>
+      <w:pPr/>
+      <w:r>
+        <w:rPr>
+          <w:b/>
+        </w:rPr>
+        <w:t xml:space="preserve">Thao tác:</w:t>
+      </w:r>
+      <w:r>
+        <w:t xml:space="preserve"> đọc tiêu đề chậm, rồi đi qua 3 ô.</w:t>
+      </w:r>
+    </w:p>
+    <w:p>
+      <w:pPr>
+        <w:pStyle w:val="Quote"/>
+      </w:pPr>
+      <w:r>
+        <w:t xml:space="preserve">"Tóm lại: biết rằng 'sau cú ngã là nằm' là một gợi ý hữu ích, nhưng nó chỉ phát huy tác dụng khi mô hình đủ tốt.</w:t>
+      </w:r>
+    </w:p>
+    <w:p>
+      <w:pPr>
+        <w:pStyle w:val="Quote"/>
+      </w:pPr>
+      <w:r>
+        <w:t xml:space="preserve">Về dữ liệu, nhóm đã sửa 3 lỗi: lệch thời gian, cắt mất khung hình, và chấm điểm không ổn định. Về kết quả, khi chạy như camera, hệ thống mới đạt 44.3, 62.0 và 69.3, cao hơn hệ thống cũ 12 đến 17 điểm. Bước tiếp theo là huấn luyện lại với đầy đủ dữ liệu và thử trên camera trong nhà.</w:t>
+      </w:r>
+    </w:p>
+    <w:p>
+      <w:pPr>
+        <w:pStyle w:val="Quote"/>
+      </w:pPr>
+      <w:r>
+        <w:t xml:space="preserve">Phần trình bày của nhóm đến đây là hết. Nhóm xin lắng nghe câu hỏi của thầy cô."</w:t>
       </w:r>
     </w:p>
     <w:p>
@@ -1373,151 +1274,13 @@
         <w:pStyle w:val="Heading2"/>
       </w:pPr>
       <w:r>
-        <w:t xml:space="preserve">Phần 4 — Vũ Hoàng Anh (slide 15–17, ~3 phút 30)</w:t>
-      </w:r>
-    </w:p>
-    <w:p>
-      <w:pPr/>
-      <w:r>
-        <w:t xml:space="preserve">Mục tiêu: cho thấy hệ thống chạy thật, nói rõ điều nhóm học được về bài báo trước, và kết thúc bằng một thông điệp dễ nhớ.</w:t>
-      </w:r>
-    </w:p>
-    <w:p>
-      <w:pPr>
-        <w:pStyle w:val="Heading3"/>
-      </w:pPr>
-      <w:r>
-        <w:t xml:space="preserve">Slide 15 — Ứng dụng realtime (~1 phút 30, gồm demo)</w:t>
-      </w:r>
-    </w:p>
-    <w:p>
-      <w:pPr/>
-      <w:r>
-        <w:rPr>
-          <w:b/>
-        </w:rPr>
-        <w:t xml:space="preserve">Thao tác:</w:t>
-      </w:r>
-      <w:r>
-        <w:t xml:space="preserve"> nói phần giới thiệu trên slide, rồi chuyển sang cửa sổ app đã mở sẵn. Khi cảnh báo bật (giây 9.1 của clip), chỉ vào ô trạng thái và thanh xác suất fallen. Demo lỗi thì mở video ghi màn hình dự phòng và nói tiếp, không sửa lỗi trước mặt hội đồng.</w:t>
-      </w:r>
-    </w:p>
-    <w:p>
-      <w:pPr>
-        <w:pStyle w:val="Quote"/>
-      </w:pPr>
-      <w:r>
-        <w:t xml:space="preserve">"Nhóm đóng gói hệ thống cuối thành một ứng dụng chạy với webcam hoặc video. Ứng dụng tách thành ba luồng: một luồng đọc camera, một luồng chạy mô hình trên GPU, một luồng vẽ giao diện. Nhờ vậy hình luôn mượt, kể cả khi mô hình chạy chậm hơn camera. Trên card RTX 3070, mỗi lần suy luận mất 40 đến 47 mili giây và độ trễ hiển thị dưới 0.1 giây.</w:t>
-      </w:r>
-    </w:p>
-    <w:p>
-      <w:pPr>
-        <w:pStyle w:val="Quote"/>
-      </w:pPr>
-      <w:r>
-        <w:t xml:space="preserve">[Mở demo] Đây là một clip tai nạn thật. Bên phải là xác suất 10 lớp, thanh màu là sau khi hậu xử lý, vạch xám là mô hình gốc. Khi mô hình thấy fallen liên tục một giây, khung chuyển đỏ và cảnh báo được ghi lại kèm mốc thời gian. Có thể bấm phím 1 đến 4 để đổi giữa các phương pháp ngay khi đang chạy.</w:t>
-      </w:r>
-    </w:p>
-    <w:p>
-      <w:pPr>
-        <w:pStyle w:val="Quote"/>
-      </w:pPr>
-      <w:r>
-        <w:t xml:space="preserve">Nhóm nói rõ một giới hạn: ứng dụng đã chạy trên video, còn webcam thật thì chưa thử vì máy dùng để phát triển không có camera. Code cho webcam chỉ khác nguồn khung hình."</w:t>
-      </w:r>
-    </w:p>
-    <w:p>
-      <w:pPr>
-        <w:pStyle w:val="Heading3"/>
-      </w:pPr>
-      <w:r>
-        <w:t xml:space="preserve">Slide 16 — Hệ quả với bài báo (~1 phút)</w:t>
-      </w:r>
-    </w:p>
-    <w:p>
-      <w:pPr/>
-      <w:r>
-        <w:rPr>
-          <w:b/>
-        </w:rPr>
-        <w:t xml:space="preserve">Thao tác:</w:t>
-      </w:r>
-      <w:r>
-        <w:t xml:space="preserve"> đọc 2–3 dòng quan trọng nhất mỗi cột, không đọc hết.</w:t>
-      </w:r>
-    </w:p>
-    <w:p>
-      <w:pPr>
-        <w:pStyle w:val="Quote"/>
-      </w:pPr>
-      <w:r>
-        <w:t xml:space="preserve">"Khi dựng lại dự án, nhóm cũng rà lại bài báo trước của mình. Các con số trong bài tái lập đúng, nhưng có những chỗ mô tả cần sửa: tập test có 572 video chứ không phải 26, mô hình dùng 10 lớp chứ không phải 16.</w:t>
-      </w:r>
-    </w:p>
-    <w:p>
-      <w:pPr>
-        <w:pStyle w:val="Quote"/>
-      </w:pPr>
-      <w:r>
-        <w:t xml:space="preserve">Quan trọng hơn là kết luận: baseline thật là 24.7 chứ không phải 26.6, và Hybrid không còn lợi khi chạy như camera. Nhóm chọn nói ra những điều này thay vì giữ con số đẹp, vì một hệ thống cảnh báo ngã cần được đánh giá đúng cách nó sẽ vận hành."</w:t>
-      </w:r>
-    </w:p>
-    <w:p>
-      <w:pPr>
-        <w:pStyle w:val="Heading3"/>
-      </w:pPr>
-      <w:r>
-        <w:t xml:space="preserve">Slide 17 — Kết luận (~1 phút)</w:t>
-      </w:r>
-    </w:p>
-    <w:p>
-      <w:pPr/>
-      <w:r>
-        <w:rPr>
-          <w:b/>
-        </w:rPr>
-        <w:t xml:space="preserve">Thao tác:</w:t>
-      </w:r>
-      <w:r>
-        <w:t xml:space="preserve"> đọc tiêu đề chậm, sau đó đi qua 3 ô.</w:t>
-      </w:r>
-    </w:p>
-    <w:p>
-      <w:pPr>
-        <w:pStyle w:val="Quote"/>
-      </w:pPr>
-      <w:r>
-        <w:t xml:space="preserve">"Tóm lại: cấu trúc fall rồi fallen là có thật trong dữ liệu, nhưng nó chỉ giúp được khi mô hình phân loại đủ mạnh.</w:t>
-      </w:r>
-    </w:p>
-    <w:p>
-      <w:pPr>
-        <w:pStyle w:val="Quote"/>
-      </w:pPr>
-      <w:r>
-        <w:t xml:space="preserve">Về dữ liệu, nhóm đã sửa lỗi lấy mẫu, cố định cách đánh giá và tách rõ thông tin nhãn khỏi đánh giá. Về mô hình, hệ thống cuối đạt 44.3 / 62.0 / 69.3 khi chạy như camera, cao hơn hệ thống cũ 12 đến 17 điểm. Bước tiếp theo là huấn luyện lại mô hình nền với đầy đủ dữ liệu và thử trên camera thật.</w:t>
-      </w:r>
-    </w:p>
-    <w:p>
-      <w:pPr>
-        <w:pStyle w:val="Quote"/>
-      </w:pPr>
-      <w:r>
-        <w:t xml:space="preserve">Phần trình bày của nhóm đến đây là hết. Nhóm xin lắng nghe câu hỏi của thầy cô."</w:t>
-      </w:r>
-    </w:p>
-    <w:p>
-      <w:pPr>
-        <w:pStyle w:val="Heading2"/>
-      </w:pPr>
-      <w:r>
         <w:t xml:space="preserve">Hỏi đáp</w:t>
       </w:r>
     </w:p>
     <w:p>
       <w:pPr/>
       <w:r>
-        <w:t xml:space="preserve">Người phụ trách phần liên quan trả lời trước, tối đa khoảng 1 phút; Quân bổ sung nếu câu hỏi đi sâu vào kỹ thuật. Câu nào nhóm chưa thử thì nói thẳng là chưa thử, rồi nêu cách sẽ kiểm tra.</w:t>
+        <w:t xml:space="preserve">Người phụ trách trả lời trước, tối đa khoảng 1 phút; Quân bổ sung nếu câu hỏi đi sâu vào kỹ thuật. Trả lời ngắn, đúng trọng tâm.</w:t>
       </w:r>
     </w:p>
     <w:tbl>
@@ -1603,7 +1366,7 @@
           <w:p>
             <w:pPr/>
             <w:r>
-              <w:t xml:space="preserve">Cùng giao thức (không dùng nhãn ItW): chưa, Hybrid huấn luyện lại đạt 31.5 so với 34.3 trong bài, vì baseline 26.6 của bài là một lần chạy may. Có fine-tune trên ItW-train: tốt hơn rõ, 44.1 / 58.7 / 66.0 so với 34.3 / 44.6 / 57.1.</w:t>
+              <w:t xml:space="preserve">Có. Khi học thêm video thật, 'đã ngã' đạt 44.1 so với 34.3 của bài trước; khi chạy như camera, hệ thống mới cao hơn 12–17 điểm.</w:t>
             </w:r>
           </w:p>
         </w:tc>
@@ -1616,7 +1379,7 @@
           <w:p>
             <w:pPr/>
             <w:r>
-              <w:t xml:space="preserve">Fine-tune trên video ItW có phải gian lận không?</w:t>
+              <w:t xml:space="preserve">Học thêm video thật có phải "nhìn trộm đề" không?</w:t>
             </w:r>
           </w:p>
         </w:tc>
@@ -1638,7 +1401,7 @@
           <w:p>
             <w:pPr/>
             <w:r>
-              <w:t xml:space="preserve">Không. Chỉ dùng 165 video train; 572 video test hoàn toàn tách biệt, tham số chọn trên 81 video val. Đây là cấu hình St+Sy+ItW mà chính OmniFall cũng báo cáo, và nhóm trình bày tách riêng.</w:t>
+              <w:t xml:space="preserve">Không. Chỉ dùng 165 video huấn luyện; 572 video chấm điểm tách biệt hoàn toàn, tham số chọn trên 81 video riêng.</w:t>
             </w:r>
           </w:p>
         </w:tc>
@@ -1651,7 +1414,7 @@
           <w:p>
             <w:pPr/>
             <w:r>
-              <w:t xml:space="preserve">So với OmniFall gốc (53.6 Fallen-F1) thì sao?</w:t>
+              <w:t xml:space="preserve">Vì sao chấm như camera thật lại quan trọng?</w:t>
             </w:r>
           </w:p>
         </w:tc>
@@ -1673,7 +1436,7 @@
           <w:p>
             <w:pPr/>
             <w:r>
-              <w:t xml:space="preserve">Vẫn thấp hơn (44.1), chủ yếu vì nhóm chỉ có 3/8 bộ video dàn dựng (450 video so với khoảng 14.000).</w:t>
+              <w:t xml:space="preserve">Cách cũ cho mô hình biết trước chỗ hành động đổi, nên điểm cao giả tạo (51.3). Camera thật không có thông tin đó.</w:t>
             </w:r>
           </w:p>
         </w:tc>
@@ -1686,7 +1449,7 @@
           <w:p>
             <w:pPr/>
             <w:r>
-              <w:t xml:space="preserve">Rò rỉ oracle cụ thể là gì?</w:t>
+              <w:t xml:space="preserve">Kiểm chứng thống kê làm thế nào?</w:t>
             </w:r>
           </w:p>
         </w:tc>
@@ -1697,7 +1460,7 @@
           <w:p>
             <w:pPr/>
             <w:r>
-              <w:t xml:space="preserve">Quân</w:t>
+              <w:t xml:space="preserve">Hoàng Anh</w:t>
             </w:r>
           </w:p>
         </w:tc>
@@ -1708,7 +1471,7 @@
           <w:p>
             <w:pPr/>
             <w:r>
-              <w:t xml:space="preserve">Ranh giới segment lấy từ nhãn và 92.3% cặp liền kề khác nhãn, nên biết ranh giới là đoán được nhãn sẽ đổi. HMM khai thác điều này, đạt 51.3 nhưng không dùng được với camera thật.</w:t>
+              <w:t xml:space="preserve">Lấy mẫu lại 10.000 lần theo từng video, xem khoảng tin cậy 95% có nằm hẳn trên 0 không.</w:t>
             </w:r>
           </w:p>
         </w:tc>
@@ -1721,7 +1484,7 @@
           <w:p>
             <w:pPr/>
             <w:r>
-              <w:t xml:space="preserve">Vì sao bootstrap theo video, không theo segment?</w:t>
+              <w:t xml:space="preserve">Sửa lỗi lệch thời gian giúp được gì?</w:t>
             </w:r>
           </w:p>
         </w:tc>
@@ -1732,7 +1495,7 @@
           <w:p>
             <w:pPr/>
             <w:r>
-              <w:t xml:space="preserve">Quân</w:t>
+              <w:t xml:space="preserve">Huyền</w:t>
             </w:r>
           </w:p>
         </w:tc>
@@ -1743,7 +1506,7 @@
           <w:p>
             <w:pPr/>
             <w:r>
-              <w:t xml:space="preserve">Các segment trong cùng video phụ thuộc nhau (cùng người, cùng cảnh); lấy mẫu theo segment làm khoảng tin cậy hẹp giả tạo.</w:t>
+              <w:t xml:space="preserve">Nhãn khớp với hình ảnh, và cách đọc theo thời gian thật là cách duy nhất dùng được khi chạy trực tiếp từ camera.</w:t>
             </w:r>
           </w:p>
         </w:tc>
@@ -1756,7 +1519,7 @@
           <w:p>
             <w:pPr/>
             <w:r>
-              <w:t xml:space="preserve">Vì sao không huấn luyện lại mô hình nền?</w:t>
+              <w:t xml:space="preserve">Dữ liệu lấy từ đâu?</w:t>
             </w:r>
           </w:p>
         </w:tc>
@@ -1767,7 +1530,7 @@
           <w:p>
             <w:pPr/>
             <w:r>
-              <w:t xml:space="preserve">Huyền</w:t>
+              <w:t xml:space="preserve">Vỹ</w:t>
             </w:r>
           </w:p>
         </w:tc>
@@ -1778,7 +1541,7 @@
           <w:p>
             <w:pPr/>
             <w:r>
-              <w:t xml:space="preserve">Feature của 12.000 video tổng hợp và các bộ dàn dựng đã bị xoá khỏi máy; trích lại mất khoảng 5 giờ cộng thời gian tải. Đây là bước tiếp theo.</w:t>
+              <w:t xml:space="preserve">Bộ OmniFall công khai: 12.000 video dựng bằng máy, 3 bộ diễn viên đóng, 818 video tai nạn thật.</w:t>
             </w:r>
           </w:p>
         </w:tc>
@@ -1791,7 +1554,7 @@
           <w:p>
             <w:pPr/>
             <w:r>
-              <w:t xml:space="preserve">Sửa lỗi fps sao kết quả gần như không đổi?</w:t>
+              <w:t xml:space="preserve">Hệ thống chạy có nhanh không?</w:t>
             </w:r>
           </w:p>
         </w:tc>
@@ -1802,7 +1565,7 @@
           <w:p>
             <w:pPr/>
             <w:r>
-              <w:t xml:space="preserve">Huyền</w:t>
+              <w:t xml:space="preserve">Hoàng Anh</w:t>
             </w:r>
           </w:p>
         </w:tc>
@@ -1813,7 +1576,7 @@
           <w:p>
             <w:pPr/>
             <w:r>
-              <w:t xml:space="preserve">Mô hình nền được huấn luyện với cùng cách lấy mẫu cũ, nên sửa riêng ở test chỉ thay đổi trong mức nhiễu (±0.6). Lợi ích thật là pipeline đúng thời gian, dùng chung cho realtime.</w:t>
+              <w:t xml:space="preserve">Trên card RTX 3070, mỗi lần dự đoán mất khoảng 40–47 mili giây, đủ để chạy trực tiếp.</w:t>
             </w:r>
           </w:p>
         </w:tc>
@@ -1826,7 +1589,7 @@
           <w:p>
             <w:pPr/>
             <w:r>
-              <w:t xml:space="preserve">Lie_down và lying quá ít, sao kiểm chứng được giả thuyết fallen/lying?</w:t>
+              <w:t xml:space="preserve">Bước tiếp theo của nhóm là gì?</w:t>
             </w:r>
           </w:p>
         </w:tc>
@@ -1837,7 +1600,7 @@
           <w:p>
             <w:pPr/>
             <w:r>
-              <w:t xml:space="preserve">Vỹ</w:t>
+              <w:t xml:space="preserve">Hoàng Anh</w:t>
             </w:r>
           </w:p>
         </w:tc>
@@ -1848,112 +1611,7 @@
           <w:p>
             <w:pPr/>
             <w:r>
-              <w:t xml:space="preserve">Đúng, test thật chỉ có 11 và 17 segment. Trên tập tổng hợp có đủ mẫu, rule giảm nhầm fallen sang lying từ 11.3% xuống 9.3%.</w:t>
-            </w:r>
-          </w:p>
-        </w:tc>
-      </w:tr>
-      <w:tr>
-        <w:tc>
-          <w:tcPr>
-            <w:tcW w:w="2493" w:type="dxa"/>
-          </w:tcPr>
-          <w:p>
-            <w:pPr/>
-            <w:r>
-              <w:t xml:space="preserve">Báo động giả 20–69 lần mỗi giờ có quá cao không?</w:t>
-            </w:r>
-          </w:p>
-        </w:tc>
-        <w:tc>
-          <w:tcPr>
-            <w:tcW w:w="1947" w:type="dxa"/>
-          </w:tcPr>
-          <w:p>
-            <w:pPr/>
-            <w:r>
-              <w:t xml:space="preserve">Hoàng Anh</w:t>
-            </w:r>
-          </w:p>
-        </w:tc>
-        <w:tc>
-          <w:tcPr>
-            <w:tcW w:w="4920" w:type="dxa"/>
-          </w:tcPr>
-          <w:p>
-            <w:pPr/>
-            <w:r>
-              <w:t xml:space="preserve">Đo trên clip "fail" ngắn, chuyển động mạnh, không phải camera phòng người già. Ngưỡng báo động chỉnh được; cần đo lại trên camera giám sát thật.</w:t>
-            </w:r>
-          </w:p>
-        </w:tc>
-      </w:tr>
-      <w:tr>
-        <w:tc>
-          <w:tcPr>
-            <w:tcW w:w="2493" w:type="dxa"/>
-          </w:tcPr>
-          <w:p>
-            <w:pPr/>
-            <w:r>
-              <w:t xml:space="preserve">Webcam đã chạy được chưa?</w:t>
-            </w:r>
-          </w:p>
-        </w:tc>
-        <w:tc>
-          <w:tcPr>
-            <w:tcW w:w="1947" w:type="dxa"/>
-          </w:tcPr>
-          <w:p>
-            <w:pPr/>
-            <w:r>
-              <w:t xml:space="preserve">Hoàng Anh</w:t>
-            </w:r>
-          </w:p>
-        </w:tc>
-        <w:tc>
-          <w:tcPr>
-            <w:tcW w:w="4920" w:type="dxa"/>
-          </w:tcPr>
-          <w:p>
-            <w:pPr/>
-            <w:r>
-              <w:t xml:space="preserve">Chưa thử vì máy phát triển không có camera; code webcam chỉ khác nguồn khung hình, phần còn lại đã chạy thật trên video.</w:t>
-            </w:r>
-          </w:p>
-        </w:tc>
-      </w:tr>
-      <w:tr>
-        <w:tc>
-          <w:tcPr>
-            <w:tcW w:w="2493" w:type="dxa"/>
-          </w:tcPr>
-          <w:p>
-            <w:pPr/>
-            <w:r>
-              <w:t xml:space="preserve">Chạy trên máy yếu được không?</w:t>
-            </w:r>
-          </w:p>
-        </w:tc>
-        <w:tc>
-          <w:tcPr>
-            <w:tcW w:w="1947" w:type="dxa"/>
-          </w:tcPr>
-          <w:p>
-            <w:pPr/>
-            <w:r>
-              <w:t xml:space="preserve">Hoàng Anh</w:t>
-            </w:r>
-          </w:p>
-        </w:tc>
-        <w:tc>
-          <w:tcPr>
-            <w:tcW w:w="4920" w:type="dxa"/>
-          </w:tcPr>
-          <w:p>
-            <w:pPr/>
-            <w:r>
-              <w:t xml:space="preserve">Trên RTX 3070 mất 40–47 ms mỗi cửa sổ khi có TTA 3 crop. Tắt TTA giảm khoảng 3 lần khối lượng VideoMAE. Chưa đo trên CPU hay thiết bị nhúng.</w:t>
+              <w:t xml:space="preserve">Huấn luyện lại toàn bộ với dữ liệu đã sửa, thêm các bộ dữ liệu khác, và thử trên camera trong nhà.</w:t>
             </w:r>
           </w:p>
         </w:tc>
@@ -1962,7 +1620,7 @@
     <w:p>
       <w:pPr/>
       <w:r>
-        <w:t xml:space="preserve">Nếu bị hỏi một con số không nhớ, nói "nhóm có trong báo cáo, mục Kiểm định thống kê" và mở báo cáo PDF trong repo omnifall-conditioning.</w:t>
+        <w:t xml:space="preserve">Nếu bị hỏi một con số không nhớ, nói "nhóm có trong báo cáo" và mở báo cáo PDF trong repo omnifall-conditioning.</w:t>
       </w:r>
     </w:p>
     <w:sectPr>

</xml_diff>

<commit_message>
Update presentation script for model and tuning slides
</commit_message>
<xml_diff>
--- a/deliverables/Kich_ban_thuyet_trinh_OmniFall.docx
+++ b/deliverables/Kich_ban_thuyet_trinh_OmniFall.docx
@@ -25,7 +25,7 @@
     <w:p>
       <w:pPr/>
       <w:r>
-        <w:t xml:space="preserve">Kịch bản cho 16 slide tại wunecutee.github.io/omnifall-slides, khoảng 17 phút, chia cho 4 người. Lời nói bám đúng chữ trên từng slide, dùng lời thường, hạn chế thuật ngữ. Phần kỹ thuật nhất (các cách thử, cách chấm điểm, kết quả) do Nguyễn Duy Quân trình bày.</w:t>
+        <w:t xml:space="preserve">Kịch bản cho 19 slide tại wunecutee.github.io/omnifall-slides, khoảng 20 phút, chia cho 4 người. Lời nói bám đúng chữ trên từng slide, dùng lời thường, hạn chế thuật ngữ. Phần kỹ thuật nhất (các cách thử, cách chấm điểm, kết quả) do Nguyễn Duy Quân trình bày.</w:t>
       </w:r>
     </w:p>
     <w:p>
@@ -45,10 +45,10 @@
       </w:tblPr>
       <w:tblGrid>
         <w:gridCol w:w="1111"/>
-        <w:gridCol w:w="2076"/>
+        <w:gridCol w:w="1997"/>
         <w:gridCol w:w="830"/>
-        <w:gridCol w:w="3543"/>
-        <w:gridCol w:w="1800"/>
+        <w:gridCol w:w="3688"/>
+        <w:gridCol w:w="1734"/>
       </w:tblGrid>
       <w:tr>
         <w:trPr>
@@ -68,7 +68,7 @@
         </w:tc>
         <w:tc>
           <w:tcPr>
-            <w:tcW w:w="2076" w:type="dxa"/>
+            <w:tcW w:w="1997" w:type="dxa"/>
             <w:shd w:val="clear" w:color="auto" w:fill="F2F2F2"/>
           </w:tcPr>
           <w:p>
@@ -92,7 +92,7 @@
         </w:tc>
         <w:tc>
           <w:tcPr>
-            <w:tcW w:w="3543" w:type="dxa"/>
+            <w:tcW w:w="3688" w:type="dxa"/>
             <w:shd w:val="clear" w:color="auto" w:fill="F2F2F2"/>
           </w:tcPr>
           <w:p>
@@ -104,7 +104,7 @@
         </w:tc>
         <w:tc>
           <w:tcPr>
-            <w:tcW w:w="1800" w:type="dxa"/>
+            <w:tcW w:w="1734" w:type="dxa"/>
             <w:shd w:val="clear" w:color="auto" w:fill="F2F2F2"/>
           </w:tcPr>
           <w:p>
@@ -129,7 +129,7 @@
         </w:tc>
         <w:tc>
           <w:tcPr>
-            <w:tcW w:w="2076" w:type="dxa"/>
+            <w:tcW w:w="1997" w:type="dxa"/>
           </w:tcPr>
           <w:p>
             <w:pPr/>
@@ -151,7 +151,7 @@
         </w:tc>
         <w:tc>
           <w:tcPr>
-            <w:tcW w:w="3543" w:type="dxa"/>
+            <w:tcW w:w="3688" w:type="dxa"/>
           </w:tcPr>
           <w:p>
             <w:pPr/>
@@ -162,7 +162,7 @@
         </w:tc>
         <w:tc>
           <w:tcPr>
-            <w:tcW w:w="1800" w:type="dxa"/>
+            <w:tcW w:w="1734" w:type="dxa"/>
           </w:tcPr>
           <w:p>
             <w:pPr/>
@@ -186,7 +186,7 @@
         </w:tc>
         <w:tc>
           <w:tcPr>
-            <w:tcW w:w="2076" w:type="dxa"/>
+            <w:tcW w:w="1997" w:type="dxa"/>
           </w:tcPr>
           <w:p>
             <w:pPr/>
@@ -208,7 +208,7 @@
         </w:tc>
         <w:tc>
           <w:tcPr>
-            <w:tcW w:w="3543" w:type="dxa"/>
+            <w:tcW w:w="3688" w:type="dxa"/>
           </w:tcPr>
           <w:p>
             <w:pPr/>
@@ -219,7 +219,7 @@
         </w:tc>
         <w:tc>
           <w:tcPr>
-            <w:tcW w:w="1800" w:type="dxa"/>
+            <w:tcW w:w="1734" w:type="dxa"/>
           </w:tcPr>
           <w:p>
             <w:pPr/>
@@ -243,7 +243,7 @@
         </w:tc>
         <w:tc>
           <w:tcPr>
-            <w:tcW w:w="2076" w:type="dxa"/>
+            <w:tcW w:w="1997" w:type="dxa"/>
           </w:tcPr>
           <w:p>
             <w:pPr/>
@@ -259,29 +259,29 @@
           <w:p>
             <w:pPr/>
             <w:r>
-              <w:t xml:space="preserve">10–13</w:t>
-            </w:r>
-          </w:p>
-        </w:tc>
-        <w:tc>
-          <w:tcPr>
-            <w:tcW w:w="3543" w:type="dxa"/>
-          </w:tcPr>
-          <w:p>
-            <w:pPr/>
-            <w:r>
-              <w:t xml:space="preserve">Các cách thử, cách chấm điểm, kết quả</w:t>
-            </w:r>
-          </w:p>
-        </w:tc>
-        <w:tc>
-          <w:tcPr>
-            <w:tcW w:w="1800" w:type="dxa"/>
-          </w:tcPr>
-          <w:p>
-            <w:pPr/>
-            <w:r>
-              <w:t xml:space="preserve">khoảng 5 phút 30</w:t>
+              <w:t xml:space="preserve">10–16</w:t>
+            </w:r>
+          </w:p>
+        </w:tc>
+        <w:tc>
+          <w:tcPr>
+            <w:tcW w:w="3688" w:type="dxa"/>
+          </w:tcPr>
+          <w:p>
+            <w:pPr/>
+            <w:r>
+              <w:t xml:space="preserve">Mô hình, tune, chọn phương pháp, chấm điểm, kết quả</w:t>
+            </w:r>
+          </w:p>
+        </w:tc>
+        <w:tc>
+          <w:tcPr>
+            <w:tcW w:w="1734" w:type="dxa"/>
+          </w:tcPr>
+          <w:p>
+            <w:pPr/>
+            <w:r>
+              <w:t xml:space="preserve">khoảng 8 phút 30</w:t>
             </w:r>
           </w:p>
         </w:tc>
@@ -300,7 +300,7 @@
         </w:tc>
         <w:tc>
           <w:tcPr>
-            <w:tcW w:w="2076" w:type="dxa"/>
+            <w:tcW w:w="1997" w:type="dxa"/>
           </w:tcPr>
           <w:p>
             <w:pPr/>
@@ -316,13 +316,13 @@
           <w:p>
             <w:pPr/>
             <w:r>
-              <w:t xml:space="preserve">14–16</w:t>
-            </w:r>
-          </w:p>
-        </w:tc>
-        <w:tc>
-          <w:tcPr>
-            <w:tcW w:w="3543" w:type="dxa"/>
+              <w:t xml:space="preserve">17–19</w:t>
+            </w:r>
+          </w:p>
+        </w:tc>
+        <w:tc>
+          <w:tcPr>
+            <w:tcW w:w="3688" w:type="dxa"/>
           </w:tcPr>
           <w:p>
             <w:pPr/>
@@ -333,7 +333,7 @@
         </w:tc>
         <w:tc>
           <w:tcPr>
-            <w:tcW w:w="1800" w:type="dxa"/>
+            <w:tcW w:w="1734" w:type="dxa"/>
           </w:tcPr>
           <w:p>
             <w:pPr/>
@@ -354,7 +354,7 @@
         </w:tc>
         <w:tc>
           <w:tcPr>
-            <w:tcW w:w="2076" w:type="dxa"/>
+            <w:tcW w:w="1997" w:type="dxa"/>
           </w:tcPr>
           <w:p>
             <w:pPr/>
@@ -373,7 +373,7 @@
         </w:tc>
         <w:tc>
           <w:tcPr>
-            <w:tcW w:w="3543" w:type="dxa"/>
+            <w:tcW w:w="3688" w:type="dxa"/>
           </w:tcPr>
           <w:p>
             <w:pPr/>
@@ -384,7 +384,7 @@
         </w:tc>
         <w:tc>
           <w:tcPr>
-            <w:tcW w:w="1800" w:type="dxa"/>
+            <w:tcW w:w="1734" w:type="dxa"/>
           </w:tcPr>
           <w:p>
             <w:pPr/>
@@ -526,7 +526,7 @@
         </w:numPr>
       </w:pPr>
       <w:r>
-        <w:t xml:space="preserve">☐ Mỗi người tập phần của mình có bấm giờ; tổng không quá 18 phút.</w:t>
+        <w:t xml:space="preserve">☐ Mỗi người tập phần của mình có bấm giờ; tổng không quá 21 phút.</w:t>
       </w:r>
     </w:p>
     <w:p>
@@ -922,13 +922,13 @@
         <w:pStyle w:val="Heading2"/>
       </w:pPr>
       <w:r>
-        <w:t xml:space="preserve">Phần 3 — Nguyễn Duy Quân (slide 10–13, khoảng 5 phút 30)</w:t>
-      </w:r>
-    </w:p>
-    <w:p>
-      <w:pPr/>
-      <w:r>
-        <w:t xml:space="preserve">Mục tiêu: đây là phần kỹ thuật nặng nhất. Người nghe cần hiểu nhóm đã thử những cách nào, vì sao chấm điểm như camera thật mới công bằng, và hệ thống mới tốt hơn bao nhiêu. Giọng chậm lại ở slide 11.</w:t>
+        <w:t xml:space="preserve">Phần 3 — Nguyễn Duy Quân (slide 10–16, khoảng 8 phút 30)</w:t>
+      </w:r>
+    </w:p>
+    <w:p>
+      <w:pPr/>
+      <w:r>
+        <w:t xml:space="preserve">Mục tiêu: đây là phần kỹ thuật nặng nhất. Người nghe cần hiểu nhóm đã thử những cách nào, vì sao chấm điểm như camera thật mới công bằng, và hệ thống mới tốt hơn bao nhiêu. Ba slide 11–13 (mô hình, tune, chọn phương pháp) là điểm nhấn: nói chắc, chỉ vào số. Giọng chậm lại ở slide 14.</w:t>
       </w:r>
     </w:p>
     <w:p>
@@ -1024,7 +1024,7 @@
         <w:pStyle w:val="Heading3"/>
       </w:pPr>
       <w:r>
-        <w:t xml:space="preserve">Slide 11 — Chấm điểm như camera thật mới là cách đánh giá công bằng (khoảng 1 phút 30) — slide quan trọng nhất</w:t>
+        <w:t xml:space="preserve">Slide 11 — Mô hình: VideoMAE đọc video, một Transformer nhỏ quyết định hành động (khoảng 1 phút)</w:t>
       </w:r>
     </w:p>
     <w:p>
@@ -1036,6 +1036,152 @@
         <w:t xml:space="preserve">Thao tác:</w:t>
       </w:r>
       <w:r>
+        <w:t xml:space="preserve"> đi theo 4 ô từ trái sang phải theo mũi tên, rồi chỉ 3 con số bên dưới.</w:t>
+      </w:r>
+    </w:p>
+    <w:p>
+      <w:pPr>
+        <w:pStyle w:val="Quote"/>
+      </w:pPr>
+      <w:r>
+        <w:t xml:space="preserve">"Đây là toàn bộ hệ thống. Video được lấy 7.5 ảnh mỗi giây, theo đúng thời gian thật. VideoMAE là một mô hình lớn đã học sẵn cách hiểu video; nhóm giữ nguyên nó, dùng để biến mỗi cụm 16 ảnh thành 768 con số, cứ 0.13 giây một lần.</w:t>
+      </w:r>
+    </w:p>
+    <w:p>
+      <w:pPr>
+        <w:pStyle w:val="Quote"/>
+      </w:pPr>
+      <w:r>
+        <w:t xml:space="preserve">Phần nhóm thật sự huấn luyện là ô xanh dương: một Transformer nhỏ, 2 lớp, 8 đầu chú ý. Nó đọc 18 vector liên tiếp, tức khoảng 4.4 giây, và chấm điểm 10 hành động. Cuối cùng là quy tắc 'sau ngã là nằm' và bộ báo động.</w:t>
+      </w:r>
+    </w:p>
+    <w:p>
+      <w:pPr>
+        <w:pStyle w:val="Quote"/>
+      </w:pPr>
+      <w:r>
+        <w:t xml:space="preserve">Toàn bộ chạy 40 đến 47 mili giây mỗi lần trên RTX 3070, đủ cho camera trực tiếp. Phần quy tắc không có tham số nào để học, nên không thể học vẹt dữ liệu."</w:t>
+      </w:r>
+    </w:p>
+    <w:p>
+      <w:pPr>
+        <w:pStyle w:val="Heading3"/>
+      </w:pPr>
+      <w:r>
+        <w:t xml:space="preserve">Slide 12 — Tune có hệ thống: thử 225 cấu hình (khoảng 1 phút 15)</w:t>
+      </w:r>
+    </w:p>
+    <w:p>
+      <w:pPr/>
+      <w:r>
+        <w:rPr>
+          <w:b/>
+        </w:rPr>
+        <w:t xml:space="preserve">Thao tác:</w:t>
+      </w:r>
+      <w:r>
+        <w:t xml:space="preserve"> chỉ bảng màu từ góc tối trên trái xuống ô viền trắng dưới trái; rồi sang 2 ô bên phải.</w:t>
+      </w:r>
+    </w:p>
+    <w:p>
+      <w:pPr>
+        <w:pStyle w:val="Quote"/>
+      </w:pPr>
+      <w:r>
+        <w:t xml:space="preserve">"Nhóm không chọn tham số theo cảm tính. Bảng màu này là 15 cấu hình khi học thêm video thật: hàng là tốc độ học, cột là mức ép mô hình giữ gần bản gốc. Ô càng sáng điểm càng cao. Điểm này đo trên 81 video kiểm tra riêng, không phải 572 video thi.</w:t>
+      </w:r>
+    </w:p>
+    <w:p>
+      <w:pPr>
+        <w:pStyle w:val="Quote"/>
+      </w:pPr>
+      <w:r>
+        <w:t xml:space="preserve">Xu hướng rất rõ: học nhanh hơn và cho mô hình tự do hơn thì tốt hơn, từ 54 lên 62. Nhóm chọn ô tốt nhất rồi huấn luyện lại 3 lần với 3 hạt giống ngẫu nhiên để chắc kết quả ổn định.</w:t>
+      </w:r>
+    </w:p>
+    <w:p>
+      <w:pPr>
+        <w:pStyle w:val="Quote"/>
+      </w:pPr>
+      <w:r>
+        <w:t xml:space="preserve">Công thức huấn luyện: AdamW, 30 vòng, lô 32, làm mềm nhãn để mô hình bớt tự tin thái quá, mỗi vòng cắt ngẫu nhiên theo thời gian và trái, giữa, phải để mô hình không học thuộc. Cộng cả quy tắc, HMM và chạy như camera, nhóm đã thử tổng cộng 225 cấu hình."</w:t>
+      </w:r>
+    </w:p>
+    <w:p>
+      <w:pPr>
+        <w:pStyle w:val="Heading3"/>
+      </w:pPr>
+      <w:r>
+        <w:t xml:space="preserve">Slide 13 — Vì sao chọn "học thêm video thật + quy tắc" (khoảng 1 phút 15)</w:t>
+      </w:r>
+    </w:p>
+    <w:p>
+      <w:pPr/>
+      <w:r>
+        <w:rPr>
+          <w:b/>
+        </w:rPr>
+        <w:t xml:space="preserve">Thao tác:</w:t>
+      </w:r>
+      <w:r>
+        <w:t xml:space="preserve"> đọc bảng từng dòng; dừng ở cột "Đang ngã" của HMM và Hybrid; kết thúc ở dòng xanh.</w:t>
+      </w:r>
+    </w:p>
+    <w:p>
+      <w:pPr>
+        <w:pStyle w:val="Quote"/>
+      </w:pPr>
+      <w:r>
+        <w:t xml:space="preserve">"Cùng một mô hình đã học thêm, nhóm thử gắn từng cách xử lý phía sau, khi chạy như camera.</w:t>
+      </w:r>
+    </w:p>
+    <w:p>
+      <w:pPr>
+        <w:pStyle w:val="Quote"/>
+      </w:pPr>
+      <w:r>
+        <w:t xml:space="preserve">HMM và Hybrid đều nâng điểm 'đã ngã', nhưng cái giá là mất 5 đến 8 điểm 'đang ngã': chúng vội đoán người đã nằm trong khi người đó còn đang ngã. Hybrid còn cần huấn luyện thêm.</w:t>
+      </w:r>
+    </w:p>
+    <w:p>
+      <w:pPr>
+        <w:pStyle w:val="Quote"/>
+      </w:pPr>
+      <w:r>
+        <w:t xml:space="preserve">Quy tắc là cách duy nhất tăng cả ba điểm cùng lúc, không cần huấn luyện, chạy gần như không tốn thời gian. Và so với hệ thống cũ, tổng hợp lại ta tăng 12.4, 16.5 và 12.5 điểm. Đó là lý do nhóm chọn cấu hình này."</w:t>
+      </w:r>
+    </w:p>
+    <w:p>
+      <w:pPr>
+        <w:pStyle w:val="Quote"/>
+      </w:pPr>
+      <w:r>
+        <w:rPr>
+          <w:b/>
+        </w:rPr>
+        <w:t xml:space="preserve">Nếu bị hỏi:</w:t>
+      </w:r>
+      <w:r>
+        <w:t xml:space="preserve"> "Hybrid có 'đã ngã' cao hơn (45.7)?" → "Đúng, cao hơn 1.4 điểm, nhưng mất 6 điểm 'đang ngã' và 3 điểm gộp, lại phải huấn luyện. Nhóm chọn cách cân bằng và đơn giản hơn."</w:t>
+      </w:r>
+    </w:p>
+    <w:p>
+      <w:pPr>
+        <w:pStyle w:val="Heading3"/>
+      </w:pPr>
+      <w:r>
+        <w:t xml:space="preserve">Slide 14 — Chấm điểm như camera thật mới là cách đánh giá công bằng (khoảng 1 phút 30) — slide quan trọng nhất</w:t>
+      </w:r>
+    </w:p>
+    <w:p>
+      <w:pPr/>
+      <w:r>
+        <w:rPr>
+          <w:b/>
+        </w:rPr>
+        <w:t xml:space="preserve">Thao tác:</w:t>
+      </w:r>
+      <w:r>
         <w:t xml:space="preserve"> chỉ ô trái trước, dừng ở con số 51.3; sau đó sang ô phải viền xanh.</w:t>
       </w:r>
     </w:p>
@@ -1060,7 +1206,7 @@
         <w:pStyle w:val="Heading3"/>
       </w:pPr>
       <w:r>
-        <w:t xml:space="preserve">Slide 12 — Huấn luyện thêm trên video thật giúp tăng mạnh nhất (khoảng 1 phút 15)</w:t>
+        <w:t xml:space="preserve">Slide 15 — Huấn luyện thêm trên video thật giúp tăng mạnh nhất (khoảng 1 phút 15)</w:t>
       </w:r>
     </w:p>
     <w:p>
@@ -1096,7 +1242,7 @@
         <w:pStyle w:val="Heading3"/>
       </w:pPr>
       <w:r>
-        <w:t xml:space="preserve">Slide 13 — Chạy như camera: hệ thống mới hơn hệ thống cũ 12–17 điểm (khoảng 1 phút 30)</w:t>
+        <w:t xml:space="preserve">Slide 16 — Chạy như camera: hệ thống mới hơn hệ thống cũ 12–17 điểm (khoảng 1 phút 30)</w:t>
       </w:r>
     </w:p>
     <w:p>
@@ -1144,7 +1290,7 @@
         <w:pStyle w:val="Heading2"/>
       </w:pPr>
       <w:r>
-        <w:t xml:space="preserve">Phần 4 — Vũ Hoàng Anh (slide 14–16, khoảng 3 phút)</w:t>
+        <w:t xml:space="preserve">Phần 4 — Vũ Hoàng Anh (slide 17–19, khoảng 3 phút)</w:t>
       </w:r>
     </w:p>
     <w:p>
@@ -1158,7 +1304,7 @@
         <w:pStyle w:val="Heading3"/>
       </w:pPr>
       <w:r>
-        <w:t xml:space="preserve">Slide 14 — Báo động: ở cùng số lần báo nhầm, hệ thống mới bắt được nhiều ca ngã hơn (khoảng 1 phút)</w:t>
+        <w:t xml:space="preserve">Slide 17 — Báo động: ở cùng số lần báo nhầm, hệ thống mới bắt được nhiều ca ngã hơn (khoảng 1 phút)</w:t>
       </w:r>
     </w:p>
     <w:p>
@@ -1194,7 +1340,7 @@
         <w:pStyle w:val="Heading3"/>
       </w:pPr>
       <w:r>
-        <w:t xml:space="preserve">Slide 15 — Kiểm chứng thống kê: cải thiện là thật (khoảng 1 phút)</w:t>
+        <w:t xml:space="preserve">Slide 18 — Kiểm chứng thống kê: cải thiện là thật (khoảng 1 phút)</w:t>
       </w:r>
     </w:p>
     <w:p>
@@ -1230,7 +1376,7 @@
         <w:pStyle w:val="Heading3"/>
       </w:pPr>
       <w:r>
-        <w:t xml:space="preserve">Slide 16 — Kết luận (khoảng 1 phút)</w:t>
+        <w:t xml:space="preserve">Slide 19 — Kết luận (khoảng 1 phút)</w:t>
       </w:r>
     </w:p>
     <w:p>

</xml_diff>

<commit_message>
Update presentation script for model-focused deck
</commit_message>
<xml_diff>
--- a/deliverables/Kich_ban_thuyet_trinh_OmniFall.docx
+++ b/deliverables/Kich_ban_thuyet_trinh_OmniFall.docx
@@ -25,7 +25,7 @@
     <w:p>
       <w:pPr/>
       <w:r>
-        <w:t xml:space="preserve">Kịch bản cho 19 slide tại wunecutee.github.io/omnifall-slides, khoảng 20 phút, chia cho 4 người. Lời nói bám đúng chữ trên từng slide, dùng lời thường, hạn chế thuật ngữ. Phần kỹ thuật nhất (các cách thử, cách chấm điểm, kết quả) do Nguyễn Duy Quân trình bày.</w:t>
+        <w:t xml:space="preserve">Kịch bản cho 16 slide tại wunecutee.github.io/omnifall-slides, khoảng 18 phút, chia cho 4 người. Trọng tâm là xử lý dữ liệu và mô hình: kiến trúc, fine-tune, tối ưu tham số, tối ưu tốc độ. Phần mô hình do Nguyễn Duy Quân trình bày.</w:t>
       </w:r>
     </w:p>
     <w:p>
@@ -45,10 +45,10 @@
       </w:tblPr>
       <w:tblGrid>
         <w:gridCol w:w="1111"/>
-        <w:gridCol w:w="1997"/>
+        <w:gridCol w:w="1799"/>
         <w:gridCol w:w="830"/>
-        <w:gridCol w:w="3688"/>
-        <w:gridCol w:w="1734"/>
+        <w:gridCol w:w="4055"/>
+        <w:gridCol w:w="1565"/>
       </w:tblGrid>
       <w:tr>
         <w:trPr>
@@ -68,7 +68,7 @@
         </w:tc>
         <w:tc>
           <w:tcPr>
-            <w:tcW w:w="1997" w:type="dxa"/>
+            <w:tcW w:w="1799" w:type="dxa"/>
             <w:shd w:val="clear" w:color="auto" w:fill="F2F2F2"/>
           </w:tcPr>
           <w:p>
@@ -92,7 +92,7 @@
         </w:tc>
         <w:tc>
           <w:tcPr>
-            <w:tcW w:w="3688" w:type="dxa"/>
+            <w:tcW w:w="4055" w:type="dxa"/>
             <w:shd w:val="clear" w:color="auto" w:fill="F2F2F2"/>
           </w:tcPr>
           <w:p>
@@ -104,7 +104,7 @@
         </w:tc>
         <w:tc>
           <w:tcPr>
-            <w:tcW w:w="1734" w:type="dxa"/>
+            <w:tcW w:w="1565" w:type="dxa"/>
             <w:shd w:val="clear" w:color="auto" w:fill="F2F2F2"/>
           </w:tcPr>
           <w:p>
@@ -129,7 +129,7 @@
         </w:tc>
         <w:tc>
           <w:tcPr>
-            <w:tcW w:w="1997" w:type="dxa"/>
+            <w:tcW w:w="1799" w:type="dxa"/>
           </w:tcPr>
           <w:p>
             <w:pPr/>
@@ -145,29 +145,29 @@
           <w:p>
             <w:pPr/>
             <w:r>
-              <w:t xml:space="preserve">1–5</w:t>
-            </w:r>
-          </w:p>
-        </w:tc>
-        <w:tc>
-          <w:tcPr>
-            <w:tcW w:w="3688" w:type="dxa"/>
-          </w:tcPr>
-          <w:p>
-            <w:pPr/>
-            <w:r>
-              <w:t xml:space="preserve">Mở đầu, clip ví dụ, bài toán, ý tưởng, dữ liệu</w:t>
-            </w:r>
-          </w:p>
-        </w:tc>
-        <w:tc>
-          <w:tcPr>
-            <w:tcW w:w="1734" w:type="dxa"/>
-          </w:tcPr>
-          <w:p>
-            <w:pPr/>
-            <w:r>
-              <w:t xml:space="preserve">khoảng 4 phút 30</w:t>
+              <w:t xml:space="preserve">1–2</w:t>
+            </w:r>
+          </w:p>
+        </w:tc>
+        <w:tc>
+          <w:tcPr>
+            <w:tcW w:w="4055" w:type="dxa"/>
+          </w:tcPr>
+          <w:p>
+            <w:pPr/>
+            <w:r>
+              <w:t xml:space="preserve">Mở đầu, quy trình xử lý dữ liệu 12 bước</w:t>
+            </w:r>
+          </w:p>
+        </w:tc>
+        <w:tc>
+          <w:tcPr>
+            <w:tcW w:w="1565" w:type="dxa"/>
+          </w:tcPr>
+          <w:p>
+            <w:pPr/>
+            <w:r>
+              <w:t xml:space="preserve">khoảng 2 phút 30</w:t>
             </w:r>
           </w:p>
         </w:tc>
@@ -186,7 +186,7 @@
         </w:tc>
         <w:tc>
           <w:tcPr>
-            <w:tcW w:w="1997" w:type="dxa"/>
+            <w:tcW w:w="1799" w:type="dxa"/>
           </w:tcPr>
           <w:p>
             <w:pPr/>
@@ -202,29 +202,29 @@
           <w:p>
             <w:pPr/>
             <w:r>
-              <w:t xml:space="preserve">6–9</w:t>
-            </w:r>
-          </w:p>
-        </w:tc>
-        <w:tc>
-          <w:tcPr>
-            <w:tcW w:w="3688" w:type="dxa"/>
-          </w:tcPr>
-          <w:p>
-            <w:pPr/>
-            <w:r>
-              <w:t xml:space="preserve">Xử lý dữ liệu và 3 lỗi đã sửa</w:t>
-            </w:r>
-          </w:p>
-        </w:tc>
-        <w:tc>
-          <w:tcPr>
-            <w:tcW w:w="1734" w:type="dxa"/>
-          </w:tcPr>
-          <w:p>
-            <w:pPr/>
-            <w:r>
-              <w:t xml:space="preserve">khoảng 4 phút</w:t>
+              <w:t xml:space="preserve">3–5</w:t>
+            </w:r>
+          </w:p>
+        </w:tc>
+        <w:tc>
+          <w:tcPr>
+            <w:tcW w:w="4055" w:type="dxa"/>
+          </w:tcPr>
+          <w:p>
+            <w:pPr/>
+            <w:r>
+              <w:t xml:space="preserve">Hai lỗi dữ liệu đã sửa, các hướng tiếp cận</w:t>
+            </w:r>
+          </w:p>
+        </w:tc>
+        <w:tc>
+          <w:tcPr>
+            <w:tcW w:w="1565" w:type="dxa"/>
+          </w:tcPr>
+          <w:p>
+            <w:pPr/>
+            <w:r>
+              <w:t xml:space="preserve">khoảng 3 phút</w:t>
             </w:r>
           </w:p>
         </w:tc>
@@ -243,7 +243,7 @@
         </w:tc>
         <w:tc>
           <w:tcPr>
-            <w:tcW w:w="1997" w:type="dxa"/>
+            <w:tcW w:w="1799" w:type="dxa"/>
           </w:tcPr>
           <w:p>
             <w:pPr/>
@@ -259,29 +259,29 @@
           <w:p>
             <w:pPr/>
             <w:r>
-              <w:t xml:space="preserve">10–16</w:t>
-            </w:r>
-          </w:p>
-        </w:tc>
-        <w:tc>
-          <w:tcPr>
-            <w:tcW w:w="3688" w:type="dxa"/>
-          </w:tcPr>
-          <w:p>
-            <w:pPr/>
-            <w:r>
-              <w:t xml:space="preserve">Mô hình, tune, chọn phương pháp, chấm điểm, kết quả</w:t>
-            </w:r>
-          </w:p>
-        </w:tc>
-        <w:tc>
-          <w:tcPr>
-            <w:tcW w:w="1734" w:type="dxa"/>
-          </w:tcPr>
-          <w:p>
-            <w:pPr/>
-            <w:r>
-              <w:t xml:space="preserve">khoảng 8 phút 30</w:t>
+              <w:t xml:space="preserve">6–10</w:t>
+            </w:r>
+          </w:p>
+        </w:tc>
+        <w:tc>
+          <w:tcPr>
+            <w:tcW w:w="4055" w:type="dxa"/>
+          </w:tcPr>
+          <w:p>
+            <w:pPr/>
+            <w:r>
+              <w:t xml:space="preserve">Kiến trúc, fine-tune, tối ưu tham số, tốc độ, chọn phương pháp</w:t>
+            </w:r>
+          </w:p>
+        </w:tc>
+        <w:tc>
+          <w:tcPr>
+            <w:tcW w:w="1565" w:type="dxa"/>
+          </w:tcPr>
+          <w:p>
+            <w:pPr/>
+            <w:r>
+              <w:t xml:space="preserve">khoảng 6 phút 30</w:t>
             </w:r>
           </w:p>
         </w:tc>
@@ -300,7 +300,7 @@
         </w:tc>
         <w:tc>
           <w:tcPr>
-            <w:tcW w:w="1997" w:type="dxa"/>
+            <w:tcW w:w="1799" w:type="dxa"/>
           </w:tcPr>
           <w:p>
             <w:pPr/>
@@ -316,29 +316,29 @@
           <w:p>
             <w:pPr/>
             <w:r>
-              <w:t xml:space="preserve">17–19</w:t>
-            </w:r>
-          </w:p>
-        </w:tc>
-        <w:tc>
-          <w:tcPr>
-            <w:tcW w:w="3688" w:type="dxa"/>
-          </w:tcPr>
-          <w:p>
-            <w:pPr/>
-            <w:r>
-              <w:t xml:space="preserve">Báo động, kiểm chứng, kết luận</w:t>
-            </w:r>
-          </w:p>
-        </w:tc>
-        <w:tc>
-          <w:tcPr>
-            <w:tcW w:w="1734" w:type="dxa"/>
-          </w:tcPr>
-          <w:p>
-            <w:pPr/>
-            <w:r>
-              <w:t xml:space="preserve">khoảng 3 phút</w:t>
+              <w:t xml:space="preserve">11–16</w:t>
+            </w:r>
+          </w:p>
+        </w:tc>
+        <w:tc>
+          <w:tcPr>
+            <w:tcW w:w="4055" w:type="dxa"/>
+          </w:tcPr>
+          <w:p>
+            <w:pPr/>
+            <w:r>
+              <w:t xml:space="preserve">Cách chấm điểm, kết quả, báo động, kiểm chứng, kết luận</w:t>
+            </w:r>
+          </w:p>
+        </w:tc>
+        <w:tc>
+          <w:tcPr>
+            <w:tcW w:w="1565" w:type="dxa"/>
+          </w:tcPr>
+          <w:p>
+            <w:pPr/>
+            <w:r>
+              <w:t xml:space="preserve">khoảng 6 phút</w:t>
             </w:r>
           </w:p>
         </w:tc>
@@ -354,7 +354,7 @@
         </w:tc>
         <w:tc>
           <w:tcPr>
-            <w:tcW w:w="1997" w:type="dxa"/>
+            <w:tcW w:w="1799" w:type="dxa"/>
           </w:tcPr>
           <w:p>
             <w:pPr/>
@@ -373,7 +373,7 @@
         </w:tc>
         <w:tc>
           <w:tcPr>
-            <w:tcW w:w="3688" w:type="dxa"/>
+            <w:tcW w:w="4055" w:type="dxa"/>
           </w:tcPr>
           <w:p>
             <w:pPr/>
@@ -384,7 +384,7 @@
         </w:tc>
         <w:tc>
           <w:tcPr>
-            <w:tcW w:w="1734" w:type="dxa"/>
+            <w:tcW w:w="1565" w:type="dxa"/>
           </w:tcPr>
           <w:p>
             <w:pPr/>
@@ -396,9 +396,11 @@
       </w:tr>
     </w:tbl>
     <w:p>
-      <w:pPr/>
-      <w:r>
-        <w:t xml:space="preserve">Câu chuyển lời giữa các phần:</w:t>
+      <w:pPr>
+        <w:pStyle w:val="Heading2"/>
+      </w:pPr>
+      <w:r>
+        <w:t xml:space="preserve">Chuẩn bị trước buổi</w:t>
       </w:r>
     </w:p>
     <w:p>
@@ -410,13 +412,7 @@
         </w:numPr>
       </w:pPr>
       <w:r>
-        <w:rPr>
-          <w:b/>
-        </w:rPr>
-        <w:t xml:space="preserve">Vỹ → Huyền:</w:t>
-      </w:r>
-      <w:r>
-        <w:t xml:space="preserve"> "Có dữ liệu rồi, nhưng dữ liệu có sạch không? Phần này Huyền sẽ trình bày."</w:t>
+        <w:t xml:space="preserve">☐ Mở https://wunecutee.github.io/omnifall-slides/ bằng Chrome hoặc Edge, nhấn F11. Phím → hoặc Space sang slide, ← lùi lại. Thêm #slide-6 vào cuối link để nhảy thẳng tới phần của Quân.</w:t>
       </w:r>
     </w:p>
     <w:p>
@@ -428,13 +424,7 @@
         </w:numPr>
       </w:pPr>
       <w:r>
-        <w:rPr>
-          <w:b/>
-        </w:rPr>
-        <w:t xml:space="preserve">Huyền → Quân:</w:t>
-      </w:r>
-      <w:r>
-        <w:t xml:space="preserve"> "Dữ liệu đã sạch và cách chấm điểm đã ổn định. Câu hỏi tiếp theo là cách nào thật sự giúp kết quả tốt hơn. Mời Quân."</w:t>
+        <w:t xml:space="preserve">☐ Chép file index.html và thư mục media (repo omnifall-slides) vào USB làm bản dự phòng.</w:t>
       </w:r>
     </w:p>
     <w:p>
@@ -446,13 +436,7 @@
         </w:numPr>
       </w:pPr>
       <w:r>
-        <w:rPr>
-          <w:b/>
-        </w:rPr>
-        <w:t xml:space="preserve">Quân → Hoàng Anh:</w:t>
-      </w:r>
-      <w:r>
-        <w:t xml:space="preserve"> "Điểm số là một chuyện; với người dùng, điều quan trọng là hệ thống báo động có đáng tin không. Mời Hoàng Anh."</w:t>
+        <w:t xml:space="preserve">☐ Kiểm tra video ở slide 4 tự chạy.</w:t>
       </w:r>
     </w:p>
     <w:p>
@@ -464,21 +448,7 @@
         </w:numPr>
       </w:pPr>
       <w:r>
-        <w:rPr>
-          <w:b/>
-        </w:rPr>
-        <w:t xml:space="preserve">Hoàng Anh → hỏi đáp:</w:t>
-      </w:r>
-      <w:r>
-        <w:t xml:space="preserve"> "Phần trình bày của nhóm đến đây là hết. Nhóm xin lắng nghe câu hỏi của thầy cô."</w:t>
-      </w:r>
-    </w:p>
-    <w:p>
-      <w:pPr>
-        <w:pStyle w:val="Heading2"/>
-      </w:pPr>
-      <w:r>
-        <w:t xml:space="preserve">Chuẩn bị trước buổi</w:t>
+        <w:t xml:space="preserve">☐ Quân thuộc các con số mô hình: 86M + 14.8M tham số, 768 chiều, 18 vector ≈ 4.4 giây, 24.7 → 44.1, 225 cấu hình, 2.9 ms/ảnh, 40–47 ms/lần.</w:t>
       </w:r>
     </w:p>
     <w:p>
@@ -486,59 +456,11 @@
         <w:pStyle w:val="ListParagraph"/>
         <w:numPr>
           <w:ilvl w:val="0"/>
-          <w:numId w:val="3"/>
+          <w:numId w:val="2"/>
         </w:numPr>
       </w:pPr>
       <w:r>
-        <w:t xml:space="preserve">☐ Mở https://wunecutee.github.io/omnifall-slides/ bằng Chrome hoặc Edge, nhấn F11. Phím → hoặc Space sang slide, ← lùi lại. Thêm #slide-10 vào cuối link để nhảy thẳng tới phần của Quân.</w:t>
-      </w:r>
-    </w:p>
-    <w:p>
-      <w:pPr>
-        <w:pStyle w:val="ListParagraph"/>
-        <w:numPr>
-          <w:ilvl w:val="0"/>
-          <w:numId w:val="3"/>
-        </w:numPr>
-      </w:pPr>
-      <w:r>
-        <w:t xml:space="preserve">☐ Chép file index.html và thư mục media (repo omnifall-slides) vào USB làm bản dự phòng khi không có mạng.</w:t>
-      </w:r>
-    </w:p>
-    <w:p>
-      <w:pPr>
-        <w:pStyle w:val="ListParagraph"/>
-        <w:numPr>
-          <w:ilvl w:val="0"/>
-          <w:numId w:val="3"/>
-        </w:numPr>
-      </w:pPr>
-      <w:r>
-        <w:t xml:space="preserve">☐ Kiểm tra video ở slide 2 và slide 8 tự chạy (video không có tiếng).</w:t>
-      </w:r>
-    </w:p>
-    <w:p>
-      <w:pPr>
-        <w:pStyle w:val="ListParagraph"/>
-        <w:numPr>
-          <w:ilvl w:val="0"/>
-          <w:numId w:val="3"/>
-        </w:numPr>
-      </w:pPr>
-      <w:r>
-        <w:t xml:space="preserve">☐ Mỗi người tập phần của mình có bấm giờ; tổng không quá 21 phút.</w:t>
-      </w:r>
-    </w:p>
-    <w:p>
-      <w:pPr>
-        <w:pStyle w:val="ListParagraph"/>
-        <w:numPr>
-          <w:ilvl w:val="0"/>
-          <w:numId w:val="3"/>
-        </w:numPr>
-      </w:pPr>
-      <w:r>
-        <w:t xml:space="preserve">☐ Cả nhóm thuộc 4 con số: 24.7 (điểm ban đầu), 154 (video bị lệch thời gian), 44.3 / 62.0 / 69.3 (hệ thống mới), 12–17 điểm (mức tăng so với hệ thống cũ).</w:t>
+        <w:t xml:space="preserve">☐ Cả nhóm thuộc kết quả cuối: 44.3 / 62.0 / 69.3, cao hơn hệ thống cũ 12–17 điểm.</w:t>
       </w:r>
     </w:p>
     <w:p>
@@ -546,13 +468,7 @@
         <w:pStyle w:val="Heading2"/>
       </w:pPr>
       <w:r>
-        <w:t xml:space="preserve">Phần 1 — Phạm Tuấn Vỹ (slide 1–5, khoảng 4 phút 30)</w:t>
-      </w:r>
-    </w:p>
-    <w:p>
-      <w:pPr/>
-      <w:r>
-        <w:t xml:space="preserve">Mục tiêu: người nghe hiểu bài toán là gì, vì sao quan trọng, và ý tưởng chính của nhóm.</w:t>
+        <w:t xml:space="preserve">Phần 1 — Phạm Tuấn Vỹ (slide 1–2, khoảng 2 phút 30)</w:t>
       </w:r>
     </w:p>
     <w:p>
@@ -560,7 +476,7 @@
         <w:pStyle w:val="Heading3"/>
       </w:pPr>
       <w:r>
-        <w:t xml:space="preserve">Slide 1 — Mở đầu (khoảng 40 giây)</w:t>
+        <w:t xml:space="preserve">Slide 1 — Mở đầu (khoảng 1 phút)</w:t>
       </w:r>
     </w:p>
     <w:p>
@@ -572,7 +488,7 @@
         <w:t xml:space="preserve">Thao tác:</w:t>
       </w:r>
       <w:r>
-        <w:t xml:space="preserve"> chỉ vào câu hỏi ở giữa slide.</w:t>
+        <w:t xml:space="preserve"> chỉ câu hỏi ở giữa, rồi dải thời gian màu bên dưới.</w:t>
       </w:r>
     </w:p>
     <w:p>
@@ -588,7 +504,15 @@
         <w:pStyle w:val="Quote"/>
       </w:pPr>
       <w:r>
-        <w:t xml:space="preserve">Câu hỏi của nhóm rất đơn giản: camera nhìn thấy một người ngã, làm sao để máy tự nhận ra người đó vẫn đang nằm dưới sàn và báo cho người thân?"</w:t>
+        <w:t xml:space="preserve">Bài toán: camera thấy một người ngã, làm sao để máy tự nhận ra người đó vẫn đang nằm dưới sàn và báo cho người thân. Dải màu này là nhãn của một clip thật: cú ngã chỉ kéo dài 1.2 giây, nhưng người đó nằm lại gần 8 giây. Đoạn đỏ 'đã ngã' đó mới là lúc cần báo động.</w:t>
+      </w:r>
+    </w:p>
+    <w:p>
+      <w:pPr>
+        <w:pStyle w:val="Quote"/>
+      </w:pPr>
+      <w:r>
+        <w:t xml:space="preserve">Dự án dùng bộ OmniFall: hơn 13.000 video từ 5 nguồn, và được chấm trên 572 video tai nạn thật. Phần trình bày tập trung vào hai thứ: nhóm xử lý dữ liệu thế nào, và xây dựng, tối ưu mô hình ra sao."</w:t>
       </w:r>
     </w:p>
     <w:p>
@@ -596,7 +520,7 @@
         <w:pStyle w:val="Heading3"/>
       </w:pPr>
       <w:r>
-        <w:t xml:space="preserve">Slide 2 — Ví dụ: ngã mất 1.2 giây, nhưng nằm lại gần 8 giây (khoảng 50 giây)</w:t>
+        <w:t xml:space="preserve">Slide 2 — Xử lý dữ liệu qua 12 bước (khoảng 1 phút 30)</w:t>
       </w:r>
     </w:p>
     <w:p>
@@ -608,23 +532,39 @@
         <w:t xml:space="preserve">Thao tác:</w:t>
       </w:r>
       <w:r>
-        <w:t xml:space="preserve"> video tự chạy. Chỉ vào vạch đang chạy trên dải màu; khi tới đoạn đỏ thì dừng lại một nhịp.</w:t>
-      </w:r>
-    </w:p>
-    <w:p>
-      <w:pPr>
-        <w:pStyle w:val="Quote"/>
-      </w:pPr>
-      <w:r>
-        <w:t xml:space="preserve">"Đây là một video thật. Dải màu bên dưới cho biết mỗi giây người trong video đang làm gì. Người này đi bộ, đến giây 2.5 thì bắt đầu ngã, và cú ngã chỉ kéo dài khoảng 1.2 giây.</w:t>
-      </w:r>
-    </w:p>
-    <w:p>
-      <w:pPr>
-        <w:pStyle w:val="Quote"/>
-      </w:pPr>
-      <w:r>
-        <w:t xml:space="preserve">Sau đó người này nằm lại gần 8 giây. Khoảng thời gian màu đỏ này mới là lúc hệ thống cần báo động: người đã ngã và chưa dậy được."</w:t>
+        <w:t xml:space="preserve"> đi lần lượt 4 cột A, B, C, D; đọc tên bước và dòng chữ màu bên dưới.</w:t>
+      </w:r>
+    </w:p>
+    <w:p>
+      <w:pPr>
+        <w:pStyle w:val="Quote"/>
+      </w:pPr>
+      <w:r>
+        <w:t xml:space="preserve">"Trước khi đụng đến mô hình, nhóm xử lý dữ liệu qua 12 bước, bước nào cũng đo bằng số liệu.</w:t>
+      </w:r>
+    </w:p>
+    <w:p>
+      <w:pPr>
+        <w:pStyle w:val="Quote"/>
+      </w:pPr>
+      <w:r>
+        <w:t xml:space="preserve">Cột A làm sạch nhãn: gộp 5 nguồn với 24.933 đoạn, xoá nhãn lỗi, và đảm bảo không video nào vừa dùng để học vừa dùng để thi. Cột B đọc video: đo thông số từng video, lấy ảnh đúng thời gian, cắt trái, giữa, phải. Cột C biến ảnh thành vector đặc trưng bằng VideoMAE. Cột D đưa toàn bộ lên GPU để chạy như camera thật.</w:t>
+      </w:r>
+    </w:p>
+    <w:p>
+      <w:pPr>
+        <w:pStyle w:val="Quote"/>
+      </w:pPr>
+      <w:r>
+        <w:t xml:space="preserve">Trong quá trình này nhóm phát hiện hai lỗi quan trọng, Huyền sẽ trình bày."</w:t>
+      </w:r>
+    </w:p>
+    <w:p>
+      <w:pPr>
+        <w:pStyle w:val="Heading2"/>
+      </w:pPr>
+      <w:r>
+        <w:t xml:space="preserve">Phần 2 — Nghiêm Thị Thu Huyền (slide 3–5, khoảng 3 phút)</w:t>
       </w:r>
     </w:p>
     <w:p>
@@ -632,7 +572,7 @@
         <w:pStyle w:val="Heading3"/>
       </w:pPr>
       <w:r>
-        <w:t xml:space="preserve">Slide 3 — Mục tiêu: phát hiện người đã ngã và đang nằm lại (khoảng 50 giây)</w:t>
+        <w:t xml:space="preserve">Slide 3 — Lỗi 1: 154 video bị lệch thời gian (khoảng 1 phút)</w:t>
       </w:r>
     </w:p>
     <w:p>
@@ -644,23 +584,15 @@
         <w:t xml:space="preserve">Thao tác:</w:t>
       </w:r>
       <w:r>
-        <w:t xml:space="preserve"> đi lần lượt 3 ô từ trái sang phải, dừng lâu ở con số 24.7.</w:t>
-      </w:r>
-    </w:p>
-    <w:p>
-      <w:pPr>
-        <w:pStyle w:val="Quote"/>
-      </w:pPr>
-      <w:r>
-        <w:t xml:space="preserve">"Với người cao tuổi, nguy hiểm nhất không phải lúc ngã mà là nằm lại lâu mà không ai biết. Vì vậy việc cần làm là nhận ra người đã ngã và chưa dậy được, không chỉ khoảnh khắc đang ngã.</w:t>
-      </w:r>
-    </w:p>
-    <w:p>
-      <w:pPr>
-        <w:pStyle w:val="Quote"/>
-      </w:pPr>
-      <w:r>
-        <w:t xml:space="preserve">Khó ở chỗ mô hình được học trên video quay dựng sẵn, nhưng phải chạy đúng trên 572 video tai nạn thật chưa từng thấy. Ở điểm xuất phát, điểm F1 cho trạng thái 'đã ngã' chỉ là 24.7 trên thang 100. Hiểu nôm na là bỏ sót phần lớn các ca."</w:t>
+        <w:t xml:space="preserve"> chỉ đường chéo đi lên, rồi đường nằm ngang ở 0.</w:t>
+      </w:r>
+    </w:p>
+    <w:p>
+      <w:pPr>
+        <w:pStyle w:val="Quote"/>
+      </w:pPr>
+      <w:r>
+        <w:t xml:space="preserve">"Mỗi chấm là một video. 154 video quay ở 24 khung hình mỗi giây bị đọc sai tốc độ, nên hình và nhãn trôi dần khỏi nhau, tới 2.2 giây. 104 đoạn bị lệch quá nửa thời lượng, tức mô hình đang học và bị chấm trên hình không khớp nhãn. Nhóm sửa bằng cách lấy ảnh theo đồng hồ thật, đúng cách camera hoạt động."</w:t>
       </w:r>
     </w:p>
     <w:p>
@@ -668,7 +600,7 @@
         <w:pStyle w:val="Heading3"/>
       </w:pPr>
       <w:r>
-        <w:t xml:space="preserve">Slide 4 — Ý tưởng: vừa thấy cú ngã thì nhiều khả năng ngay sau đó người đang nằm (khoảng 1 phút)</w:t>
+        <w:t xml:space="preserve">Slide 4 — Lỗi 2: mô hình chỉ nhìn phần giữa ảnh (khoảng 1 phút)</w:t>
       </w:r>
     </w:p>
     <w:p>
@@ -680,23 +612,15 @@
         <w:t xml:space="preserve">Thao tác:</w:t>
       </w:r>
       <w:r>
-        <w:t xml:space="preserve"> chỉ vào ô 96.6% trước, rồi ô 1.5 s, sau cùng là biểu đồ bên trái.</w:t>
-      </w:r>
-    </w:p>
-    <w:p>
-      <w:pPr>
-        <w:pStyle w:val="Quote"/>
-      </w:pPr>
-      <w:r>
-        <w:t xml:space="preserve">"Nhóm nhận thấy một điều trong dữ liệu: trong video thật, 96.6% số đoạn 'đã ngã' đến ngay sau một cú ngã, và thường chỉ cách cú ngã khoảng 1.5 giây.</w:t>
-      </w:r>
-    </w:p>
-    <w:p>
-      <w:pPr>
-        <w:pStyle w:val="Quote"/>
-      </w:pPr>
-      <w:r>
-        <w:t xml:space="preserve">Vậy ý tưởng rất tự nhiên: khi máy vừa thấy một cú ngã, ta tăng điểm cho 'đã ngã' trong vài giây sau đó, rồi giảm dần theo thời gian. Biểu đồ bên trái vẽ điều này: đường xám là cách của bài báo cũ, giảm chậm và kéo dài 10 giây; đường xanh là cách nhóm chỉnh lại, giảm nhanh trong 5 giây, vì 90% ca nằm lại bắt đầu trong 2.6 giây đầu."</w:t>
+        <w:t xml:space="preserve"> video tự chạy; chỉ phần tối hai bên khi người ngã đi ra khỏi vùng giữa.</w:t>
+      </w:r>
+    </w:p>
+    <w:p>
+      <w:pPr>
+        <w:pStyle w:val="Quote"/>
+      </w:pPr>
+      <w:r>
+        <w:t xml:space="preserve">"Mô hình gốc cắt lấy phần giữa ảnh, bỏ mất 44% khung hình. Trong clip này, khi người ngã sang bên, mô hình gần như mất dấu. Nhóm cho mô hình nhìn cả 3 góc trái, giữa, phải rồi gộp kết quả: điểm F1 'đã ngã' tăng thêm 1.9."</w:t>
       </w:r>
     </w:p>
     <w:p>
@@ -704,7 +628,7 @@
         <w:pStyle w:val="Heading3"/>
       </w:pPr>
       <w:r>
-        <w:t xml:space="preserve">Slide 5 — Dữ liệu: 13.268 video từ 5 nguồn (khoảng 50 giây)</w:t>
+        <w:t xml:space="preserve">Slide 5 — Các hướng nhóm thử (khoảng 1 phút)</w:t>
       </w:r>
     </w:p>
     <w:p>
@@ -716,23 +640,15 @@
         <w:t xml:space="preserve">Thao tác:</w:t>
       </w:r>
       <w:r>
-        <w:t xml:space="preserve"> chỉ bảng bên trái, dòng tô sáng là video thật; rồi chỉ biểu đồ bên phải.</w:t>
-      </w:r>
-    </w:p>
-    <w:p>
-      <w:pPr>
-        <w:pStyle w:val="Quote"/>
-      </w:pPr>
-      <w:r>
-        <w:t xml:space="preserve">"Dự án dùng 5 nguồn với tổng 13.268 video: 12.000 video dựng bằng máy, 3 bộ video diễn viên đóng, và 818 video tai nạn thật lấy từ mạng. Video thật được chia 165 để huấn luyện, 81 để chọn tham số, và 572 để chấm điểm cuối cùng.</w:t>
-      </w:r>
-    </w:p>
-    <w:p>
-      <w:pPr>
-        <w:pStyle w:val="Quote"/>
-      </w:pPr>
-      <w:r>
-        <w:t xml:space="preserve">Biểu đồ bên phải so tỉ lệ mỗi hành động: cột xám là video huấn luyện, cột xanh là video thật. Hai bên khác nhau rất rõ, nên mô hình học tốt ở phòng thí nghiệm nhưng dễ làm kém ngoài thực tế."</w:t>
+        <w:t xml:space="preserve"> chỉ lần lượt 4 thẻ; nhấn mạnh thẻ cuối viền xanh.</w:t>
+      </w:r>
+    </w:p>
+    <w:p>
+      <w:pPr>
+        <w:pStyle w:val="Quote"/>
+      </w:pPr>
+      <w:r>
+        <w:t xml:space="preserve">"Có dữ liệu sạch, nhóm thử bốn hướng. Hai hướng không cần huấn luyện: quy tắc 'sau cú ngã là nằm', và chuỗi xác suất HMM. Hai hướng có huấn luyện: Hybrid của bài báo trước, và fine-tune mô hình trên video tai nạn thật. Mọi lựa chọn đều làm trên 81 video riêng; 572 video thi chỉ dùng một lần."</w:t>
       </w:r>
     </w:p>
     <w:p>
@@ -744,7 +660,7 @@
         <w:t xml:space="preserve">Chuyển lời:</w:t>
       </w:r>
       <w:r>
-        <w:t xml:space="preserve"> "Có dữ liệu rồi, nhưng dữ liệu có sạch không? Phần này Huyền sẽ trình bày."</w:t>
+        <w:t xml:space="preserve"> "Vậy mô hình cụ thể được xây và tối ưu như thế nào? Mời Quân."</w:t>
       </w:r>
     </w:p>
     <w:p>
@@ -752,13 +668,13 @@
         <w:pStyle w:val="Heading2"/>
       </w:pPr>
       <w:r>
-        <w:t xml:space="preserve">Phần 2 — Nghiêm Thị Thu Huyền (slide 6–9, khoảng 4 phút)</w:t>
-      </w:r>
-    </w:p>
-    <w:p>
-      <w:pPr/>
-      <w:r>
-        <w:t xml:space="preserve">Mục tiêu: cho thấy nhóm làm dữ liệu cẩn thận, tìm và sửa 3 lỗi bằng số đo cụ thể.</w:t>
+        <w:t xml:space="preserve">Phần 3 — Nguyễn Duy Quân (slide 6–10, khoảng 6 phút 30)</w:t>
+      </w:r>
+    </w:p>
+    <w:p>
+      <w:pPr/>
+      <w:r>
+        <w:t xml:space="preserve">Mục tiêu: đây là phần trọng tâm của cả bài. Nói chắc, chỉ vào từng con số, cho thấy mỗi quyết định về mô hình đều được đo và chọn có hệ thống.</w:t>
       </w:r>
     </w:p>
     <w:p>
@@ -766,7 +682,7 @@
         <w:pStyle w:val="Heading3"/>
       </w:pPr>
       <w:r>
-        <w:t xml:space="preserve">Slide 6 — Xử lý dữ liệu qua 12 bước (khoảng 1 phút)</w:t>
+        <w:t xml:space="preserve">Slide 6 — Kiến trúc: hai tầng Transformer, 101 triệu tham số (khoảng 1 phút 30)</w:t>
       </w:r>
     </w:p>
     <w:p>
@@ -778,23 +694,47 @@
         <w:t xml:space="preserve">Thao tác:</w:t>
       </w:r>
       <w:r>
-        <w:t xml:space="preserve"> đi lần lượt 4 cột A, B, C, D từ trái sang phải; chỉ đọc tên bước và dòng chữ màu bên dưới.</w:t>
-      </w:r>
-    </w:p>
-    <w:p>
-      <w:pPr>
-        <w:pStyle w:val="Quote"/>
-      </w:pPr>
-      <w:r>
-        <w:t xml:space="preserve">"Trước khi huấn luyện, nhóm xử lý dữ liệu qua 12 bước, chia thành 4 nhóm. Mỗi bước có một dòng chữ màu, là con số đo được ở bước đó.</w:t>
-      </w:r>
-    </w:p>
-    <w:p>
-      <w:pPr>
-        <w:pStyle w:val="Quote"/>
-      </w:pPr>
-      <w:r>
-        <w:t xml:space="preserve">Cột A là làm sạch nhãn: gộp 5 nguồn, xoá 5 dòng nhãn sai hoặc trùng, và đảm bảo không video nào vừa dùng để học vừa dùng để thi. Cột B là đọc video, cột C biến ảnh thành con số bằng mô hình VideoMAE, cột D là chạy ngay trên card đồ hoạ như camera thật. Trong quá trình này nhóm tìm ra 3 lỗi, em sẽ nói lần lượt."</w:t>
+        <w:t xml:space="preserve"> đi theo 4 khối từ trái sang phải, dừng ở con số lớn của mỗi khối và nhãn nhỏ ở đáy (đóng băng / fine-tune / tune trên val); cuối cùng chỉ hàng số bên dưới.</w:t>
+      </w:r>
+    </w:p>
+    <w:p>
+      <w:pPr>
+        <w:pStyle w:val="Quote"/>
+      </w:pPr>
+      <w:r>
+        <w:t xml:space="preserve">"Đây là kiến trúc đầy đủ của hệ thống, gồm ba tầng.</w:t>
+      </w:r>
+    </w:p>
+    <w:p>
+      <w:pPr>
+        <w:pStyle w:val="Quote"/>
+      </w:pPr>
+      <w:r>
+        <w:t xml:space="preserve">Đầu vào là cụm 16 ảnh 224 nhân 224. Tầng 1 là VideoMAE-Base, 86 triệu tham số, 12 lớp Transformer, đã học sẵn trên 400 loại hành động của bộ Kinetics. Nó nén mỗi cụm 16 ảnh thành một vector 768 chiều, cứ 0.133 giây một lần. Tầng này được đóng băng để giữ kiến thức đã học.</w:t>
+      </w:r>
+    </w:p>
+    <w:p>
+      <w:pPr>
+        <w:pStyle w:val="Quote"/>
+      </w:pPr>
+      <w:r>
+        <w:t xml:space="preserve">Tầng 2 là Transformer thời gian, 14.8 triệu tham số, 2 lớp, 8 đầu chú ý. Nó đọc chuỗi 18 vector, tức khoảng 4.4 giây, để hiểu diễn biến theo thời gian và chấm điểm 10 hành động. Đây là tầng nhóm fine-tune.</w:t>
+      </w:r>
+    </w:p>
+    <w:p>
+      <w:pPr>
+        <w:pStyle w:val="Quote"/>
+      </w:pPr>
+      <w:r>
+        <w:t xml:space="preserve">Tầng 3 là quy tắc chuyển trạng thái: không có tham số nào phải học, nên không thể học vẹt. Sau khi thấy 'đang ngã', nó đẩy điểm 'đã ngã' trong 5 giây, giảm dần với chu kỳ bán rã 1 giây. Hai tham số này được dò trên tập kiểm tra riêng.</w:t>
+      </w:r>
+    </w:p>
+    <w:p>
+      <w:pPr>
+        <w:pStyle w:val="Quote"/>
+      </w:pPr>
+      <w:r>
+        <w:t xml:space="preserve">Tổng cộng 101 triệu tham số, nhìn 3 góc ảnh, và vẫn chỉ mất 40 đến 47 mili giây mỗi lần dự đoán."</w:t>
       </w:r>
     </w:p>
     <w:p>
@@ -802,7 +742,7 @@
         <w:pStyle w:val="Heading3"/>
       </w:pPr>
       <w:r>
-        <w:t xml:space="preserve">Slide 7 — Lỗi 1: 154 video bị lệch thời gian (khoảng 1 phút)</w:t>
+        <w:t xml:space="preserve">Slide 7 — Fine-tune: "đã ngã" từ 24.7 lên 44.1 (khoảng 1 phút 30)</w:t>
       </w:r>
     </w:p>
     <w:p>
@@ -814,23 +754,31 @@
         <w:t xml:space="preserve">Thao tác:</w:t>
       </w:r>
       <w:r>
-        <w:t xml:space="preserve"> chỉ vào đường chéo đi lên trên biểu đồ, rồi đường nằm ngang ở 0.</w:t>
-      </w:r>
-    </w:p>
-    <w:p>
-      <w:pPr>
-        <w:pStyle w:val="Quote"/>
-      </w:pPr>
-      <w:r>
-        <w:t xml:space="preserve">"Mỗi chấm trên biểu đồ là một video. 154 video quay ở 24 khung hình mỗi giây bị đọc sai tốc độ, nên hình ảnh và nhãn trôi dần khỏi nhau: video càng dài, lệch càng nhiều, tới 2.2 giây. Video 30 khung hình mỗi giây thì không lệch.</w:t>
-      </w:r>
-    </w:p>
-    <w:p>
-      <w:pPr>
-        <w:pStyle w:val="Quote"/>
-      </w:pPr>
-      <w:r>
-        <w:t xml:space="preserve">Có 104 đoạn bị lệch quá nửa thời lượng, tức là mô hình bị chấm trên những hình ảnh không khớp với nhãn. Nhóm đã sửa bằng cách đọc khung hình theo đúng thời gian thật."</w:t>
+        <w:t xml:space="preserve"> chỉ 3 ô số trên cùng từ trái sang phải, nhấn giọng ở +19.4; rồi ô chiến lược; cuối cùng bảng 3 lần bên phải.</w:t>
+      </w:r>
+    </w:p>
+    <w:p>
+      <w:pPr>
+        <w:pStyle w:val="Quote"/>
+      </w:pPr>
+      <w:r>
+        <w:t xml:space="preserve">"Đây là bước tạo ra bước nhảy lớn nhất. Mô hình gốc chỉ học trên video dựng, điểm F1 'đã ngã' là 24.7. Sau fine-tune trên video tai nạn thật, con số này là 44.1, tăng 19.4 điểm, gần gấp đôi.</w:t>
+      </w:r>
+    </w:p>
+    <w:p>
+      <w:pPr>
+        <w:pStyle w:val="Quote"/>
+      </w:pPr>
+      <w:r>
+        <w:t xml:space="preserve">Chiến lược: khởi tạo từ checkpoint gốc đã huấn luyện 7.000 bước, học thêm trên 165 video thật với 809 đoạn có nhãn. Mỗi vòng, dữ liệu được tăng cường bằng cách cắt ngẫu nhiên theo thời gian và theo góc ảnh, để mô hình không học thuộc. Nhóm thử thêm phạt L2-SP để chống quên kiến thức cũ, làm mềm nhãn 0.1, và dừng sớm theo điểm trên 81 video kiểm tra.</w:t>
+      </w:r>
+    </w:p>
+    <w:p>
+      <w:pPr>
+        <w:pStyle w:val="Quote"/>
+      </w:pPr>
+      <w:r>
+        <w:t xml:space="preserve">Để chắc chắn không phải ngẫu nhiên, nhóm huấn luyện 3 lần với 3 hạt giống khác nhau: 41.1, 46.0 và 45.2. Cả ba đều vượt xa mô hình gốc; nhìn thêm 3 góc ảnh đưa lên 45.6."</w:t>
       </w:r>
     </w:p>
     <w:p>
@@ -838,7 +786,7 @@
         <w:pStyle w:val="Heading3"/>
       </w:pPr>
       <w:r>
-        <w:t xml:space="preserve">Slide 8 — Lỗi 2: mô hình chỉ nhìn phần giữa ảnh (khoảng 50 giây)</w:t>
+        <w:t xml:space="preserve">Slide 8 — Tối ưu tham số: 225 cấu hình (khoảng 1 phút 15)</w:t>
       </w:r>
     </w:p>
     <w:p>
@@ -850,23 +798,23 @@
         <w:t xml:space="preserve">Thao tác:</w:t>
       </w:r>
       <w:r>
-        <w:t xml:space="preserve"> video tự chạy. Chỉ vào phần tối hai bên, nơi người ngã đi ra khỏi vùng giữa.</w:t>
-      </w:r>
-    </w:p>
-    <w:p>
-      <w:pPr>
-        <w:pStyle w:val="Quote"/>
-      </w:pPr>
-      <w:r>
-        <w:t xml:space="preserve">"Mô hình gốc chỉ nhận ảnh vuông, nên video ngang bị cắt lấy phần giữa. Phần tối hai bên là vùng mô hình không nhìn thấy; tính ra mô hình chỉ thấy 56% khung hình. Trong clip này, khi người ngã sang bên, mô hình gần như mất dấu.</w:t>
-      </w:r>
-    </w:p>
-    <w:p>
-      <w:pPr>
-        <w:pStyle w:val="Quote"/>
-      </w:pPr>
-      <w:r>
-        <w:t xml:space="preserve">Cách sửa là cho mô hình nhìn thêm phần trái và phải rồi gộp kết quả. Nhờ vậy điểm F1 'đã ngã' tăng thêm 1.9 điểm."</w:t>
+        <w:t xml:space="preserve"> chỉ bảng màu từ góc tối trên trái xuống ô viền trắng; rồi hai ô bên phải.</w:t>
+      </w:r>
+    </w:p>
+    <w:p>
+      <w:pPr>
+        <w:pStyle w:val="Quote"/>
+      </w:pPr>
+      <w:r>
+        <w:t xml:space="preserve">"Tham số không được chọn theo cảm tính. Bảng màu này là 15 cấu hình fine-tune: hàng là tốc độ học từ 0.00001 đến 0.0005, cột là mức phạt L2-SP. Ô càng sáng điểm càng cao, đo trên 81 video kiểm tra riêng, không phải video thi.</w:t>
+      </w:r>
+    </w:p>
+    <w:p>
+      <w:pPr>
+        <w:pStyle w:val="Quote"/>
+      </w:pPr>
+      <w:r>
+        <w:t xml:space="preserve">Xu hướng rất rõ: học nhanh hơn và ít ràng buộc hơn thì tốt hơn, từ 54 lên 62. Cộng thêm 42 cấu hình quy tắc, 48 cấu hình HMM và 120 cấu hình khi chạy như camera, nhóm đã dò tổng cộng 225 cấu hình."</w:t>
       </w:r>
     </w:p>
     <w:p>
@@ -874,7 +822,7 @@
         <w:pStyle w:val="Heading3"/>
       </w:pPr>
       <w:r>
-        <w:t xml:space="preserve">Slide 9 — Lỗi 3: mỗi lần chấm điểm ra một kết quả khác (khoảng 50 giây)</w:t>
+        <w:t xml:space="preserve">Slide 9 — Tối ưu tốc độ: tiền xử lý trên GPU (khoảng 1 phút)</w:t>
       </w:r>
     </w:p>
     <w:p>
@@ -886,23 +834,65 @@
         <w:t xml:space="preserve">Thao tác:</w:t>
       </w:r>
       <w:r>
-        <w:t xml:space="preserve"> chỉ vào 10 chấm, rồi vạch trung bình 24.7.</w:t>
-      </w:r>
-    </w:p>
-    <w:p>
-      <w:pPr>
-        <w:pStyle w:val="Quote"/>
-      </w:pPr>
-      <w:r>
-        <w:t xml:space="preserve">"Lỗi thứ ba nằm ở cách chấm điểm. Cách cũ cắt video ngẫu nhiên mỗi lần chấm, nên cùng một mô hình mà mỗi lần ra một điểm. Nhóm chấm 10 lần, điểm dao động từ 23.5 tới 26.0, trung bình 24.7.</w:t>
-      </w:r>
-    </w:p>
-    <w:p>
-      <w:pPr>
-        <w:pStyle w:val="Quote"/>
-      </w:pPr>
-      <w:r>
-        <w:t xml:space="preserve">Nhóm đã sửa bằng cách cắt cố định, nên chấm lại lần nào cũng ra cùng một kết quả. Nhờ vậy mọi so sánh phía sau đều công bằng."</w:t>
+        <w:t xml:space="preserve"> chỉ 3 con số lớn, rồi thanh ngân sách thời gian.</w:t>
+      </w:r>
+    </w:p>
+    <w:p>
+      <w:pPr>
+        <w:pStyle w:val="Quote"/>
+      </w:pPr>
+      <w:r>
+        <w:t xml:space="preserve">"Để chạy được thời gian thực, nhóm viết lại bước tiền xử lý ảnh để chạy trên GPU: 2.9 mili giây mỗi ảnh, so với 7.2 trên CPU, nhanh gấp 2.5 lần. Nhanh hơn nhưng không sai lệch: vector đặc trưng giống bản gốc tới 0.9998, và 98.7% khung hình ra cùng nhãn.</w:t>
+      </w:r>
+    </w:p>
+    <w:p>
+      <w:pPr>
+        <w:pStyle w:val="Quote"/>
+      </w:pPr>
+      <w:r>
+        <w:t xml:space="preserve">Cứ 133 mili giây có một ảnh mới. Toàn bộ mô hình kể cả nhìn 3 góc chỉ dùng 40 đến 47, còn dư khoảng 90 mili giây. Camera, mô hình và cảnh báo chạy trên 3 luồng song song."</w:t>
+      </w:r>
+    </w:p>
+    <w:p>
+      <w:pPr>
+        <w:pStyle w:val="Heading3"/>
+      </w:pPr>
+      <w:r>
+        <w:t xml:space="preserve">Slide 10 — Vì sao chọn "fine-tune + quy tắc" (khoảng 1 phút 15)</w:t>
+      </w:r>
+    </w:p>
+    <w:p>
+      <w:pPr/>
+      <w:r>
+        <w:rPr>
+          <w:b/>
+        </w:rPr>
+        <w:t xml:space="preserve">Thao tác:</w:t>
+      </w:r>
+      <w:r>
+        <w:t xml:space="preserve"> đọc bảng từng dòng; dừng ở cột "Đang ngã" của HMM và Hybrid; kết thúc ở dòng xanh và ô +12.4 · +16.5 · +12.5.</w:t>
+      </w:r>
+    </w:p>
+    <w:p>
+      <w:pPr>
+        <w:pStyle w:val="Quote"/>
+      </w:pPr>
+      <w:r>
+        <w:t xml:space="preserve">"Cùng một mô hình đã fine-tune, nhóm gắn thử từng cách xử lý phía sau khi chạy như camera. HMM và Hybrid nâng 'đã ngã' nhưng mất 5 đến 8 điểm 'đang ngã', vì đoán 'nằm' quá sớm. Quy tắc là cách duy nhất tăng cả ba điểm, không cần huấn luyện. So với hệ thống cũ, hệ thống cuối cùng tăng 12.4, 16.5 và 12.5 điểm."</w:t>
+      </w:r>
+    </w:p>
+    <w:p>
+      <w:pPr>
+        <w:pStyle w:val="Quote"/>
+      </w:pPr>
+      <w:r>
+        <w:rPr>
+          <w:b/>
+        </w:rPr>
+        <w:t xml:space="preserve">Nếu bị hỏi:</w:t>
+      </w:r>
+      <w:r>
+        <w:t xml:space="preserve"> "Hybrid có 'đã ngã' cao hơn (45.7)?" → "Đúng, cao hơn 1.4 điểm, nhưng mất 6 điểm 'đang ngã' và 3 điểm gộp, lại phải huấn luyện. Nhóm chọn cách cân bằng và đơn giản hơn."</w:t>
       </w:r>
     </w:p>
     <w:p>
@@ -914,7 +904,7 @@
         <w:t xml:space="preserve">Chuyển lời:</w:t>
       </w:r>
       <w:r>
-        <w:t xml:space="preserve"> "Dữ liệu đã sạch và cách chấm điểm đã ổn định. Câu hỏi tiếp theo là cách nào thật sự giúp kết quả tốt hơn. Mời Quân."</w:t>
+        <w:t xml:space="preserve"> "Mô hình đã có. Câu hỏi cuối là nó chạy ngoài thực tế tốt đến đâu. Mời Hoàng Anh."</w:t>
       </w:r>
     </w:p>
     <w:p>
@@ -922,13 +912,13 @@
         <w:pStyle w:val="Heading2"/>
       </w:pPr>
       <w:r>
-        <w:t xml:space="preserve">Phần 3 — Nguyễn Duy Quân (slide 10–16, khoảng 8 phút 30)</w:t>
-      </w:r>
-    </w:p>
-    <w:p>
-      <w:pPr/>
-      <w:r>
-        <w:t xml:space="preserve">Mục tiêu: đây là phần kỹ thuật nặng nhất. Người nghe cần hiểu nhóm đã thử những cách nào, vì sao chấm điểm như camera thật mới công bằng, và hệ thống mới tốt hơn bao nhiêu. Ba slide 11–13 (mô hình, tune, chọn phương pháp) là điểm nhấn: nói chắc, chỉ vào số. Giọng chậm lại ở slide 14.</w:t>
+        <w:t xml:space="preserve">Phần 4 — Vũ Hoàng Anh (slide 11–16, khoảng 6 phút)</w:t>
+      </w:r>
+    </w:p>
+    <w:p>
+      <w:pPr/>
+      <w:r>
+        <w:t xml:space="preserve">Mục tiêu: cho thấy cách chấm điểm công bằng, kết quả vượt trội và đã được kiểm chứng, rồi kết thúc.</w:t>
       </w:r>
     </w:p>
     <w:p>
@@ -936,7 +926,7 @@
         <w:pStyle w:val="Heading3"/>
       </w:pPr>
       <w:r>
-        <w:t xml:space="preserve">Slide 10 — Các cách nhóm thử để cải thiện kết quả (khoảng 1 phút 15)</w:t>
+        <w:t xml:space="preserve">Slide 11 — Chấm điểm như camera thật mới là cách đánh giá công bằng (khoảng 1 phút 30) — slide quan trọng nhất</w:t>
       </w:r>
     </w:p>
     <w:p>
@@ -948,75 +938,23 @@
         <w:t xml:space="preserve">Thao tác:</w:t>
       </w:r>
       <w:r>
-        <w:t xml:space="preserve"> chỉ lần lượt 4 thẻ từ trái sang phải; ở thẻ cuối viền xanh thì nhấn mạnh.</w:t>
-      </w:r>
-    </w:p>
-    <w:p>
-      <w:pPr>
-        <w:pStyle w:val="Quote"/>
-      </w:pPr>
-      <w:r>
-        <w:t xml:space="preserve">"Nhóm thử bốn cách. Hai cách đầu không cần huấn luyện.</w:t>
-      </w:r>
-    </w:p>
-    <w:p>
-      <w:pPr>
-        <w:pStyle w:val="Quote"/>
-      </w:pPr>
-      <w:r>
-        <w:t xml:space="preserve">Cách thứ nhất là </w:t>
-      </w:r>
-      <w:r>
-        <w:rPr>
-          <w:b/>
-        </w:rPr>
-        <w:t xml:space="preserve">quy tắc</w:t>
-      </w:r>
-      <w:r>
-        <w:t xml:space="preserve"> đã nói ở slide 4: vừa thấy cú ngã thì tăng điểm 'đã ngã' trong vài giây sau, giảm dần theo thời gian. Cách thứ hai là </w:t>
-      </w:r>
-      <w:r>
-        <w:rPr>
-          <w:b/>
-        </w:rPr>
-        <w:t xml:space="preserve">chuỗi xác suất</w:t>
-      </w:r>
-      <w:r>
-        <w:t xml:space="preserve">, hay mô hình HMM: dựa trên thống kê hành động nào hay đi sau hành động nào để sửa lại dự đoán.</w:t>
-      </w:r>
-    </w:p>
-    <w:p>
-      <w:pPr>
-        <w:pStyle w:val="Quote"/>
-      </w:pPr>
-      <w:r>
-        <w:t xml:space="preserve">Cách thứ ba là </w:t>
-      </w:r>
-      <w:r>
-        <w:rPr>
-          <w:b/>
-        </w:rPr>
-        <w:t xml:space="preserve">Hybrid</w:t>
-      </w:r>
-      <w:r>
-        <w:t xml:space="preserve">, cách của bài báo trước: một mạng nhỏ học cách chỉnh lại kết quả của quy tắc. Cách thứ tư là </w:t>
-      </w:r>
-      <w:r>
-        <w:rPr>
-          <w:b/>
-        </w:rPr>
-        <w:t xml:space="preserve">học thêm video thật</w:t>
-      </w:r>
-      <w:r>
-        <w:t xml:space="preserve">: huấn luyện thêm mô hình trên 165 video tai nạn thật, hoàn toàn tách biệt với 572 video chấm điểm.</w:t>
-      </w:r>
-    </w:p>
-    <w:p>
-      <w:pPr>
-        <w:pStyle w:val="Quote"/>
-      </w:pPr>
-      <w:r>
-        <w:t xml:space="preserve">Mọi lựa chọn đều làm trên 81 video riêng; 572 video chấm điểm cuối chỉ dùng một lần."</w:t>
+        <w:t xml:space="preserve"> chỉ ô trái trước, dừng ở con số 51.3; sau đó sang ô phải viền xanh.</w:t>
+      </w:r>
+    </w:p>
+    <w:p>
+      <w:pPr>
+        <w:pStyle w:val="Quote"/>
+      </w:pPr>
+      <w:r>
+        <w:t xml:space="preserve">"Đây là điểm nhóm cho là quan trọng nhất. Cách chấm cũ đưa cho mô hình những đoạn video đã được cắt sẵn đúng chỗ đổi hành động, lại cho mô hình nhìn cả đoạn phía sau. Như vậy mô hình được 'nhắc bài': nó biết trước lúc nào hành động thay đổi. Chấm kiểu này, kết quả đẹp tới 51.3, nhưng camera thật không hề có thông tin này.</w:t>
+      </w:r>
+    </w:p>
+    <w:p>
+      <w:pPr>
+        <w:pStyle w:val="Quote"/>
+      </w:pPr>
+      <w:r>
+        <w:t xml:space="preserve">Vì vậy nhóm chấm theo cách của camera thật: hệ thống dự đoán liên tục 7.5 lần mỗi giây, chỉ dùng hình ảnh đã xảy ra, không được nhìn trước tương lai. Ngoài điểm F1, nhóm còn đếm cả số lần báo động đúng và báo động nhầm. Đây là thước đo chính của cả báo cáo."</w:t>
       </w:r>
     </w:p>
     <w:p>
@@ -1024,7 +962,7 @@
         <w:pStyle w:val="Heading3"/>
       </w:pPr>
       <w:r>
-        <w:t xml:space="preserve">Slide 11 — Mô hình: VideoMAE đọc video, một Transformer nhỏ quyết định hành động (khoảng 1 phút)</w:t>
+        <w:t xml:space="preserve">Slide 12 — Huấn luyện thêm trên video thật giúp tăng mạnh nhất (khoảng 1 phút 15)</w:t>
       </w:r>
     </w:p>
     <w:p>
@@ -1036,31 +974,23 @@
         <w:t xml:space="preserve">Thao tác:</w:t>
       </w:r>
       <w:r>
-        <w:t xml:space="preserve"> đi theo 4 ô từ trái sang phải theo mũi tên, rồi chỉ 3 con số bên dưới.</w:t>
-      </w:r>
-    </w:p>
-    <w:p>
-      <w:pPr>
-        <w:pStyle w:val="Quote"/>
-      </w:pPr>
-      <w:r>
-        <w:t xml:space="preserve">"Đây là toàn bộ hệ thống. Video được lấy 7.5 ảnh mỗi giây, theo đúng thời gian thật. VideoMAE là một mô hình lớn đã học sẵn cách hiểu video; nhóm giữ nguyên nó, dùng để biến mỗi cụm 16 ảnh thành 768 con số, cứ 0.13 giây một lần.</w:t>
-      </w:r>
-    </w:p>
-    <w:p>
-      <w:pPr>
-        <w:pStyle w:val="Quote"/>
-      </w:pPr>
-      <w:r>
-        <w:t xml:space="preserve">Phần nhóm thật sự huấn luyện là ô xanh dương: một Transformer nhỏ, 2 lớp, 8 đầu chú ý. Nó đọc 18 vector liên tiếp, tức khoảng 4.4 giây, và chấm điểm 10 hành động. Cuối cùng là quy tắc 'sau ngã là nằm' và bộ báo động.</w:t>
-      </w:r>
-    </w:p>
-    <w:p>
-      <w:pPr>
-        <w:pStyle w:val="Quote"/>
-      </w:pPr>
-      <w:r>
-        <w:t xml:space="preserve">Toàn bộ chạy 40 đến 47 mili giây mỗi lần trên RTX 3070, đủ cho camera trực tiếp. Phần quy tắc không có tham số nào để học, nên không thể học vẹt dữ liệu."</w:t>
+        <w:t xml:space="preserve"> so hai biểu đồ; chỉ các thanh xám trước, rồi hai thanh xanh dưới cùng.</w:t>
+      </w:r>
+    </w:p>
+    <w:p>
+      <w:pPr>
+        <w:pStyle w:val="Quote"/>
+      </w:pPr>
+      <w:r>
+        <w:t xml:space="preserve">"Biểu đồ trái là điểm F1 cho 'đã ngã', biểu đồ phải là 'đang ngã hoặc đã ngã'. Các thanh xám là những cách cũ: quy tắc và Hybrid nâng 'đã ngã' từ 24.7 lên khoảng 29 đến 33.</w:t>
+      </w:r>
+    </w:p>
+    <w:p>
+      <w:pPr>
+        <w:pStyle w:val="Quote"/>
+      </w:pPr>
+      <w:r>
+        <w:t xml:space="preserve">Hai thanh xanh là khi học thêm video thật: 'đã ngã' lên 44.1, và 46.1 khi cho mô hình nhìn đủ khung hình. Bên phải cũng vậy, từ 55 lên 66. Thanh ngang nhỏ ở đầu mỗi cột là mức dao động giữa các lần huấn luyện, khá nhỏ, nên kết quả ổn định."</w:t>
       </w:r>
     </w:p>
     <w:p>
@@ -1068,7 +998,7 @@
         <w:pStyle w:val="Heading3"/>
       </w:pPr>
       <w:r>
-        <w:t xml:space="preserve">Slide 12 — Tune có hệ thống: thử 225 cấu hình (khoảng 1 phút 15)</w:t>
+        <w:t xml:space="preserve">Slide 13 — Chạy như camera: hệ thống mới hơn hệ thống cũ 12–17 điểm (khoảng 1 phút 30)</w:t>
       </w:r>
     </w:p>
     <w:p>
@@ -1080,31 +1010,23 @@
         <w:t xml:space="preserve">Thao tác:</w:t>
       </w:r>
       <w:r>
-        <w:t xml:space="preserve"> chỉ bảng màu từ góc tối trên trái xuống ô viền trắng dưới trái; rồi sang 2 ô bên phải.</w:t>
-      </w:r>
-    </w:p>
-    <w:p>
-      <w:pPr>
-        <w:pStyle w:val="Quote"/>
-      </w:pPr>
-      <w:r>
-        <w:t xml:space="preserve">"Nhóm không chọn tham số theo cảm tính. Bảng màu này là 15 cấu hình khi học thêm video thật: hàng là tốc độ học, cột là mức ép mô hình giữ gần bản gốc. Ô càng sáng điểm càng cao. Điểm này đo trên 81 video kiểm tra riêng, không phải 572 video thi.</w:t>
-      </w:r>
-    </w:p>
-    <w:p>
-      <w:pPr>
-        <w:pStyle w:val="Quote"/>
-      </w:pPr>
-      <w:r>
-        <w:t xml:space="preserve">Xu hướng rất rõ: học nhanh hơn và cho mô hình tự do hơn thì tốt hơn, từ 54 lên 62. Nhóm chọn ô tốt nhất rồi huấn luyện lại 3 lần với 3 hạt giống ngẫu nhiên để chắc kết quả ổn định.</w:t>
-      </w:r>
-    </w:p>
-    <w:p>
-      <w:pPr>
-        <w:pStyle w:val="Quote"/>
-      </w:pPr>
-      <w:r>
-        <w:t xml:space="preserve">Công thức huấn luyện: AdamW, 30 vòng, lô 32, làm mềm nhãn để mô hình bớt tự tin thái quá, mỗi vòng cắt ngẫu nhiên theo thời gian và trái, giữa, phải để mô hình không học thuộc. Cộng cả quy tắc, HMM và chạy như camera, nhóm đã thử tổng cộng 225 cấu hình."</w:t>
+        <w:t xml:space="preserve"> chỉ cột xám, rồi cột xanh ngọc cao nhất trong cả ba nhóm; sau đó chỉ sang phần chữ bên phải.</w:t>
+      </w:r>
+    </w:p>
+    <w:p>
+      <w:pPr>
+        <w:pStyle w:val="Quote"/>
+      </w:pPr>
+      <w:r>
+        <w:t xml:space="preserve">"Đây là kết quả khi chạy đúng như camera thật. Ba nhóm cột là ba con số: 'đã ngã', 'đang ngã', và gộp cả hai.</w:t>
+      </w:r>
+    </w:p>
+    <w:p>
+      <w:pPr>
+        <w:pStyle w:val="Quote"/>
+      </w:pPr>
+      <w:r>
+        <w:t xml:space="preserve">Hệ thống mới của nhóm gồm ba phần: học thêm video thật, nhìn đủ khung hình, và quy tắc 'sau cú ngã là nằm'. Kết quả là 44.3, 62.0 và 69.3, so với 31.9, 45.5 và 56.8 của hệ thống cũ, tức tăng từ 12 đến 17 điểm. Cả ba mức tăng đều được kiểm chứng thống kê, em sẽ nói rõ ở slide 15."</w:t>
       </w:r>
     </w:p>
     <w:p>
@@ -1112,7 +1034,7 @@
         <w:pStyle w:val="Heading3"/>
       </w:pPr>
       <w:r>
-        <w:t xml:space="preserve">Slide 13 — Vì sao chọn "học thêm video thật + quy tắc" (khoảng 1 phút 15)</w:t>
+        <w:t xml:space="preserve">Slide 14 — Báo động: ở cùng số lần báo nhầm, hệ thống mới bắt được nhiều ca ngã hơn (khoảng 1 phút)</w:t>
       </w:r>
     </w:p>
     <w:p>
@@ -1124,45 +1046,23 @@
         <w:t xml:space="preserve">Thao tác:</w:t>
       </w:r>
       <w:r>
-        <w:t xml:space="preserve"> đọc bảng từng dòng; dừng ở cột "Đang ngã" của HMM và Hybrid; kết thúc ở dòng xanh.</w:t>
-      </w:r>
-    </w:p>
-    <w:p>
-      <w:pPr>
-        <w:pStyle w:val="Quote"/>
-      </w:pPr>
-      <w:r>
-        <w:t xml:space="preserve">"Cùng một mô hình đã học thêm, nhóm thử gắn từng cách xử lý phía sau, khi chạy như camera.</w:t>
-      </w:r>
-    </w:p>
-    <w:p>
-      <w:pPr>
-        <w:pStyle w:val="Quote"/>
-      </w:pPr>
-      <w:r>
-        <w:t xml:space="preserve">HMM và Hybrid đều nâng điểm 'đã ngã', nhưng cái giá là mất 5 đến 8 điểm 'đang ngã': chúng vội đoán người đã nằm trong khi người đó còn đang ngã. Hybrid còn cần huấn luyện thêm.</w:t>
-      </w:r>
-    </w:p>
-    <w:p>
-      <w:pPr>
-        <w:pStyle w:val="Quote"/>
-      </w:pPr>
-      <w:r>
-        <w:t xml:space="preserve">Quy tắc là cách duy nhất tăng cả ba điểm cùng lúc, không cần huấn luyện, chạy gần như không tốn thời gian. Và so với hệ thống cũ, tổng hợp lại ta tăng 12.4, 16.5 và 12.5 điểm. Đó là lý do nhóm chọn cấu hình này."</w:t>
-      </w:r>
-    </w:p>
-    <w:p>
-      <w:pPr>
-        <w:pStyle w:val="Quote"/>
-      </w:pPr>
-      <w:r>
-        <w:rPr>
-          <w:b/>
-        </w:rPr>
-        <w:t xml:space="preserve">Nếu bị hỏi:</w:t>
-      </w:r>
-      <w:r>
-        <w:t xml:space="preserve"> "Hybrid có 'đã ngã' cao hơn (45.7)?" → "Đúng, cao hơn 1.4 điểm, nhưng mất 6 điểm 'đang ngã' và 3 điểm gộp, lại phải huấn luyện. Nhóm chọn cách cân bằng và đơn giản hơn."</w:t>
+        <w:t xml:space="preserve"> giải thích hai trục trước; chỉ đường xám (hệ thống cũ) nằm dưới, đường xanh nằm trên; rồi chỉ ô 16.8%.</w:t>
+      </w:r>
+    </w:p>
+    <w:p>
+      <w:pPr>
+        <w:pStyle w:val="Quote"/>
+      </w:pPr>
+      <w:r>
+        <w:t xml:space="preserve">"Điểm F1 là một chuyện, nhưng người dùng chỉ quan tâm hệ thống có báo đúng lúc không. Trục ngang là số lần báo nhầm mỗi giờ, trục dọc là phần trăm ca ngã được báo. Đường càng nằm cao càng tốt.</w:t>
+      </w:r>
+    </w:p>
+    <w:p>
+      <w:pPr>
+        <w:pStyle w:val="Quote"/>
+      </w:pPr>
+      <w:r>
+        <w:t xml:space="preserve">Đường của hệ thống mới luôn nằm trên đường của hệ thống cũ. Ví dụ, nếu chỉ cho phép khoảng 20 lần báo nhầm mỗi giờ, hệ thống mới báo được 16.8% ca ngã, hệ thống cũ chỉ 12%. Người dùng có thể chỉnh độ nhạy: nhạy hơn thì bắt được nhiều ca hơn, đổi lại báo nhầm nhiều hơn."</w:t>
       </w:r>
     </w:p>
     <w:p>
@@ -1170,7 +1070,7 @@
         <w:pStyle w:val="Heading3"/>
       </w:pPr>
       <w:r>
-        <w:t xml:space="preserve">Slide 14 — Chấm điểm như camera thật mới là cách đánh giá công bằng (khoảng 1 phút 30) — slide quan trọng nhất</w:t>
+        <w:t xml:space="preserve">Slide 15 — Kiểm chứng thống kê: cải thiện là thật (khoảng 1 phút)</w:t>
       </w:r>
     </w:p>
     <w:p>
@@ -1182,23 +1082,23 @@
         <w:t xml:space="preserve">Thao tác:</w:t>
       </w:r>
       <w:r>
-        <w:t xml:space="preserve"> chỉ ô trái trước, dừng ở con số 51.3; sau đó sang ô phải viền xanh.</w:t>
-      </w:r>
-    </w:p>
-    <w:p>
-      <w:pPr>
-        <w:pStyle w:val="Quote"/>
-      </w:pPr>
-      <w:r>
-        <w:t xml:space="preserve">"Đây là điểm nhóm cho là quan trọng nhất. Cách chấm cũ đưa cho mô hình những đoạn video đã được cắt sẵn đúng chỗ đổi hành động, lại cho mô hình nhìn cả đoạn phía sau. Như vậy mô hình được 'nhắc bài': nó biết trước lúc nào hành động thay đổi. Chấm kiểu này, kết quả đẹp tới 51.3, nhưng camera thật không hề có thông tin này.</w:t>
-      </w:r>
-    </w:p>
-    <w:p>
-      <w:pPr>
-        <w:pStyle w:val="Quote"/>
-      </w:pPr>
-      <w:r>
-        <w:t xml:space="preserve">Vì vậy nhóm chấm theo cách của camera thật: hệ thống dự đoán liên tục 7.5 lần mỗi giây, chỉ dùng hình ảnh đã xảy ra, không được nhìn trước tương lai. Ngoài điểm F1, nhóm còn đếm cả số lần báo động đúng và báo động nhầm. Đây là thước đo chính của cả báo cáo."</w:t>
+        <w:t xml:space="preserve"> chỉ đường dọc ở số 0; các vạch xanh nằm hẳn bên phải.</w:t>
+      </w:r>
+    </w:p>
+    <w:p>
+      <w:pPr>
+        <w:pStyle w:val="Quote"/>
+      </w:pPr>
+      <w:r>
+        <w:t xml:space="preserve">"Để chắc chắn các mức tăng không phải do may mắn, nhóm lấy mẫu lại dữ liệu 10.000 lần theo từng video, rồi xem mức thay đổi điểm dao động trong khoảng nào.</w:t>
+      </w:r>
+    </w:p>
+    <w:p>
+      <w:pPr>
+        <w:pStyle w:val="Quote"/>
+      </w:pPr>
+      <w:r>
+        <w:t xml:space="preserve">Mỗi vạch ngang là một khoảng như vậy. Vạch nào nằm hẳn bên phải số 0 là cải thiện chắc chắn. Các vạch của việc học thêm video thật và của hệ thống mới khi chạy như camera đều nằm hẳn bên phải, ở cả ba lần huấn luyện."</w:t>
       </w:r>
     </w:p>
     <w:p>
@@ -1206,177 +1106,7 @@
         <w:pStyle w:val="Heading3"/>
       </w:pPr>
       <w:r>
-        <w:t xml:space="preserve">Slide 15 — Huấn luyện thêm trên video thật giúp tăng mạnh nhất (khoảng 1 phút 15)</w:t>
-      </w:r>
-    </w:p>
-    <w:p>
-      <w:pPr/>
-      <w:r>
-        <w:rPr>
-          <w:b/>
-        </w:rPr>
-        <w:t xml:space="preserve">Thao tác:</w:t>
-      </w:r>
-      <w:r>
-        <w:t xml:space="preserve"> so hai biểu đồ; chỉ các thanh xám trước, rồi hai thanh xanh dưới cùng.</w:t>
-      </w:r>
-    </w:p>
-    <w:p>
-      <w:pPr>
-        <w:pStyle w:val="Quote"/>
-      </w:pPr>
-      <w:r>
-        <w:t xml:space="preserve">"Biểu đồ trái là điểm F1 cho 'đã ngã', biểu đồ phải là 'đang ngã hoặc đã ngã'. Các thanh xám là những cách cũ: quy tắc và Hybrid nâng 'đã ngã' từ 24.7 lên khoảng 29 đến 33.</w:t>
-      </w:r>
-    </w:p>
-    <w:p>
-      <w:pPr>
-        <w:pStyle w:val="Quote"/>
-      </w:pPr>
-      <w:r>
-        <w:t xml:space="preserve">Hai thanh xanh là khi học thêm video thật: 'đã ngã' lên 44.1, và 46.1 khi cho mô hình nhìn đủ khung hình. Bên phải cũng vậy, từ 55 lên 66. Thanh ngang nhỏ ở đầu mỗi cột là mức dao động giữa các lần huấn luyện, khá nhỏ, nên kết quả ổn định."</w:t>
-      </w:r>
-    </w:p>
-    <w:p>
-      <w:pPr>
-        <w:pStyle w:val="Heading3"/>
-      </w:pPr>
-      <w:r>
-        <w:t xml:space="preserve">Slide 16 — Chạy như camera: hệ thống mới hơn hệ thống cũ 12–17 điểm (khoảng 1 phút 30)</w:t>
-      </w:r>
-    </w:p>
-    <w:p>
-      <w:pPr/>
-      <w:r>
-        <w:rPr>
-          <w:b/>
-        </w:rPr>
-        <w:t xml:space="preserve">Thao tác:</w:t>
-      </w:r>
-      <w:r>
-        <w:t xml:space="preserve"> chỉ cột xám, rồi cột xanh ngọc cao nhất trong cả ba nhóm; sau đó chỉ sang phần chữ bên phải.</w:t>
-      </w:r>
-    </w:p>
-    <w:p>
-      <w:pPr>
-        <w:pStyle w:val="Quote"/>
-      </w:pPr>
-      <w:r>
-        <w:t xml:space="preserve">"Đây là kết quả khi chạy đúng như camera thật. Ba nhóm cột là ba con số: 'đã ngã', 'đang ngã', và gộp cả hai.</w:t>
-      </w:r>
-    </w:p>
-    <w:p>
-      <w:pPr>
-        <w:pStyle w:val="Quote"/>
-      </w:pPr>
-      <w:r>
-        <w:t xml:space="preserve">Hệ thống mới của nhóm gồm ba phần: học thêm video thật, nhìn đủ khung hình, và quy tắc 'sau cú ngã là nằm'. Kết quả là 44.3, 62.0 và 69.3, so với 31.9, 45.5 và 56.8 của hệ thống cũ, tức tăng từ 12 đến 17 điểm. Cả ba mức tăng đều được kiểm chứng thống kê, Hoàng Anh sẽ nói rõ hơn."</w:t>
-      </w:r>
-    </w:p>
-    <w:p>
-      <w:pPr/>
-      <w:r>
-        <w:rPr>
-          <w:b/>
-        </w:rPr>
-        <w:t xml:space="preserve">Chuyển lời:</w:t>
-      </w:r>
-      <w:r>
-        <w:t xml:space="preserve"> "Điểm số là một chuyện; với người dùng, điều quan trọng là hệ thống báo động có đáng tin không. Mời Hoàng Anh."</w:t>
-      </w:r>
-    </w:p>
-    <w:p>
-      <w:pPr>
-        <w:pStyle w:val="Heading2"/>
-      </w:pPr>
-      <w:r>
-        <w:t xml:space="preserve">Phần 4 — Vũ Hoàng Anh (slide 17–19, khoảng 3 phút)</w:t>
-      </w:r>
-    </w:p>
-    <w:p>
-      <w:pPr/>
-      <w:r>
-        <w:t xml:space="preserve">Mục tiêu: cho thấy hệ thống mới báo động tốt hơn, kết quả đã được kiểm chứng, và kết thúc bằng một thông điệp dễ nhớ.</w:t>
-      </w:r>
-    </w:p>
-    <w:p>
-      <w:pPr>
-        <w:pStyle w:val="Heading3"/>
-      </w:pPr>
-      <w:r>
-        <w:t xml:space="preserve">Slide 17 — Báo động: ở cùng số lần báo nhầm, hệ thống mới bắt được nhiều ca ngã hơn (khoảng 1 phút)</w:t>
-      </w:r>
-    </w:p>
-    <w:p>
-      <w:pPr/>
-      <w:r>
-        <w:rPr>
-          <w:b/>
-        </w:rPr>
-        <w:t xml:space="preserve">Thao tác:</w:t>
-      </w:r>
-      <w:r>
-        <w:t xml:space="preserve"> giải thích hai trục trước; chỉ đường xám (hệ thống cũ) nằm dưới, đường xanh nằm trên; rồi chỉ ô 16.8%.</w:t>
-      </w:r>
-    </w:p>
-    <w:p>
-      <w:pPr>
-        <w:pStyle w:val="Quote"/>
-      </w:pPr>
-      <w:r>
-        <w:t xml:space="preserve">"Điểm F1 là một chuyện, nhưng người dùng chỉ quan tâm hệ thống có báo đúng lúc không. Trục ngang là số lần báo nhầm mỗi giờ, trục dọc là phần trăm ca ngã được báo. Đường càng nằm cao càng tốt.</w:t>
-      </w:r>
-    </w:p>
-    <w:p>
-      <w:pPr>
-        <w:pStyle w:val="Quote"/>
-      </w:pPr>
-      <w:r>
-        <w:t xml:space="preserve">Đường của hệ thống mới luôn nằm trên đường của hệ thống cũ. Ví dụ, nếu chỉ cho phép khoảng 20 lần báo nhầm mỗi giờ, hệ thống mới báo được 16.8% ca ngã, hệ thống cũ chỉ 12%. Người dùng có thể chỉnh độ nhạy: nhạy hơn thì bắt được nhiều ca hơn, đổi lại báo nhầm nhiều hơn."</w:t>
-      </w:r>
-    </w:p>
-    <w:p>
-      <w:pPr>
-        <w:pStyle w:val="Heading3"/>
-      </w:pPr>
-      <w:r>
-        <w:t xml:space="preserve">Slide 18 — Kiểm chứng thống kê: cải thiện là thật (khoảng 1 phút)</w:t>
-      </w:r>
-    </w:p>
-    <w:p>
-      <w:pPr/>
-      <w:r>
-        <w:rPr>
-          <w:b/>
-        </w:rPr>
-        <w:t xml:space="preserve">Thao tác:</w:t>
-      </w:r>
-      <w:r>
-        <w:t xml:space="preserve"> chỉ đường dọc ở số 0; các vạch xanh nằm hẳn bên phải.</w:t>
-      </w:r>
-    </w:p>
-    <w:p>
-      <w:pPr>
-        <w:pStyle w:val="Quote"/>
-      </w:pPr>
-      <w:r>
-        <w:t xml:space="preserve">"Để chắc chắn các mức tăng không phải do may mắn, nhóm lấy mẫu lại dữ liệu 10.000 lần theo từng video, rồi xem mức thay đổi điểm dao động trong khoảng nào.</w:t>
-      </w:r>
-    </w:p>
-    <w:p>
-      <w:pPr>
-        <w:pStyle w:val="Quote"/>
-      </w:pPr>
-      <w:r>
-        <w:t xml:space="preserve">Mỗi vạch ngang là một khoảng như vậy. Vạch nào nằm hẳn bên phải số 0 là cải thiện chắc chắn. Các vạch của việc học thêm video thật và của hệ thống mới khi chạy như camera đều nằm hẳn bên phải, ở cả ba lần huấn luyện."</w:t>
-      </w:r>
-    </w:p>
-    <w:p>
-      <w:pPr>
-        <w:pStyle w:val="Heading3"/>
-      </w:pPr>
-      <w:r>
-        <w:t xml:space="preserve">Slide 19 — Kết luận (khoảng 1 phút)</w:t>
+        <w:t xml:space="preserve">Slide 16 — Kết luận (khoảng 1 phút)</w:t>
       </w:r>
     </w:p>
     <w:p>
@@ -1951,9 +1681,6 @@
     <w:abstractNumId w:val="0"/>
   </w:num>
   <w:num w:numId="2">
-    <w:abstractNumId w:val="0"/>
-  </w:num>
-  <w:num w:numId="3">
     <w:abstractNumId w:val="0"/>
   </w:num>
 </w:numbering>

</xml_diff>

<commit_message>
Update presentation script for pipeline slide
</commit_message>
<xml_diff>
--- a/deliverables/Kich_ban_thuyet_trinh_OmniFall.docx
+++ b/deliverables/Kich_ban_thuyet_trinh_OmniFall.docx
@@ -25,7 +25,7 @@
     <w:p>
       <w:pPr/>
       <w:r>
-        <w:t xml:space="preserve">Kịch bản cho 16 slide tại wunecutee.github.io/omnifall-slides, khoảng 18 phút, chia cho 4 người. Trọng tâm là xử lý dữ liệu và mô hình: kiến trúc, fine-tune, tối ưu tham số, tối ưu tốc độ. Phần mô hình do Nguyễn Duy Quân trình bày.</w:t>
+        <w:t xml:space="preserve">Kịch bản cho 17 slide tại wunecutee.github.io/omnifall-slides, khoảng 19 phút, chia cho 4 người. Trọng tâm là xử lý dữ liệu và mô hình: kiến trúc, fine-tune, tối ưu tham số, tối ưu tốc độ. Phần mô hình do Nguyễn Duy Quân trình bày.</w:t>
       </w:r>
     </w:p>
     <w:p>
@@ -45,10 +45,10 @@
       </w:tblPr>
       <w:tblGrid>
         <w:gridCol w:w="1111"/>
-        <w:gridCol w:w="1799"/>
+        <w:gridCol w:w="1766"/>
         <w:gridCol w:w="830"/>
-        <w:gridCol w:w="4055"/>
-        <w:gridCol w:w="1565"/>
+        <w:gridCol w:w="4116"/>
+        <w:gridCol w:w="1537"/>
       </w:tblGrid>
       <w:tr>
         <w:trPr>
@@ -68,7 +68,7 @@
         </w:tc>
         <w:tc>
           <w:tcPr>
-            <w:tcW w:w="1799" w:type="dxa"/>
+            <w:tcW w:w="1766" w:type="dxa"/>
             <w:shd w:val="clear" w:color="auto" w:fill="F2F2F2"/>
           </w:tcPr>
           <w:p>
@@ -92,7 +92,7 @@
         </w:tc>
         <w:tc>
           <w:tcPr>
-            <w:tcW w:w="4055" w:type="dxa"/>
+            <w:tcW w:w="4116" w:type="dxa"/>
             <w:shd w:val="clear" w:color="auto" w:fill="F2F2F2"/>
           </w:tcPr>
           <w:p>
@@ -104,7 +104,7 @@
         </w:tc>
         <w:tc>
           <w:tcPr>
-            <w:tcW w:w="1565" w:type="dxa"/>
+            <w:tcW w:w="1537" w:type="dxa"/>
             <w:shd w:val="clear" w:color="auto" w:fill="F2F2F2"/>
           </w:tcPr>
           <w:p>
@@ -129,7 +129,7 @@
         </w:tc>
         <w:tc>
           <w:tcPr>
-            <w:tcW w:w="1799" w:type="dxa"/>
+            <w:tcW w:w="1766" w:type="dxa"/>
           </w:tcPr>
           <w:p>
             <w:pPr/>
@@ -151,7 +151,7 @@
         </w:tc>
         <w:tc>
           <w:tcPr>
-            <w:tcW w:w="4055" w:type="dxa"/>
+            <w:tcW w:w="4116" w:type="dxa"/>
           </w:tcPr>
           <w:p>
             <w:pPr/>
@@ -162,7 +162,7 @@
         </w:tc>
         <w:tc>
           <w:tcPr>
-            <w:tcW w:w="1565" w:type="dxa"/>
+            <w:tcW w:w="1537" w:type="dxa"/>
           </w:tcPr>
           <w:p>
             <w:pPr/>
@@ -186,7 +186,7 @@
         </w:tc>
         <w:tc>
           <w:tcPr>
-            <w:tcW w:w="1799" w:type="dxa"/>
+            <w:tcW w:w="1766" w:type="dxa"/>
           </w:tcPr>
           <w:p>
             <w:pPr/>
@@ -208,7 +208,7 @@
         </w:tc>
         <w:tc>
           <w:tcPr>
-            <w:tcW w:w="4055" w:type="dxa"/>
+            <w:tcW w:w="4116" w:type="dxa"/>
           </w:tcPr>
           <w:p>
             <w:pPr/>
@@ -219,7 +219,7 @@
         </w:tc>
         <w:tc>
           <w:tcPr>
-            <w:tcW w:w="1565" w:type="dxa"/>
+            <w:tcW w:w="1537" w:type="dxa"/>
           </w:tcPr>
           <w:p>
             <w:pPr/>
@@ -243,7 +243,7 @@
         </w:tc>
         <w:tc>
           <w:tcPr>
-            <w:tcW w:w="1799" w:type="dxa"/>
+            <w:tcW w:w="1766" w:type="dxa"/>
           </w:tcPr>
           <w:p>
             <w:pPr/>
@@ -259,29 +259,29 @@
           <w:p>
             <w:pPr/>
             <w:r>
-              <w:t xml:space="preserve">6–10</w:t>
-            </w:r>
-          </w:p>
-        </w:tc>
-        <w:tc>
-          <w:tcPr>
-            <w:tcW w:w="4055" w:type="dxa"/>
-          </w:tcPr>
-          <w:p>
-            <w:pPr/>
-            <w:r>
-              <w:t xml:space="preserve">Kiến trúc, fine-tune, tối ưu tham số, tốc độ, chọn phương pháp</w:t>
-            </w:r>
-          </w:p>
-        </w:tc>
-        <w:tc>
-          <w:tcPr>
-            <w:tcW w:w="1565" w:type="dxa"/>
-          </w:tcPr>
-          <w:p>
-            <w:pPr/>
-            <w:r>
-              <w:t xml:space="preserve">khoảng 6 phút 30</w:t>
+              <w:t xml:space="preserve">6–11</w:t>
+            </w:r>
+          </w:p>
+        </w:tc>
+        <w:tc>
+          <w:tcPr>
+            <w:tcW w:w="4116" w:type="dxa"/>
+          </w:tcPr>
+          <w:p>
+            <w:pPr/>
+            <w:r>
+              <w:t xml:space="preserve">Pipeline, kiến trúc, fine-tune, tối ưu tham số, tốc độ, chọn phương pháp</w:t>
+            </w:r>
+          </w:p>
+        </w:tc>
+        <w:tc>
+          <w:tcPr>
+            <w:tcW w:w="1537" w:type="dxa"/>
+          </w:tcPr>
+          <w:p>
+            <w:pPr/>
+            <w:r>
+              <w:t xml:space="preserve">khoảng 7 phút 30</w:t>
             </w:r>
           </w:p>
         </w:tc>
@@ -300,7 +300,7 @@
         </w:tc>
         <w:tc>
           <w:tcPr>
-            <w:tcW w:w="1799" w:type="dxa"/>
+            <w:tcW w:w="1766" w:type="dxa"/>
           </w:tcPr>
           <w:p>
             <w:pPr/>
@@ -316,13 +316,13 @@
           <w:p>
             <w:pPr/>
             <w:r>
-              <w:t xml:space="preserve">11–16</w:t>
-            </w:r>
-          </w:p>
-        </w:tc>
-        <w:tc>
-          <w:tcPr>
-            <w:tcW w:w="4055" w:type="dxa"/>
+              <w:t xml:space="preserve">12–17</w:t>
+            </w:r>
+          </w:p>
+        </w:tc>
+        <w:tc>
+          <w:tcPr>
+            <w:tcW w:w="4116" w:type="dxa"/>
           </w:tcPr>
           <w:p>
             <w:pPr/>
@@ -333,7 +333,7 @@
         </w:tc>
         <w:tc>
           <w:tcPr>
-            <w:tcW w:w="1565" w:type="dxa"/>
+            <w:tcW w:w="1537" w:type="dxa"/>
           </w:tcPr>
           <w:p>
             <w:pPr/>
@@ -354,7 +354,7 @@
         </w:tc>
         <w:tc>
           <w:tcPr>
-            <w:tcW w:w="1799" w:type="dxa"/>
+            <w:tcW w:w="1766" w:type="dxa"/>
           </w:tcPr>
           <w:p>
             <w:pPr/>
@@ -373,7 +373,7 @@
         </w:tc>
         <w:tc>
           <w:tcPr>
-            <w:tcW w:w="4055" w:type="dxa"/>
+            <w:tcW w:w="4116" w:type="dxa"/>
           </w:tcPr>
           <w:p>
             <w:pPr/>
@@ -384,7 +384,7 @@
         </w:tc>
         <w:tc>
           <w:tcPr>
-            <w:tcW w:w="1565" w:type="dxa"/>
+            <w:tcW w:w="1537" w:type="dxa"/>
           </w:tcPr>
           <w:p>
             <w:pPr/>
@@ -668,7 +668,7 @@
         <w:pStyle w:val="Heading2"/>
       </w:pPr>
       <w:r>
-        <w:t xml:space="preserve">Phần 3 — Nguyễn Duy Quân (slide 6–10, khoảng 6 phút 30)</w:t>
+        <w:t xml:space="preserve">Phần 3 — Nguyễn Duy Quân (slide 6–11, khoảng 7 phút 30)</w:t>
       </w:r>
     </w:p>
     <w:p>
@@ -682,7 +682,7 @@
         <w:pStyle w:val="Heading3"/>
       </w:pPr>
       <w:r>
-        <w:t xml:space="preserve">Slide 6 — Kiến trúc: hai tầng Transformer, 101 triệu tham số (khoảng 1 phút 30)</w:t>
+        <w:t xml:space="preserve">Slide 6 — Pipeline huấn luyện: 6 bước, tập test chỉ chạm một lần (khoảng 1 phút)</w:t>
       </w:r>
     </w:p>
     <w:p>
@@ -694,47 +694,31 @@
         <w:t xml:space="preserve">Thao tác:</w:t>
       </w:r>
       <w:r>
-        <w:t xml:space="preserve"> đi theo 4 khối từ trái sang phải, dừng ở con số lớn của mỗi khối và nhãn nhỏ ở đáy (đóng băng / fine-tune / tune trên val); cuối cùng chỉ hàng số bên dưới.</w:t>
-      </w:r>
-    </w:p>
-    <w:p>
-      <w:pPr>
-        <w:pStyle w:val="Quote"/>
-      </w:pPr>
-      <w:r>
-        <w:t xml:space="preserve">"Đây là kiến trúc đầy đủ của hệ thống, gồm ba tầng.</w:t>
-      </w:r>
-    </w:p>
-    <w:p>
-      <w:pPr>
-        <w:pStyle w:val="Quote"/>
-      </w:pPr>
-      <w:r>
-        <w:t xml:space="preserve">Đầu vào là cụm 16 ảnh 224 nhân 224. Tầng 1 là VideoMAE-Base, 86 triệu tham số, 12 lớp Transformer, đã học sẵn trên 400 loại hành động của bộ Kinetics. Nó nén mỗi cụm 16 ảnh thành một vector 768 chiều, cứ 0.133 giây một lần. Tầng này được đóng băng để giữ kiến thức đã học.</w:t>
-      </w:r>
-    </w:p>
-    <w:p>
-      <w:pPr>
-        <w:pStyle w:val="Quote"/>
-      </w:pPr>
-      <w:r>
-        <w:t xml:space="preserve">Tầng 2 là Transformer thời gian, 14.8 triệu tham số, 2 lớp, 8 đầu chú ý. Nó đọc chuỗi 18 vector, tức khoảng 4.4 giây, để hiểu diễn biến theo thời gian và chấm điểm 10 hành động. Đây là tầng nhóm fine-tune.</w:t>
-      </w:r>
-    </w:p>
-    <w:p>
-      <w:pPr>
-        <w:pStyle w:val="Quote"/>
-      </w:pPr>
-      <w:r>
-        <w:t xml:space="preserve">Tầng 3 là quy tắc chuyển trạng thái: không có tham số nào phải học, nên không thể học vẹt. Sau khi thấy 'đang ngã', nó đẩy điểm 'đã ngã' trong 5 giây, giảm dần với chu kỳ bán rã 1 giây. Hai tham số này được dò trên tập kiểm tra riêng.</w:t>
-      </w:r>
-    </w:p>
-    <w:p>
-      <w:pPr>
-        <w:pStyle w:val="Quote"/>
-      </w:pPr>
-      <w:r>
-        <w:t xml:space="preserve">Tổng cộng 101 triệu tham số, nhìn 3 góc ảnh, và vẫn chỉ mất 40 đến 47 mili giây mỗi lần dự đoán."</w:t>
+        <w:t xml:space="preserve"> đi lần lượt 6 ô từ trái sang phải, chỉ vào nhãn màu ở đáy mỗi ô; cuối cùng chỉ dòng chú thích màu.</w:t>
+      </w:r>
+    </w:p>
+    <w:p>
+      <w:pPr>
+        <w:pStyle w:val="Quote"/>
+      </w:pPr>
+      <w:r>
+        <w:t xml:space="preserve">"Trước khi đi vào chi tiết, đây là toàn bộ quy trình huấn luyện. Màu ở đáy mỗi ô cho biết bước đó dùng dữ liệu nào.</w:t>
+      </w:r>
+    </w:p>
+    <w:p>
+      <w:pPr>
+        <w:pStyle w:val="Quote"/>
+      </w:pPr>
+      <w:r>
+        <w:t xml:space="preserve">Bước 1, mô hình gốc học nền trên video dựng. Bước 2, nhóm fine-tune trên 165 video thật, 30 epoch, 3 seed. Bước 3 và 4 đều dùng 81 video val màu vàng: chọn epoch tốt nhất và dò 225 cấu hình.</w:t>
+      </w:r>
+    </w:p>
+    <w:p>
+      <w:pPr>
+        <w:pStyle w:val="Quote"/>
+      </w:pPr>
+      <w:r>
+        <w:t xml:space="preserve">Chỉ sau khi mọi lựa chọn đã khoá lại, bước 5 mới chấm trên 572 video test màu đỏ, đúng một lần. Nhờ vậy kết quả không bị rò rỉ. Bước 6 là đưa hệ thống chạy realtime với camera."</w:t>
       </w:r>
     </w:p>
     <w:p>
@@ -742,7 +726,7 @@
         <w:pStyle w:val="Heading3"/>
       </w:pPr>
       <w:r>
-        <w:t xml:space="preserve">Slide 7 — Fine-tune: "đã ngã" từ 24.7 lên 44.1 (khoảng 1 phút 30)</w:t>
+        <w:t xml:space="preserve">Slide 7 — Kiến trúc: hai tầng Transformer, 101 triệu tham số (khoảng 1 phút 30)</w:t>
       </w:r>
     </w:p>
     <w:p>
@@ -754,31 +738,47 @@
         <w:t xml:space="preserve">Thao tác:</w:t>
       </w:r>
       <w:r>
-        <w:t xml:space="preserve"> chỉ 3 ô số trên cùng từ trái sang phải, nhấn giọng ở +19.4; rồi ô chiến lược; cuối cùng bảng 3 lần bên phải.</w:t>
-      </w:r>
-    </w:p>
-    <w:p>
-      <w:pPr>
-        <w:pStyle w:val="Quote"/>
-      </w:pPr>
-      <w:r>
-        <w:t xml:space="preserve">"Đây là bước tạo ra bước nhảy lớn nhất. Mô hình gốc chỉ học trên video dựng, điểm F1 'đã ngã' là 24.7. Sau fine-tune trên video tai nạn thật, con số này là 44.1, tăng 19.4 điểm, gần gấp đôi.</w:t>
-      </w:r>
-    </w:p>
-    <w:p>
-      <w:pPr>
-        <w:pStyle w:val="Quote"/>
-      </w:pPr>
-      <w:r>
-        <w:t xml:space="preserve">Chiến lược: khởi tạo từ checkpoint gốc đã huấn luyện 7.000 bước, học thêm trên 165 video thật với 809 đoạn có nhãn. Mỗi vòng, dữ liệu được tăng cường bằng cách cắt ngẫu nhiên theo thời gian và theo góc ảnh, để mô hình không học thuộc. Nhóm thử thêm phạt L2-SP để chống quên kiến thức cũ, làm mềm nhãn 0.1, và dừng sớm theo điểm trên 81 video kiểm tra.</w:t>
-      </w:r>
-    </w:p>
-    <w:p>
-      <w:pPr>
-        <w:pStyle w:val="Quote"/>
-      </w:pPr>
-      <w:r>
-        <w:t xml:space="preserve">Để chắc chắn không phải ngẫu nhiên, nhóm huấn luyện 3 lần với 3 hạt giống khác nhau: 41.1, 46.0 và 45.2. Cả ba đều vượt xa mô hình gốc; nhìn thêm 3 góc ảnh đưa lên 45.6."</w:t>
+        <w:t xml:space="preserve"> đi theo 4 khối từ trái sang phải, dừng ở con số lớn của mỗi khối và nhãn nhỏ ở đáy (đóng băng / fine-tune / tune trên val); cuối cùng chỉ hàng số bên dưới.</w:t>
+      </w:r>
+    </w:p>
+    <w:p>
+      <w:pPr>
+        <w:pStyle w:val="Quote"/>
+      </w:pPr>
+      <w:r>
+        <w:t xml:space="preserve">"Đây là kiến trúc đầy đủ của hệ thống, gồm ba tầng.</w:t>
+      </w:r>
+    </w:p>
+    <w:p>
+      <w:pPr>
+        <w:pStyle w:val="Quote"/>
+      </w:pPr>
+      <w:r>
+        <w:t xml:space="preserve">Đầu vào là cụm 16 ảnh 224 nhân 224. Tầng 1 là VideoMAE-Base, 86 triệu tham số, 12 lớp Transformer, đã học sẵn trên 400 loại hành động của bộ Kinetics. Nó nén mỗi cụm 16 ảnh thành một vector 768 chiều, cứ 0.133 giây một lần. Tầng này được đóng băng để giữ kiến thức đã học.</w:t>
+      </w:r>
+    </w:p>
+    <w:p>
+      <w:pPr>
+        <w:pStyle w:val="Quote"/>
+      </w:pPr>
+      <w:r>
+        <w:t xml:space="preserve">Tầng 2 là Transformer thời gian, 14.8 triệu tham số, 2 lớp, 8 đầu chú ý. Nó đọc chuỗi 18 vector, tức khoảng 4.4 giây, để hiểu diễn biến theo thời gian và chấm điểm 10 hành động. Đây là tầng nhóm fine-tune.</w:t>
+      </w:r>
+    </w:p>
+    <w:p>
+      <w:pPr>
+        <w:pStyle w:val="Quote"/>
+      </w:pPr>
+      <w:r>
+        <w:t xml:space="preserve">Tầng 3 là quy tắc chuyển trạng thái: không có tham số nào phải học, nên không thể học vẹt. Sau khi thấy 'đang ngã', nó đẩy điểm 'đã ngã' trong 5 giây, giảm dần với chu kỳ bán rã 1 giây. Hai tham số này được dò trên tập kiểm tra riêng.</w:t>
+      </w:r>
+    </w:p>
+    <w:p>
+      <w:pPr>
+        <w:pStyle w:val="Quote"/>
+      </w:pPr>
+      <w:r>
+        <w:t xml:space="preserve">Tổng cộng 101 triệu tham số, nhìn 3 góc ảnh, và vẫn chỉ mất 40 đến 47 mili giây mỗi lần dự đoán."</w:t>
       </w:r>
     </w:p>
     <w:p>
@@ -786,7 +786,7 @@
         <w:pStyle w:val="Heading3"/>
       </w:pPr>
       <w:r>
-        <w:t xml:space="preserve">Slide 8 — Tối ưu tham số: 225 cấu hình (khoảng 1 phút 15)</w:t>
+        <w:t xml:space="preserve">Slide 8 — Fine-tune: "đã ngã" từ 24.7 lên 44.1 (khoảng 1 phút 30)</w:t>
       </w:r>
     </w:p>
     <w:p>
@@ -798,23 +798,31 @@
         <w:t xml:space="preserve">Thao tác:</w:t>
       </w:r>
       <w:r>
-        <w:t xml:space="preserve"> chỉ bảng màu từ góc tối trên trái xuống ô viền trắng; rồi hai ô bên phải.</w:t>
-      </w:r>
-    </w:p>
-    <w:p>
-      <w:pPr>
-        <w:pStyle w:val="Quote"/>
-      </w:pPr>
-      <w:r>
-        <w:t xml:space="preserve">"Tham số không được chọn theo cảm tính. Bảng màu này là 15 cấu hình fine-tune: hàng là tốc độ học từ 0.00001 đến 0.0005, cột là mức phạt L2-SP. Ô càng sáng điểm càng cao, đo trên 81 video kiểm tra riêng, không phải video thi.</w:t>
-      </w:r>
-    </w:p>
-    <w:p>
-      <w:pPr>
-        <w:pStyle w:val="Quote"/>
-      </w:pPr>
-      <w:r>
-        <w:t xml:space="preserve">Xu hướng rất rõ: học nhanh hơn và ít ràng buộc hơn thì tốt hơn, từ 54 lên 62. Cộng thêm 42 cấu hình quy tắc, 48 cấu hình HMM và 120 cấu hình khi chạy như camera, nhóm đã dò tổng cộng 225 cấu hình."</w:t>
+        <w:t xml:space="preserve"> chỉ 3 ô số trên cùng từ trái sang phải, nhấn giọng ở +19.4; rồi ô chiến lược; cuối cùng bảng 3 lần bên phải.</w:t>
+      </w:r>
+    </w:p>
+    <w:p>
+      <w:pPr>
+        <w:pStyle w:val="Quote"/>
+      </w:pPr>
+      <w:r>
+        <w:t xml:space="preserve">"Đây là bước tạo ra bước nhảy lớn nhất. Mô hình gốc chỉ học trên video dựng, điểm F1 'đã ngã' là 24.7. Sau fine-tune trên video tai nạn thật, con số này là 44.1, tăng 19.4 điểm, gần gấp đôi.</w:t>
+      </w:r>
+    </w:p>
+    <w:p>
+      <w:pPr>
+        <w:pStyle w:val="Quote"/>
+      </w:pPr>
+      <w:r>
+        <w:t xml:space="preserve">Chiến lược: khởi tạo từ checkpoint gốc đã huấn luyện 7.000 bước, học thêm trên 165 video thật với 809 đoạn có nhãn. Mỗi vòng, dữ liệu được tăng cường bằng cách cắt ngẫu nhiên theo thời gian và theo góc ảnh, để mô hình không học thuộc. Nhóm thử thêm phạt L2-SP để chống quên kiến thức cũ, làm mềm nhãn 0.1, và dừng sớm theo điểm trên 81 video kiểm tra.</w:t>
+      </w:r>
+    </w:p>
+    <w:p>
+      <w:pPr>
+        <w:pStyle w:val="Quote"/>
+      </w:pPr>
+      <w:r>
+        <w:t xml:space="preserve">Để chắc chắn không phải ngẫu nhiên, nhóm huấn luyện 3 lần với 3 hạt giống khác nhau: 41.1, 46.0 và 45.2. Cả ba đều vượt xa mô hình gốc; nhìn thêm 3 góc ảnh đưa lên 45.6."</w:t>
       </w:r>
     </w:p>
     <w:p>
@@ -822,7 +830,7 @@
         <w:pStyle w:val="Heading3"/>
       </w:pPr>
       <w:r>
-        <w:t xml:space="preserve">Slide 9 — Tối ưu tốc độ: tiền xử lý trên GPU (khoảng 1 phút)</w:t>
+        <w:t xml:space="preserve">Slide 9 — Tối ưu tham số: 225 cấu hình (khoảng 1 phút 15)</w:t>
       </w:r>
     </w:p>
     <w:p>
@@ -834,23 +842,23 @@
         <w:t xml:space="preserve">Thao tác:</w:t>
       </w:r>
       <w:r>
-        <w:t xml:space="preserve"> chỉ 3 con số lớn, rồi thanh ngân sách thời gian.</w:t>
-      </w:r>
-    </w:p>
-    <w:p>
-      <w:pPr>
-        <w:pStyle w:val="Quote"/>
-      </w:pPr>
-      <w:r>
-        <w:t xml:space="preserve">"Để chạy được thời gian thực, nhóm viết lại bước tiền xử lý ảnh để chạy trên GPU: 2.9 mili giây mỗi ảnh, so với 7.2 trên CPU, nhanh gấp 2.5 lần. Nhanh hơn nhưng không sai lệch: vector đặc trưng giống bản gốc tới 0.9998, và 98.7% khung hình ra cùng nhãn.</w:t>
-      </w:r>
-    </w:p>
-    <w:p>
-      <w:pPr>
-        <w:pStyle w:val="Quote"/>
-      </w:pPr>
-      <w:r>
-        <w:t xml:space="preserve">Cứ 133 mili giây có một ảnh mới. Toàn bộ mô hình kể cả nhìn 3 góc chỉ dùng 40 đến 47, còn dư khoảng 90 mili giây. Camera, mô hình và cảnh báo chạy trên 3 luồng song song."</w:t>
+        <w:t xml:space="preserve"> chỉ bảng màu từ góc tối trên trái xuống ô viền trắng; rồi hai ô bên phải.</w:t>
+      </w:r>
+    </w:p>
+    <w:p>
+      <w:pPr>
+        <w:pStyle w:val="Quote"/>
+      </w:pPr>
+      <w:r>
+        <w:t xml:space="preserve">"Tham số không được chọn theo cảm tính. Bảng màu này là 15 cấu hình fine-tune: hàng là tốc độ học từ 0.00001 đến 0.0005, cột là mức phạt L2-SP. Ô càng sáng điểm càng cao, đo trên 81 video kiểm tra riêng, không phải video thi.</w:t>
+      </w:r>
+    </w:p>
+    <w:p>
+      <w:pPr>
+        <w:pStyle w:val="Quote"/>
+      </w:pPr>
+      <w:r>
+        <w:t xml:space="preserve">Xu hướng rất rõ: học nhanh hơn và ít ràng buộc hơn thì tốt hơn, từ 54 lên 62. Cộng thêm 42 cấu hình quy tắc, 48 cấu hình HMM và 120 cấu hình khi chạy như camera, nhóm đã dò tổng cộng 225 cấu hình."</w:t>
       </w:r>
     </w:p>
     <w:p>
@@ -858,7 +866,7 @@
         <w:pStyle w:val="Heading3"/>
       </w:pPr>
       <w:r>
-        <w:t xml:space="preserve">Slide 10 — Vì sao chọn "fine-tune + quy tắc" (khoảng 1 phút 15)</w:t>
+        <w:t xml:space="preserve">Slide 10 — Tối ưu tốc độ: tiền xử lý trên GPU (khoảng 1 phút)</w:t>
       </w:r>
     </w:p>
     <w:p>
@@ -870,6 +878,42 @@
         <w:t xml:space="preserve">Thao tác:</w:t>
       </w:r>
       <w:r>
+        <w:t xml:space="preserve"> chỉ 3 con số lớn, rồi thanh ngân sách thời gian.</w:t>
+      </w:r>
+    </w:p>
+    <w:p>
+      <w:pPr>
+        <w:pStyle w:val="Quote"/>
+      </w:pPr>
+      <w:r>
+        <w:t xml:space="preserve">"Để chạy được thời gian thực, nhóm viết lại bước tiền xử lý ảnh để chạy trên GPU: 2.9 mili giây mỗi ảnh, so với 7.2 trên CPU, nhanh gấp 2.5 lần. Nhanh hơn nhưng không sai lệch: vector đặc trưng giống bản gốc tới 0.9998, và 98.7% khung hình ra cùng nhãn.</w:t>
+      </w:r>
+    </w:p>
+    <w:p>
+      <w:pPr>
+        <w:pStyle w:val="Quote"/>
+      </w:pPr>
+      <w:r>
+        <w:t xml:space="preserve">Cứ 133 mili giây có một ảnh mới. Toàn bộ mô hình kể cả nhìn 3 góc chỉ dùng 40 đến 47, còn dư khoảng 90 mili giây. Camera, mô hình và cảnh báo chạy trên 3 luồng song song."</w:t>
+      </w:r>
+    </w:p>
+    <w:p>
+      <w:pPr>
+        <w:pStyle w:val="Heading3"/>
+      </w:pPr>
+      <w:r>
+        <w:t xml:space="preserve">Slide 11 — Vì sao chọn "fine-tune + quy tắc" (khoảng 1 phút 15)</w:t>
+      </w:r>
+    </w:p>
+    <w:p>
+      <w:pPr/>
+      <w:r>
+        <w:rPr>
+          <w:b/>
+        </w:rPr>
+        <w:t xml:space="preserve">Thao tác:</w:t>
+      </w:r>
+      <w:r>
         <w:t xml:space="preserve"> đọc bảng từng dòng; dừng ở cột "Đang ngã" của HMM và Hybrid; kết thúc ở dòng xanh và ô +12.4 · +16.5 · +12.5.</w:t>
       </w:r>
     </w:p>
@@ -912,7 +956,7 @@
         <w:pStyle w:val="Heading2"/>
       </w:pPr>
       <w:r>
-        <w:t xml:space="preserve">Phần 4 — Vũ Hoàng Anh (slide 11–16, khoảng 6 phút)</w:t>
+        <w:t xml:space="preserve">Phần 4 — Vũ Hoàng Anh (slide 12–17, khoảng 6 phút)</w:t>
       </w:r>
     </w:p>
     <w:p>
@@ -926,7 +970,7 @@
         <w:pStyle w:val="Heading3"/>
       </w:pPr>
       <w:r>
-        <w:t xml:space="preserve">Slide 11 — Chấm điểm như camera thật mới là cách đánh giá công bằng (khoảng 1 phút 30) — slide quan trọng nhất</w:t>
+        <w:t xml:space="preserve">Slide 12 — Chấm điểm như camera thật mới là cách đánh giá công bằng (khoảng 1 phút 30) — slide quan trọng nhất</w:t>
       </w:r>
     </w:p>
     <w:p>
@@ -962,7 +1006,7 @@
         <w:pStyle w:val="Heading3"/>
       </w:pPr>
       <w:r>
-        <w:t xml:space="preserve">Slide 12 — Huấn luyện thêm trên video thật giúp tăng mạnh nhất (khoảng 1 phút 15)</w:t>
+        <w:t xml:space="preserve">Slide 13 — Huấn luyện thêm trên video thật giúp tăng mạnh nhất (khoảng 1 phút 15)</w:t>
       </w:r>
     </w:p>
     <w:p>
@@ -998,7 +1042,7 @@
         <w:pStyle w:val="Heading3"/>
       </w:pPr>
       <w:r>
-        <w:t xml:space="preserve">Slide 13 — Chạy như camera: hệ thống mới hơn hệ thống cũ 12–17 điểm (khoảng 1 phút 30)</w:t>
+        <w:t xml:space="preserve">Slide 14 — Chạy như camera: hệ thống mới hơn hệ thống cũ 12–17 điểm (khoảng 1 phút 30)</w:t>
       </w:r>
     </w:p>
     <w:p>
@@ -1026,7 +1070,7 @@
         <w:pStyle w:val="Quote"/>
       </w:pPr>
       <w:r>
-        <w:t xml:space="preserve">Hệ thống mới của nhóm gồm ba phần: học thêm video thật, nhìn đủ khung hình, và quy tắc 'sau cú ngã là nằm'. Kết quả là 44.3, 62.0 và 69.3, so với 31.9, 45.5 và 56.8 của hệ thống cũ, tức tăng từ 12 đến 17 điểm. Cả ba mức tăng đều được kiểm chứng thống kê, em sẽ nói rõ ở slide 15."</w:t>
+        <w:t xml:space="preserve">Hệ thống mới của nhóm gồm ba phần: học thêm video thật, nhìn đủ khung hình, và quy tắc 'sau cú ngã là nằm'. Kết quả là 44.3, 62.0 và 69.3, so với 31.9, 45.5 và 56.8 của hệ thống cũ, tức tăng từ 12 đến 17 điểm. Cả ba mức tăng đều được kiểm chứng thống kê, em sẽ nói rõ ở slide 16."</w:t>
       </w:r>
     </w:p>
     <w:p>
@@ -1034,7 +1078,7 @@
         <w:pStyle w:val="Heading3"/>
       </w:pPr>
       <w:r>
-        <w:t xml:space="preserve">Slide 14 — Báo động: ở cùng số lần báo nhầm, hệ thống mới bắt được nhiều ca ngã hơn (khoảng 1 phút)</w:t>
+        <w:t xml:space="preserve">Slide 15 — Báo động: ở cùng số lần báo nhầm, hệ thống mới bắt được nhiều ca ngã hơn (khoảng 1 phút)</w:t>
       </w:r>
     </w:p>
     <w:p>
@@ -1070,7 +1114,7 @@
         <w:pStyle w:val="Heading3"/>
       </w:pPr>
       <w:r>
-        <w:t xml:space="preserve">Slide 15 — Kiểm chứng thống kê: cải thiện là thật (khoảng 1 phút)</w:t>
+        <w:t xml:space="preserve">Slide 16 — Kiểm chứng thống kê: cải thiện là thật (khoảng 1 phút)</w:t>
       </w:r>
     </w:p>
     <w:p>
@@ -1106,7 +1150,7 @@
         <w:pStyle w:val="Heading3"/>
       </w:pPr>
       <w:r>
-        <w:t xml:space="preserve">Slide 16 — Kết luận (khoảng 1 phút)</w:t>
+        <w:t xml:space="preserve">Slide 17 — Kết luận (khoảng 1 phút)</w:t>
       </w:r>
     </w:p>
     <w:p>

</xml_diff>